<commit_message>
Fix FISAT split table wrapping
</commit_message>
<xml_diff>
--- a/submission_fisat/VaccineNLP_FISAT_FINAL_CONTACT_UPDATED.docx
+++ b/submission_fisat/VaccineNLP_FISAT_FINAL_CONTACT_UPDATED.docx
@@ -3954,16 +3954,16 @@
         <w:tblLook w:firstColumn="1" w:firstRow="1" w:lastColumn="0" w:lastRow="0" w:noHBand="0" w:noVBand="1" w:val="04A0"/>
       </w:tblPr>
       <w:tblGrid>
-        <w:gridCol w:w="968"/>
-        <w:gridCol w:w="570"/>
-        <w:gridCol w:w="529"/>
-        <w:gridCol w:w="733"/>
-        <w:gridCol w:w="631"/>
-        <w:gridCol w:w="917"/>
-        <w:gridCol w:w="570"/>
-        <w:gridCol w:w="529"/>
-        <w:gridCol w:w="917"/>
-        <w:gridCol w:w="536"/>
+        <w:gridCol w:w="1025"/>
+        <w:gridCol w:w="707"/>
+        <w:gridCol w:w="635"/>
+        <w:gridCol w:w="717"/>
+        <w:gridCol w:w="625"/>
+        <w:gridCol w:w="656"/>
+        <w:gridCol w:w="625"/>
+        <w:gridCol w:w="625"/>
+        <w:gridCol w:w="656"/>
+        <w:gridCol w:w="629"/>
       </w:tblGrid>
       <w:tr>
         <w:trPr>
@@ -3971,14 +3971,15 @@
         </w:trPr>
         <w:tc>
           <w:tcPr>
-            <w:tcW w:type="dxa" w:w="968"/>
-            <w:vAlign w:val="center"/>
-            <w:tcMar>
-              <w:top w:w="65" w:type="dxa"/>
-              <w:start w:w="60" w:type="dxa"/>
-              <w:bottom w:w="65" w:type="dxa"/>
-              <w:end w:w="60" w:type="dxa"/>
-            </w:tcMar>
+            <w:tcW w:type="dxa" w:w="1025"/>
+            <w:vAlign w:val="center"/>
+            <w:tcMar>
+              <w:top w:w="55" w:type="dxa"/>
+              <w:start w:w="30" w:type="dxa"/>
+              <w:bottom w:w="55" w:type="dxa"/>
+              <w:end w:w="30" w:type="dxa"/>
+            </w:tcMar>
+            <w:noWrap/>
             <w:tcBorders>
               <w:top w:val="single" w:sz="10" w:space="0" w:color="000000"/>
               <w:bottom w:val="single" w:sz="7" w:space="0" w:color="000000"/>
@@ -3998,7 +3999,7 @@
               <w:rPr>
                 <w:rFonts w:ascii="Times New Roman" w:hAnsi="Times New Roman"/>
                 <w:b/>
-                <w:sz w:val="13"/>
+                <w:sz w:val="12"/>
               </w:rPr>
               <w:t>Split</w:t>
             </w:r>
@@ -4006,14 +4007,15 @@
         </w:tc>
         <w:tc>
           <w:tcPr>
-            <w:tcW w:type="dxa" w:w="570"/>
-            <w:vAlign w:val="center"/>
-            <w:tcMar>
-              <w:top w:w="65" w:type="dxa"/>
-              <w:start w:w="60" w:type="dxa"/>
-              <w:bottom w:w="65" w:type="dxa"/>
-              <w:end w:w="60" w:type="dxa"/>
-            </w:tcMar>
+            <w:tcW w:type="dxa" w:w="707"/>
+            <w:vAlign w:val="center"/>
+            <w:tcMar>
+              <w:top w:w="55" w:type="dxa"/>
+              <w:start w:w="30" w:type="dxa"/>
+              <w:bottom w:w="55" w:type="dxa"/>
+              <w:end w:w="30" w:type="dxa"/>
+            </w:tcMar>
+            <w:noWrap/>
             <w:tcBorders>
               <w:top w:val="single" w:sz="10" w:space="0" w:color="000000"/>
               <w:bottom w:val="single" w:sz="7" w:space="0" w:color="000000"/>
@@ -4033,22 +4035,23 @@
               <w:rPr>
                 <w:rFonts w:ascii="Times New Roman" w:hAnsi="Times New Roman"/>
                 <w:b/>
-                <w:sz w:val="13"/>
-              </w:rPr>
-              <w:t>n</w:t>
-            </w:r>
-          </w:p>
-        </w:tc>
-        <w:tc>
-          <w:tcPr>
-            <w:tcW w:type="dxa" w:w="529"/>
-            <w:vAlign w:val="center"/>
-            <w:tcMar>
-              <w:top w:w="65" w:type="dxa"/>
-              <w:start w:w="60" w:type="dxa"/>
-              <w:bottom w:w="65" w:type="dxa"/>
-              <w:end w:w="60" w:type="dxa"/>
-            </w:tcMar>
+                <w:sz w:val="12"/>
+              </w:rPr>
+              <w:t>N</w:t>
+            </w:r>
+          </w:p>
+        </w:tc>
+        <w:tc>
+          <w:tcPr>
+            <w:tcW w:type="dxa" w:w="635"/>
+            <w:vAlign w:val="center"/>
+            <w:tcMar>
+              <w:top w:w="55" w:type="dxa"/>
+              <w:start w:w="30" w:type="dxa"/>
+              <w:bottom w:w="55" w:type="dxa"/>
+              <w:end w:w="30" w:type="dxa"/>
+            </w:tcMar>
+            <w:noWrap/>
             <w:tcBorders>
               <w:top w:val="single" w:sz="10" w:space="0" w:color="000000"/>
               <w:bottom w:val="single" w:sz="7" w:space="0" w:color="000000"/>
@@ -4068,7 +4071,7 @@
               <w:rPr>
                 <w:rFonts w:ascii="Times New Roman" w:hAnsi="Times New Roman"/>
                 <w:b/>
-                <w:sz w:val="13"/>
+                <w:sz w:val="12"/>
               </w:rPr>
               <w:t>Mis.</w:t>
             </w:r>
@@ -4076,14 +4079,15 @@
         </w:tc>
         <w:tc>
           <w:tcPr>
-            <w:tcW w:type="dxa" w:w="733"/>
-            <w:vAlign w:val="center"/>
-            <w:tcMar>
-              <w:top w:w="65" w:type="dxa"/>
-              <w:start w:w="60" w:type="dxa"/>
-              <w:bottom w:w="65" w:type="dxa"/>
-              <w:end w:w="60" w:type="dxa"/>
-            </w:tcMar>
+            <w:tcW w:type="dxa" w:w="717"/>
+            <w:vAlign w:val="center"/>
+            <w:tcMar>
+              <w:top w:w="55" w:type="dxa"/>
+              <w:start w:w="30" w:type="dxa"/>
+              <w:bottom w:w="55" w:type="dxa"/>
+              <w:end w:w="30" w:type="dxa"/>
+            </w:tcMar>
+            <w:noWrap/>
             <w:tcBorders>
               <w:top w:val="single" w:sz="10" w:space="0" w:color="000000"/>
               <w:bottom w:val="single" w:sz="7" w:space="0" w:color="000000"/>
@@ -4103,22 +4107,23 @@
               <w:rPr>
                 <w:rFonts w:ascii="Times New Roman" w:hAnsi="Times New Roman"/>
                 <w:b/>
-                <w:sz w:val="13"/>
-              </w:rPr>
-              <w:t>Correct</w:t>
-            </w:r>
-          </w:p>
-        </w:tc>
-        <w:tc>
-          <w:tcPr>
-            <w:tcW w:type="dxa" w:w="631"/>
-            <w:vAlign w:val="center"/>
-            <w:tcMar>
-              <w:top w:w="65" w:type="dxa"/>
-              <w:start w:w="60" w:type="dxa"/>
-              <w:bottom w:w="65" w:type="dxa"/>
-              <w:end w:w="60" w:type="dxa"/>
-            </w:tcMar>
+                <w:sz w:val="12"/>
+              </w:rPr>
+              <w:t>Corr.</w:t>
+            </w:r>
+          </w:p>
+        </w:tc>
+        <w:tc>
+          <w:tcPr>
+            <w:tcW w:type="dxa" w:w="625"/>
+            <w:vAlign w:val="center"/>
+            <w:tcMar>
+              <w:top w:w="55" w:type="dxa"/>
+              <w:start w:w="30" w:type="dxa"/>
+              <w:bottom w:w="55" w:type="dxa"/>
+              <w:end w:w="30" w:type="dxa"/>
+            </w:tcMar>
+            <w:noWrap/>
             <w:tcBorders>
               <w:top w:val="single" w:sz="10" w:space="0" w:color="000000"/>
               <w:bottom w:val="single" w:sz="7" w:space="0" w:color="000000"/>
@@ -4138,22 +4143,23 @@
               <w:rPr>
                 <w:rFonts w:ascii="Times New Roman" w:hAnsi="Times New Roman"/>
                 <w:b/>
-                <w:sz w:val="13"/>
-              </w:rPr>
-              <w:t>Supp.</w:t>
-            </w:r>
-          </w:p>
-        </w:tc>
-        <w:tc>
-          <w:tcPr>
-            <w:tcW w:type="dxa" w:w="917"/>
-            <w:vAlign w:val="center"/>
-            <w:tcMar>
-              <w:top w:w="65" w:type="dxa"/>
-              <w:start w:w="60" w:type="dxa"/>
-              <w:bottom w:w="65" w:type="dxa"/>
-              <w:end w:w="60" w:type="dxa"/>
-            </w:tcMar>
+                <w:sz w:val="12"/>
+              </w:rPr>
+              <w:t>Sup.</w:t>
+            </w:r>
+          </w:p>
+        </w:tc>
+        <w:tc>
+          <w:tcPr>
+            <w:tcW w:type="dxa" w:w="656"/>
+            <w:vAlign w:val="center"/>
+            <w:tcMar>
+              <w:top w:w="55" w:type="dxa"/>
+              <w:start w:w="30" w:type="dxa"/>
+              <w:bottom w:w="55" w:type="dxa"/>
+              <w:end w:w="30" w:type="dxa"/>
+            </w:tcMar>
+            <w:noWrap/>
             <w:tcBorders>
               <w:top w:val="single" w:sz="10" w:space="0" w:color="000000"/>
               <w:bottom w:val="single" w:sz="7" w:space="0" w:color="000000"/>
@@ -4173,22 +4179,23 @@
               <w:rPr>
                 <w:rFonts w:ascii="Times New Roman" w:hAnsi="Times New Roman"/>
                 <w:b/>
-                <w:sz w:val="13"/>
-              </w:rPr>
-              <w:t>Neutral stance</w:t>
-            </w:r>
-          </w:p>
-        </w:tc>
-        <w:tc>
-          <w:tcPr>
-            <w:tcW w:type="dxa" w:w="570"/>
-            <w:vAlign w:val="center"/>
-            <w:tcMar>
-              <w:top w:w="65" w:type="dxa"/>
-              <w:start w:w="60" w:type="dxa"/>
-              <w:bottom w:w="65" w:type="dxa"/>
-              <w:end w:w="60" w:type="dxa"/>
-            </w:tcMar>
+                <w:sz w:val="12"/>
+              </w:rPr>
+              <w:t>Neu-S</w:t>
+            </w:r>
+          </w:p>
+        </w:tc>
+        <w:tc>
+          <w:tcPr>
+            <w:tcW w:type="dxa" w:w="625"/>
+            <w:vAlign w:val="center"/>
+            <w:tcMar>
+              <w:top w:w="55" w:type="dxa"/>
+              <w:start w:w="30" w:type="dxa"/>
+              <w:bottom w:w="55" w:type="dxa"/>
+              <w:end w:w="30" w:type="dxa"/>
+            </w:tcMar>
+            <w:noWrap/>
             <w:tcBorders>
               <w:top w:val="single" w:sz="10" w:space="0" w:color="000000"/>
               <w:bottom w:val="single" w:sz="7" w:space="0" w:color="000000"/>
@@ -4208,7 +4215,7 @@
               <w:rPr>
                 <w:rFonts w:ascii="Times New Roman" w:hAnsi="Times New Roman"/>
                 <w:b/>
-                <w:sz w:val="13"/>
+                <w:sz w:val="12"/>
               </w:rPr>
               <w:t>Opp.</w:t>
             </w:r>
@@ -4216,14 +4223,15 @@
         </w:tc>
         <w:tc>
           <w:tcPr>
-            <w:tcW w:type="dxa" w:w="529"/>
-            <w:vAlign w:val="center"/>
-            <w:tcMar>
-              <w:top w:w="65" w:type="dxa"/>
-              <w:start w:w="60" w:type="dxa"/>
-              <w:bottom w:w="65" w:type="dxa"/>
-              <w:end w:w="60" w:type="dxa"/>
-            </w:tcMar>
+            <w:tcW w:type="dxa" w:w="625"/>
+            <w:vAlign w:val="center"/>
+            <w:tcMar>
+              <w:top w:w="55" w:type="dxa"/>
+              <w:start w:w="30" w:type="dxa"/>
+              <w:bottom w:w="55" w:type="dxa"/>
+              <w:end w:w="30" w:type="dxa"/>
+            </w:tcMar>
+            <w:noWrap/>
             <w:tcBorders>
               <w:top w:val="single" w:sz="10" w:space="0" w:color="000000"/>
               <w:bottom w:val="single" w:sz="7" w:space="0" w:color="000000"/>
@@ -4243,7 +4251,7 @@
               <w:rPr>
                 <w:rFonts w:ascii="Times New Roman" w:hAnsi="Times New Roman"/>
                 <w:b/>
-                <w:sz w:val="13"/>
+                <w:sz w:val="12"/>
               </w:rPr>
               <w:t>Pos.</w:t>
             </w:r>
@@ -4251,14 +4259,15 @@
         </w:tc>
         <w:tc>
           <w:tcPr>
-            <w:tcW w:type="dxa" w:w="917"/>
-            <w:vAlign w:val="center"/>
-            <w:tcMar>
-              <w:top w:w="65" w:type="dxa"/>
-              <w:start w:w="60" w:type="dxa"/>
-              <w:bottom w:w="65" w:type="dxa"/>
-              <w:end w:w="60" w:type="dxa"/>
-            </w:tcMar>
+            <w:tcW w:type="dxa" w:w="656"/>
+            <w:vAlign w:val="center"/>
+            <w:tcMar>
+              <w:top w:w="55" w:type="dxa"/>
+              <w:start w:w="30" w:type="dxa"/>
+              <w:bottom w:w="55" w:type="dxa"/>
+              <w:end w:w="30" w:type="dxa"/>
+            </w:tcMar>
+            <w:noWrap/>
             <w:tcBorders>
               <w:top w:val="single" w:sz="10" w:space="0" w:color="000000"/>
               <w:bottom w:val="single" w:sz="7" w:space="0" w:color="000000"/>
@@ -4278,22 +4287,23 @@
               <w:rPr>
                 <w:rFonts w:ascii="Times New Roman" w:hAnsi="Times New Roman"/>
                 <w:b/>
-                <w:sz w:val="13"/>
-              </w:rPr>
-              <w:t>Neutral sent.</w:t>
-            </w:r>
-          </w:p>
-        </w:tc>
-        <w:tc>
-          <w:tcPr>
-            <w:tcW w:type="dxa" w:w="536"/>
-            <w:vAlign w:val="center"/>
-            <w:tcMar>
-              <w:top w:w="65" w:type="dxa"/>
-              <w:start w:w="60" w:type="dxa"/>
-              <w:bottom w:w="65" w:type="dxa"/>
-              <w:end w:w="60" w:type="dxa"/>
-            </w:tcMar>
+                <w:sz w:val="12"/>
+              </w:rPr>
+              <w:t>Neu-E</w:t>
+            </w:r>
+          </w:p>
+        </w:tc>
+        <w:tc>
+          <w:tcPr>
+            <w:tcW w:type="dxa" w:w="629"/>
+            <w:vAlign w:val="center"/>
+            <w:tcMar>
+              <w:top w:w="55" w:type="dxa"/>
+              <w:start w:w="30" w:type="dxa"/>
+              <w:bottom w:w="55" w:type="dxa"/>
+              <w:end w:w="30" w:type="dxa"/>
+            </w:tcMar>
+            <w:noWrap/>
             <w:tcBorders>
               <w:top w:val="single" w:sz="10" w:space="0" w:color="000000"/>
               <w:bottom w:val="single" w:sz="7" w:space="0" w:color="000000"/>
@@ -4313,7 +4323,7 @@
               <w:rPr>
                 <w:rFonts w:ascii="Times New Roman" w:hAnsi="Times New Roman"/>
                 <w:b/>
-                <w:sz w:val="13"/>
+                <w:sz w:val="12"/>
               </w:rPr>
               <w:t>Neg.</w:t>
             </w:r>
@@ -4323,14 +4333,15 @@
       <w:tr>
         <w:tc>
           <w:tcPr>
-            <w:tcW w:type="dxa" w:w="968"/>
-            <w:vAlign w:val="center"/>
-            <w:tcMar>
-              <w:top w:w="65" w:type="dxa"/>
-              <w:start w:w="60" w:type="dxa"/>
-              <w:bottom w:w="65" w:type="dxa"/>
-              <w:end w:w="60" w:type="dxa"/>
-            </w:tcMar>
+            <w:tcW w:type="dxa" w:w="1025"/>
+            <w:vAlign w:val="center"/>
+            <w:tcMar>
+              <w:top w:w="55" w:type="dxa"/>
+              <w:start w:w="30" w:type="dxa"/>
+              <w:bottom w:w="55" w:type="dxa"/>
+              <w:end w:w="30" w:type="dxa"/>
+            </w:tcMar>
+            <w:noWrap/>
             <w:tcBorders>
               <w:top w:val="nil"/>
               <w:bottom w:val="nil"/>
@@ -4350,7 +4361,7 @@
               <w:rPr>
                 <w:rFonts w:ascii="Times New Roman" w:hAnsi="Times New Roman"/>
                 <w:b w:val="0"/>
-                <w:sz w:val="13"/>
+                <w:sz w:val="12"/>
               </w:rPr>
               <w:t>Train</w:t>
             </w:r>
@@ -4358,69 +4369,71 @@
         </w:tc>
         <w:tc>
           <w:tcPr>
-            <w:tcW w:type="dxa" w:w="570"/>
-            <w:vAlign w:val="center"/>
-            <w:tcMar>
-              <w:top w:w="65" w:type="dxa"/>
-              <w:start w:w="60" w:type="dxa"/>
-              <w:bottom w:w="65" w:type="dxa"/>
-              <w:end w:w="60" w:type="dxa"/>
-            </w:tcMar>
-            <w:tcBorders>
-              <w:top w:val="nil"/>
-              <w:bottom w:val="nil"/>
-              <w:start w:val="nil"/>
-              <w:end w:val="nil"/>
-              <w:insideH w:val="nil"/>
-              <w:insideV w:val="nil"/>
-            </w:tcBorders>
-          </w:tcPr>
-          <w:p>
-            <w:pPr>
-              <w:spacing w:before="0" w:after="0" w:line="240" w:lineRule="auto"/>
-              <w:jc w:val="center"/>
-            </w:pPr>
-            <w:r/>
-            <w:r>
-              <w:rPr>
-                <w:rFonts w:ascii="Times New Roman" w:hAnsi="Times New Roman"/>
-                <w:b w:val="0"/>
-                <w:sz w:val="13"/>
-              </w:rPr>
-              <w:t>1,496</w:t>
-            </w:r>
-          </w:p>
-        </w:tc>
-        <w:tc>
-          <w:tcPr>
-            <w:tcW w:type="dxa" w:w="529"/>
-            <w:vAlign w:val="center"/>
-            <w:tcMar>
-              <w:top w:w="65" w:type="dxa"/>
-              <w:start w:w="60" w:type="dxa"/>
-              <w:bottom w:w="65" w:type="dxa"/>
-              <w:end w:w="60" w:type="dxa"/>
-            </w:tcMar>
-            <w:tcBorders>
-              <w:top w:val="nil"/>
-              <w:bottom w:val="nil"/>
-              <w:start w:val="nil"/>
-              <w:end w:val="nil"/>
-              <w:insideH w:val="nil"/>
-              <w:insideV w:val="nil"/>
-            </w:tcBorders>
-          </w:tcPr>
-          <w:p>
-            <w:pPr>
-              <w:spacing w:before="0" w:after="0" w:line="240" w:lineRule="auto"/>
-              <w:jc w:val="center"/>
-            </w:pPr>
-            <w:r/>
-            <w:r>
-              <w:rPr>
-                <w:rFonts w:ascii="Times New Roman" w:hAnsi="Times New Roman"/>
-                <w:b w:val="0"/>
-                <w:sz w:val="13"/>
+            <w:tcW w:type="dxa" w:w="707"/>
+            <w:vAlign w:val="center"/>
+            <w:tcMar>
+              <w:top w:w="55" w:type="dxa"/>
+              <w:start w:w="30" w:type="dxa"/>
+              <w:bottom w:w="55" w:type="dxa"/>
+              <w:end w:w="30" w:type="dxa"/>
+            </w:tcMar>
+            <w:noWrap/>
+            <w:tcBorders>
+              <w:top w:val="nil"/>
+              <w:bottom w:val="nil"/>
+              <w:start w:val="nil"/>
+              <w:end w:val="nil"/>
+              <w:insideH w:val="nil"/>
+              <w:insideV w:val="nil"/>
+            </w:tcBorders>
+          </w:tcPr>
+          <w:p>
+            <w:pPr>
+              <w:spacing w:before="0" w:after="0" w:line="240" w:lineRule="auto"/>
+              <w:jc w:val="center"/>
+            </w:pPr>
+            <w:r/>
+            <w:r>
+              <w:rPr>
+                <w:rFonts w:ascii="Times New Roman" w:hAnsi="Times New Roman"/>
+                <w:b w:val="0"/>
+                <w:sz w:val="12"/>
+              </w:rPr>
+              <w:t>1496</w:t>
+            </w:r>
+          </w:p>
+        </w:tc>
+        <w:tc>
+          <w:tcPr>
+            <w:tcW w:type="dxa" w:w="635"/>
+            <w:vAlign w:val="center"/>
+            <w:tcMar>
+              <w:top w:w="55" w:type="dxa"/>
+              <w:start w:w="30" w:type="dxa"/>
+              <w:bottom w:w="55" w:type="dxa"/>
+              <w:end w:w="30" w:type="dxa"/>
+            </w:tcMar>
+            <w:noWrap/>
+            <w:tcBorders>
+              <w:top w:val="nil"/>
+              <w:bottom w:val="nil"/>
+              <w:start w:val="nil"/>
+              <w:end w:val="nil"/>
+              <w:insideH w:val="nil"/>
+              <w:insideV w:val="nil"/>
+            </w:tcBorders>
+          </w:tcPr>
+          <w:p>
+            <w:pPr>
+              <w:spacing w:before="0" w:after="0" w:line="240" w:lineRule="auto"/>
+              <w:jc w:val="center"/>
+            </w:pPr>
+            <w:r/>
+            <w:r>
+              <w:rPr>
+                <w:rFonts w:ascii="Times New Roman" w:hAnsi="Times New Roman"/>
+                <w:b w:val="0"/>
+                <w:sz w:val="12"/>
               </w:rPr>
               <w:t>273</w:t>
             </w:r>
@@ -4428,69 +4441,71 @@
         </w:tc>
         <w:tc>
           <w:tcPr>
-            <w:tcW w:type="dxa" w:w="733"/>
-            <w:vAlign w:val="center"/>
-            <w:tcMar>
-              <w:top w:w="65" w:type="dxa"/>
-              <w:start w:w="60" w:type="dxa"/>
-              <w:bottom w:w="65" w:type="dxa"/>
-              <w:end w:w="60" w:type="dxa"/>
-            </w:tcMar>
-            <w:tcBorders>
-              <w:top w:val="nil"/>
-              <w:bottom w:val="nil"/>
-              <w:start w:val="nil"/>
-              <w:end w:val="nil"/>
-              <w:insideH w:val="nil"/>
-              <w:insideV w:val="nil"/>
-            </w:tcBorders>
-          </w:tcPr>
-          <w:p>
-            <w:pPr>
-              <w:spacing w:before="0" w:after="0" w:line="240" w:lineRule="auto"/>
-              <w:jc w:val="center"/>
-            </w:pPr>
-            <w:r/>
-            <w:r>
-              <w:rPr>
-                <w:rFonts w:ascii="Times New Roman" w:hAnsi="Times New Roman"/>
-                <w:b w:val="0"/>
-                <w:sz w:val="13"/>
-              </w:rPr>
-              <w:t>1,223</w:t>
-            </w:r>
-          </w:p>
-        </w:tc>
-        <w:tc>
-          <w:tcPr>
-            <w:tcW w:type="dxa" w:w="631"/>
-            <w:vAlign w:val="center"/>
-            <w:tcMar>
-              <w:top w:w="65" w:type="dxa"/>
-              <w:start w:w="60" w:type="dxa"/>
-              <w:bottom w:w="65" w:type="dxa"/>
-              <w:end w:w="60" w:type="dxa"/>
-            </w:tcMar>
-            <w:tcBorders>
-              <w:top w:val="nil"/>
-              <w:bottom w:val="nil"/>
-              <w:start w:val="nil"/>
-              <w:end w:val="nil"/>
-              <w:insideH w:val="nil"/>
-              <w:insideV w:val="nil"/>
-            </w:tcBorders>
-          </w:tcPr>
-          <w:p>
-            <w:pPr>
-              <w:spacing w:before="0" w:after="0" w:line="240" w:lineRule="auto"/>
-              <w:jc w:val="center"/>
-            </w:pPr>
-            <w:r/>
-            <w:r>
-              <w:rPr>
-                <w:rFonts w:ascii="Times New Roman" w:hAnsi="Times New Roman"/>
-                <w:b w:val="0"/>
-                <w:sz w:val="13"/>
+            <w:tcW w:type="dxa" w:w="717"/>
+            <w:vAlign w:val="center"/>
+            <w:tcMar>
+              <w:top w:w="55" w:type="dxa"/>
+              <w:start w:w="30" w:type="dxa"/>
+              <w:bottom w:w="55" w:type="dxa"/>
+              <w:end w:w="30" w:type="dxa"/>
+            </w:tcMar>
+            <w:noWrap/>
+            <w:tcBorders>
+              <w:top w:val="nil"/>
+              <w:bottom w:val="nil"/>
+              <w:start w:val="nil"/>
+              <w:end w:val="nil"/>
+              <w:insideH w:val="nil"/>
+              <w:insideV w:val="nil"/>
+            </w:tcBorders>
+          </w:tcPr>
+          <w:p>
+            <w:pPr>
+              <w:spacing w:before="0" w:after="0" w:line="240" w:lineRule="auto"/>
+              <w:jc w:val="center"/>
+            </w:pPr>
+            <w:r/>
+            <w:r>
+              <w:rPr>
+                <w:rFonts w:ascii="Times New Roman" w:hAnsi="Times New Roman"/>
+                <w:b w:val="0"/>
+                <w:sz w:val="12"/>
+              </w:rPr>
+              <w:t>1223</w:t>
+            </w:r>
+          </w:p>
+        </w:tc>
+        <w:tc>
+          <w:tcPr>
+            <w:tcW w:type="dxa" w:w="625"/>
+            <w:vAlign w:val="center"/>
+            <w:tcMar>
+              <w:top w:w="55" w:type="dxa"/>
+              <w:start w:w="30" w:type="dxa"/>
+              <w:bottom w:w="55" w:type="dxa"/>
+              <w:end w:w="30" w:type="dxa"/>
+            </w:tcMar>
+            <w:noWrap/>
+            <w:tcBorders>
+              <w:top w:val="nil"/>
+              <w:bottom w:val="nil"/>
+              <w:start w:val="nil"/>
+              <w:end w:val="nil"/>
+              <w:insideH w:val="nil"/>
+              <w:insideV w:val="nil"/>
+            </w:tcBorders>
+          </w:tcPr>
+          <w:p>
+            <w:pPr>
+              <w:spacing w:before="0" w:after="0" w:line="240" w:lineRule="auto"/>
+              <w:jc w:val="center"/>
+            </w:pPr>
+            <w:r/>
+            <w:r>
+              <w:rPr>
+                <w:rFonts w:ascii="Times New Roman" w:hAnsi="Times New Roman"/>
+                <w:b w:val="0"/>
+                <w:sz w:val="12"/>
               </w:rPr>
               <w:t>427</w:t>
             </w:r>
@@ -4498,34 +4513,35 @@
         </w:tc>
         <w:tc>
           <w:tcPr>
-            <w:tcW w:type="dxa" w:w="917"/>
-            <w:vAlign w:val="center"/>
-            <w:tcMar>
-              <w:top w:w="65" w:type="dxa"/>
-              <w:start w:w="60" w:type="dxa"/>
-              <w:bottom w:w="65" w:type="dxa"/>
-              <w:end w:w="60" w:type="dxa"/>
-            </w:tcMar>
-            <w:tcBorders>
-              <w:top w:val="nil"/>
-              <w:bottom w:val="nil"/>
-              <w:start w:val="nil"/>
-              <w:end w:val="nil"/>
-              <w:insideH w:val="nil"/>
-              <w:insideV w:val="nil"/>
-            </w:tcBorders>
-          </w:tcPr>
-          <w:p>
-            <w:pPr>
-              <w:spacing w:before="0" w:after="0" w:line="240" w:lineRule="auto"/>
-              <w:jc w:val="center"/>
-            </w:pPr>
-            <w:r/>
-            <w:r>
-              <w:rPr>
-                <w:rFonts w:ascii="Times New Roman" w:hAnsi="Times New Roman"/>
-                <w:b w:val="0"/>
-                <w:sz w:val="13"/>
+            <w:tcW w:type="dxa" w:w="656"/>
+            <w:vAlign w:val="center"/>
+            <w:tcMar>
+              <w:top w:w="55" w:type="dxa"/>
+              <w:start w:w="30" w:type="dxa"/>
+              <w:bottom w:w="55" w:type="dxa"/>
+              <w:end w:w="30" w:type="dxa"/>
+            </w:tcMar>
+            <w:noWrap/>
+            <w:tcBorders>
+              <w:top w:val="nil"/>
+              <w:bottom w:val="nil"/>
+              <w:start w:val="nil"/>
+              <w:end w:val="nil"/>
+              <w:insideH w:val="nil"/>
+              <w:insideV w:val="nil"/>
+            </w:tcBorders>
+          </w:tcPr>
+          <w:p>
+            <w:pPr>
+              <w:spacing w:before="0" w:after="0" w:line="240" w:lineRule="auto"/>
+              <w:jc w:val="center"/>
+            </w:pPr>
+            <w:r/>
+            <w:r>
+              <w:rPr>
+                <w:rFonts w:ascii="Times New Roman" w:hAnsi="Times New Roman"/>
+                <w:b w:val="0"/>
+                <w:sz w:val="12"/>
               </w:rPr>
               <w:t>622</w:t>
             </w:r>
@@ -4533,34 +4549,35 @@
         </w:tc>
         <w:tc>
           <w:tcPr>
-            <w:tcW w:type="dxa" w:w="570"/>
-            <w:vAlign w:val="center"/>
-            <w:tcMar>
-              <w:top w:w="65" w:type="dxa"/>
-              <w:start w:w="60" w:type="dxa"/>
-              <w:bottom w:w="65" w:type="dxa"/>
-              <w:end w:w="60" w:type="dxa"/>
-            </w:tcMar>
-            <w:tcBorders>
-              <w:top w:val="nil"/>
-              <w:bottom w:val="nil"/>
-              <w:start w:val="nil"/>
-              <w:end w:val="nil"/>
-              <w:insideH w:val="nil"/>
-              <w:insideV w:val="nil"/>
-            </w:tcBorders>
-          </w:tcPr>
-          <w:p>
-            <w:pPr>
-              <w:spacing w:before="0" w:after="0" w:line="240" w:lineRule="auto"/>
-              <w:jc w:val="center"/>
-            </w:pPr>
-            <w:r/>
-            <w:r>
-              <w:rPr>
-                <w:rFonts w:ascii="Times New Roman" w:hAnsi="Times New Roman"/>
-                <w:b w:val="0"/>
-                <w:sz w:val="13"/>
+            <w:tcW w:type="dxa" w:w="625"/>
+            <w:vAlign w:val="center"/>
+            <w:tcMar>
+              <w:top w:w="55" w:type="dxa"/>
+              <w:start w:w="30" w:type="dxa"/>
+              <w:bottom w:w="55" w:type="dxa"/>
+              <w:end w:w="30" w:type="dxa"/>
+            </w:tcMar>
+            <w:noWrap/>
+            <w:tcBorders>
+              <w:top w:val="nil"/>
+              <w:bottom w:val="nil"/>
+              <w:start w:val="nil"/>
+              <w:end w:val="nil"/>
+              <w:insideH w:val="nil"/>
+              <w:insideV w:val="nil"/>
+            </w:tcBorders>
+          </w:tcPr>
+          <w:p>
+            <w:pPr>
+              <w:spacing w:before="0" w:after="0" w:line="240" w:lineRule="auto"/>
+              <w:jc w:val="center"/>
+            </w:pPr>
+            <w:r/>
+            <w:r>
+              <w:rPr>
+                <w:rFonts w:ascii="Times New Roman" w:hAnsi="Times New Roman"/>
+                <w:b w:val="0"/>
+                <w:sz w:val="12"/>
               </w:rPr>
               <w:t>447</w:t>
             </w:r>
@@ -4568,34 +4585,35 @@
         </w:tc>
         <w:tc>
           <w:tcPr>
-            <w:tcW w:type="dxa" w:w="529"/>
-            <w:vAlign w:val="center"/>
-            <w:tcMar>
-              <w:top w:w="65" w:type="dxa"/>
-              <w:start w:w="60" w:type="dxa"/>
-              <w:bottom w:w="65" w:type="dxa"/>
-              <w:end w:w="60" w:type="dxa"/>
-            </w:tcMar>
-            <w:tcBorders>
-              <w:top w:val="nil"/>
-              <w:bottom w:val="nil"/>
-              <w:start w:val="nil"/>
-              <w:end w:val="nil"/>
-              <w:insideH w:val="nil"/>
-              <w:insideV w:val="nil"/>
-            </w:tcBorders>
-          </w:tcPr>
-          <w:p>
-            <w:pPr>
-              <w:spacing w:before="0" w:after="0" w:line="240" w:lineRule="auto"/>
-              <w:jc w:val="center"/>
-            </w:pPr>
-            <w:r/>
-            <w:r>
-              <w:rPr>
-                <w:rFonts w:ascii="Times New Roman" w:hAnsi="Times New Roman"/>
-                <w:b w:val="0"/>
-                <w:sz w:val="13"/>
+            <w:tcW w:type="dxa" w:w="625"/>
+            <w:vAlign w:val="center"/>
+            <w:tcMar>
+              <w:top w:w="55" w:type="dxa"/>
+              <w:start w:w="30" w:type="dxa"/>
+              <w:bottom w:w="55" w:type="dxa"/>
+              <w:end w:w="30" w:type="dxa"/>
+            </w:tcMar>
+            <w:noWrap/>
+            <w:tcBorders>
+              <w:top w:val="nil"/>
+              <w:bottom w:val="nil"/>
+              <w:start w:val="nil"/>
+              <w:end w:val="nil"/>
+              <w:insideH w:val="nil"/>
+              <w:insideV w:val="nil"/>
+            </w:tcBorders>
+          </w:tcPr>
+          <w:p>
+            <w:pPr>
+              <w:spacing w:before="0" w:after="0" w:line="240" w:lineRule="auto"/>
+              <w:jc w:val="center"/>
+            </w:pPr>
+            <w:r/>
+            <w:r>
+              <w:rPr>
+                <w:rFonts w:ascii="Times New Roman" w:hAnsi="Times New Roman"/>
+                <w:b w:val="0"/>
+                <w:sz w:val="12"/>
               </w:rPr>
               <w:t>303</w:t>
             </w:r>
@@ -4603,34 +4621,35 @@
         </w:tc>
         <w:tc>
           <w:tcPr>
-            <w:tcW w:type="dxa" w:w="917"/>
-            <w:vAlign w:val="center"/>
-            <w:tcMar>
-              <w:top w:w="65" w:type="dxa"/>
-              <w:start w:w="60" w:type="dxa"/>
-              <w:bottom w:w="65" w:type="dxa"/>
-              <w:end w:w="60" w:type="dxa"/>
-            </w:tcMar>
-            <w:tcBorders>
-              <w:top w:val="nil"/>
-              <w:bottom w:val="nil"/>
-              <w:start w:val="nil"/>
-              <w:end w:val="nil"/>
-              <w:insideH w:val="nil"/>
-              <w:insideV w:val="nil"/>
-            </w:tcBorders>
-          </w:tcPr>
-          <w:p>
-            <w:pPr>
-              <w:spacing w:before="0" w:after="0" w:line="240" w:lineRule="auto"/>
-              <w:jc w:val="center"/>
-            </w:pPr>
-            <w:r/>
-            <w:r>
-              <w:rPr>
-                <w:rFonts w:ascii="Times New Roman" w:hAnsi="Times New Roman"/>
-                <w:b w:val="0"/>
-                <w:sz w:val="13"/>
+            <w:tcW w:type="dxa" w:w="656"/>
+            <w:vAlign w:val="center"/>
+            <w:tcMar>
+              <w:top w:w="55" w:type="dxa"/>
+              <w:start w:w="30" w:type="dxa"/>
+              <w:bottom w:w="55" w:type="dxa"/>
+              <w:end w:w="30" w:type="dxa"/>
+            </w:tcMar>
+            <w:noWrap/>
+            <w:tcBorders>
+              <w:top w:val="nil"/>
+              <w:bottom w:val="nil"/>
+              <w:start w:val="nil"/>
+              <w:end w:val="nil"/>
+              <w:insideH w:val="nil"/>
+              <w:insideV w:val="nil"/>
+            </w:tcBorders>
+          </w:tcPr>
+          <w:p>
+            <w:pPr>
+              <w:spacing w:before="0" w:after="0" w:line="240" w:lineRule="auto"/>
+              <w:jc w:val="center"/>
+            </w:pPr>
+            <w:r/>
+            <w:r>
+              <w:rPr>
+                <w:rFonts w:ascii="Times New Roman" w:hAnsi="Times New Roman"/>
+                <w:b w:val="0"/>
+                <w:sz w:val="12"/>
               </w:rPr>
               <w:t>571</w:t>
             </w:r>
@@ -4638,34 +4657,35 @@
         </w:tc>
         <w:tc>
           <w:tcPr>
-            <w:tcW w:type="dxa" w:w="536"/>
-            <w:vAlign w:val="center"/>
-            <w:tcMar>
-              <w:top w:w="65" w:type="dxa"/>
-              <w:start w:w="60" w:type="dxa"/>
-              <w:bottom w:w="65" w:type="dxa"/>
-              <w:end w:w="60" w:type="dxa"/>
-            </w:tcMar>
-            <w:tcBorders>
-              <w:top w:val="nil"/>
-              <w:bottom w:val="nil"/>
-              <w:start w:val="nil"/>
-              <w:end w:val="nil"/>
-              <w:insideH w:val="nil"/>
-              <w:insideV w:val="nil"/>
-            </w:tcBorders>
-          </w:tcPr>
-          <w:p>
-            <w:pPr>
-              <w:spacing w:before="0" w:after="0" w:line="240" w:lineRule="auto"/>
-              <w:jc w:val="center"/>
-            </w:pPr>
-            <w:r/>
-            <w:r>
-              <w:rPr>
-                <w:rFonts w:ascii="Times New Roman" w:hAnsi="Times New Roman"/>
-                <w:b w:val="0"/>
-                <w:sz w:val="13"/>
+            <w:tcW w:type="dxa" w:w="629"/>
+            <w:vAlign w:val="center"/>
+            <w:tcMar>
+              <w:top w:w="55" w:type="dxa"/>
+              <w:start w:w="30" w:type="dxa"/>
+              <w:bottom w:w="55" w:type="dxa"/>
+              <w:end w:w="30" w:type="dxa"/>
+            </w:tcMar>
+            <w:noWrap/>
+            <w:tcBorders>
+              <w:top w:val="nil"/>
+              <w:bottom w:val="nil"/>
+              <w:start w:val="nil"/>
+              <w:end w:val="nil"/>
+              <w:insideH w:val="nil"/>
+              <w:insideV w:val="nil"/>
+            </w:tcBorders>
+          </w:tcPr>
+          <w:p>
+            <w:pPr>
+              <w:spacing w:before="0" w:after="0" w:line="240" w:lineRule="auto"/>
+              <w:jc w:val="center"/>
+            </w:pPr>
+            <w:r/>
+            <w:r>
+              <w:rPr>
+                <w:rFonts w:ascii="Times New Roman" w:hAnsi="Times New Roman"/>
+                <w:b w:val="0"/>
+                <w:sz w:val="12"/>
               </w:rPr>
               <w:t>622</w:t>
             </w:r>
@@ -4675,14 +4695,15 @@
       <w:tr>
         <w:tc>
           <w:tcPr>
-            <w:tcW w:type="dxa" w:w="968"/>
-            <w:vAlign w:val="center"/>
-            <w:tcMar>
-              <w:top w:w="65" w:type="dxa"/>
-              <w:start w:w="60" w:type="dxa"/>
-              <w:bottom w:w="65" w:type="dxa"/>
-              <w:end w:w="60" w:type="dxa"/>
-            </w:tcMar>
+            <w:tcW w:type="dxa" w:w="1025"/>
+            <w:vAlign w:val="center"/>
+            <w:tcMar>
+              <w:top w:w="55" w:type="dxa"/>
+              <w:start w:w="30" w:type="dxa"/>
+              <w:bottom w:w="55" w:type="dxa"/>
+              <w:end w:w="30" w:type="dxa"/>
+            </w:tcMar>
+            <w:noWrap/>
             <w:tcBorders>
               <w:top w:val="nil"/>
               <w:bottom w:val="nil"/>
@@ -4702,7 +4723,7 @@
               <w:rPr>
                 <w:rFonts w:ascii="Times New Roman" w:hAnsi="Times New Roman"/>
                 <w:b w:val="0"/>
-                <w:sz w:val="13"/>
+                <w:sz w:val="12"/>
               </w:rPr>
               <w:t>Validation</w:t>
             </w:r>
@@ -4710,34 +4731,35 @@
         </w:tc>
         <w:tc>
           <w:tcPr>
-            <w:tcW w:type="dxa" w:w="570"/>
-            <w:vAlign w:val="center"/>
-            <w:tcMar>
-              <w:top w:w="65" w:type="dxa"/>
-              <w:start w:w="60" w:type="dxa"/>
-              <w:bottom w:w="65" w:type="dxa"/>
-              <w:end w:w="60" w:type="dxa"/>
-            </w:tcMar>
-            <w:tcBorders>
-              <w:top w:val="nil"/>
-              <w:bottom w:val="nil"/>
-              <w:start w:val="nil"/>
-              <w:end w:val="nil"/>
-              <w:insideH w:val="nil"/>
-              <w:insideV w:val="nil"/>
-            </w:tcBorders>
-          </w:tcPr>
-          <w:p>
-            <w:pPr>
-              <w:spacing w:before="0" w:after="0" w:line="240" w:lineRule="auto"/>
-              <w:jc w:val="center"/>
-            </w:pPr>
-            <w:r/>
-            <w:r>
-              <w:rPr>
-                <w:rFonts w:ascii="Times New Roman" w:hAnsi="Times New Roman"/>
-                <w:b w:val="0"/>
-                <w:sz w:val="13"/>
+            <w:tcW w:type="dxa" w:w="707"/>
+            <w:vAlign w:val="center"/>
+            <w:tcMar>
+              <w:top w:w="55" w:type="dxa"/>
+              <w:start w:w="30" w:type="dxa"/>
+              <w:bottom w:w="55" w:type="dxa"/>
+              <w:end w:w="30" w:type="dxa"/>
+            </w:tcMar>
+            <w:noWrap/>
+            <w:tcBorders>
+              <w:top w:val="nil"/>
+              <w:bottom w:val="nil"/>
+              <w:start w:val="nil"/>
+              <w:end w:val="nil"/>
+              <w:insideH w:val="nil"/>
+              <w:insideV w:val="nil"/>
+            </w:tcBorders>
+          </w:tcPr>
+          <w:p>
+            <w:pPr>
+              <w:spacing w:before="0" w:after="0" w:line="240" w:lineRule="auto"/>
+              <w:jc w:val="center"/>
+            </w:pPr>
+            <w:r/>
+            <w:r>
+              <w:rPr>
+                <w:rFonts w:ascii="Times New Roman" w:hAnsi="Times New Roman"/>
+                <w:b w:val="0"/>
+                <w:sz w:val="12"/>
               </w:rPr>
               <w:t>167</w:t>
             </w:r>
@@ -4745,34 +4767,35 @@
         </w:tc>
         <w:tc>
           <w:tcPr>
-            <w:tcW w:type="dxa" w:w="529"/>
-            <w:vAlign w:val="center"/>
-            <w:tcMar>
-              <w:top w:w="65" w:type="dxa"/>
-              <w:start w:w="60" w:type="dxa"/>
-              <w:bottom w:w="65" w:type="dxa"/>
-              <w:end w:w="60" w:type="dxa"/>
-            </w:tcMar>
-            <w:tcBorders>
-              <w:top w:val="nil"/>
-              <w:bottom w:val="nil"/>
-              <w:start w:val="nil"/>
-              <w:end w:val="nil"/>
-              <w:insideH w:val="nil"/>
-              <w:insideV w:val="nil"/>
-            </w:tcBorders>
-          </w:tcPr>
-          <w:p>
-            <w:pPr>
-              <w:spacing w:before="0" w:after="0" w:line="240" w:lineRule="auto"/>
-              <w:jc w:val="center"/>
-            </w:pPr>
-            <w:r/>
-            <w:r>
-              <w:rPr>
-                <w:rFonts w:ascii="Times New Roman" w:hAnsi="Times New Roman"/>
-                <w:b w:val="0"/>
-                <w:sz w:val="13"/>
+            <w:tcW w:type="dxa" w:w="635"/>
+            <w:vAlign w:val="center"/>
+            <w:tcMar>
+              <w:top w:w="55" w:type="dxa"/>
+              <w:start w:w="30" w:type="dxa"/>
+              <w:bottom w:w="55" w:type="dxa"/>
+              <w:end w:w="30" w:type="dxa"/>
+            </w:tcMar>
+            <w:noWrap/>
+            <w:tcBorders>
+              <w:top w:val="nil"/>
+              <w:bottom w:val="nil"/>
+              <w:start w:val="nil"/>
+              <w:end w:val="nil"/>
+              <w:insideH w:val="nil"/>
+              <w:insideV w:val="nil"/>
+            </w:tcBorders>
+          </w:tcPr>
+          <w:p>
+            <w:pPr>
+              <w:spacing w:before="0" w:after="0" w:line="240" w:lineRule="auto"/>
+              <w:jc w:val="center"/>
+            </w:pPr>
+            <w:r/>
+            <w:r>
+              <w:rPr>
+                <w:rFonts w:ascii="Times New Roman" w:hAnsi="Times New Roman"/>
+                <w:b w:val="0"/>
+                <w:sz w:val="12"/>
               </w:rPr>
               <w:t>31</w:t>
             </w:r>
@@ -4780,34 +4803,35 @@
         </w:tc>
         <w:tc>
           <w:tcPr>
-            <w:tcW w:type="dxa" w:w="733"/>
-            <w:vAlign w:val="center"/>
-            <w:tcMar>
-              <w:top w:w="65" w:type="dxa"/>
-              <w:start w:w="60" w:type="dxa"/>
-              <w:bottom w:w="65" w:type="dxa"/>
-              <w:end w:w="60" w:type="dxa"/>
-            </w:tcMar>
-            <w:tcBorders>
-              <w:top w:val="nil"/>
-              <w:bottom w:val="nil"/>
-              <w:start w:val="nil"/>
-              <w:end w:val="nil"/>
-              <w:insideH w:val="nil"/>
-              <w:insideV w:val="nil"/>
-            </w:tcBorders>
-          </w:tcPr>
-          <w:p>
-            <w:pPr>
-              <w:spacing w:before="0" w:after="0" w:line="240" w:lineRule="auto"/>
-              <w:jc w:val="center"/>
-            </w:pPr>
-            <w:r/>
-            <w:r>
-              <w:rPr>
-                <w:rFonts w:ascii="Times New Roman" w:hAnsi="Times New Roman"/>
-                <w:b w:val="0"/>
-                <w:sz w:val="13"/>
+            <w:tcW w:type="dxa" w:w="717"/>
+            <w:vAlign w:val="center"/>
+            <w:tcMar>
+              <w:top w:w="55" w:type="dxa"/>
+              <w:start w:w="30" w:type="dxa"/>
+              <w:bottom w:w="55" w:type="dxa"/>
+              <w:end w:w="30" w:type="dxa"/>
+            </w:tcMar>
+            <w:noWrap/>
+            <w:tcBorders>
+              <w:top w:val="nil"/>
+              <w:bottom w:val="nil"/>
+              <w:start w:val="nil"/>
+              <w:end w:val="nil"/>
+              <w:insideH w:val="nil"/>
+              <w:insideV w:val="nil"/>
+            </w:tcBorders>
+          </w:tcPr>
+          <w:p>
+            <w:pPr>
+              <w:spacing w:before="0" w:after="0" w:line="240" w:lineRule="auto"/>
+              <w:jc w:val="center"/>
+            </w:pPr>
+            <w:r/>
+            <w:r>
+              <w:rPr>
+                <w:rFonts w:ascii="Times New Roman" w:hAnsi="Times New Roman"/>
+                <w:b w:val="0"/>
+                <w:sz w:val="12"/>
               </w:rPr>
               <w:t>136</w:t>
             </w:r>
@@ -4815,34 +4839,35 @@
         </w:tc>
         <w:tc>
           <w:tcPr>
-            <w:tcW w:type="dxa" w:w="631"/>
-            <w:vAlign w:val="center"/>
-            <w:tcMar>
-              <w:top w:w="65" w:type="dxa"/>
-              <w:start w:w="60" w:type="dxa"/>
-              <w:bottom w:w="65" w:type="dxa"/>
-              <w:end w:w="60" w:type="dxa"/>
-            </w:tcMar>
-            <w:tcBorders>
-              <w:top w:val="nil"/>
-              <w:bottom w:val="nil"/>
-              <w:start w:val="nil"/>
-              <w:end w:val="nil"/>
-              <w:insideH w:val="nil"/>
-              <w:insideV w:val="nil"/>
-            </w:tcBorders>
-          </w:tcPr>
-          <w:p>
-            <w:pPr>
-              <w:spacing w:before="0" w:after="0" w:line="240" w:lineRule="auto"/>
-              <w:jc w:val="center"/>
-            </w:pPr>
-            <w:r/>
-            <w:r>
-              <w:rPr>
-                <w:rFonts w:ascii="Times New Roman" w:hAnsi="Times New Roman"/>
-                <w:b w:val="0"/>
-                <w:sz w:val="13"/>
+            <w:tcW w:type="dxa" w:w="625"/>
+            <w:vAlign w:val="center"/>
+            <w:tcMar>
+              <w:top w:w="55" w:type="dxa"/>
+              <w:start w:w="30" w:type="dxa"/>
+              <w:bottom w:w="55" w:type="dxa"/>
+              <w:end w:w="30" w:type="dxa"/>
+            </w:tcMar>
+            <w:noWrap/>
+            <w:tcBorders>
+              <w:top w:val="nil"/>
+              <w:bottom w:val="nil"/>
+              <w:start w:val="nil"/>
+              <w:end w:val="nil"/>
+              <w:insideH w:val="nil"/>
+              <w:insideV w:val="nil"/>
+            </w:tcBorders>
+          </w:tcPr>
+          <w:p>
+            <w:pPr>
+              <w:spacing w:before="0" w:after="0" w:line="240" w:lineRule="auto"/>
+              <w:jc w:val="center"/>
+            </w:pPr>
+            <w:r/>
+            <w:r>
+              <w:rPr>
+                <w:rFonts w:ascii="Times New Roman" w:hAnsi="Times New Roman"/>
+                <w:b w:val="0"/>
+                <w:sz w:val="12"/>
               </w:rPr>
               <w:t>48</w:t>
             </w:r>
@@ -4850,34 +4875,35 @@
         </w:tc>
         <w:tc>
           <w:tcPr>
-            <w:tcW w:type="dxa" w:w="917"/>
-            <w:vAlign w:val="center"/>
-            <w:tcMar>
-              <w:top w:w="65" w:type="dxa"/>
-              <w:start w:w="60" w:type="dxa"/>
-              <w:bottom w:w="65" w:type="dxa"/>
-              <w:end w:w="60" w:type="dxa"/>
-            </w:tcMar>
-            <w:tcBorders>
-              <w:top w:val="nil"/>
-              <w:bottom w:val="nil"/>
-              <w:start w:val="nil"/>
-              <w:end w:val="nil"/>
-              <w:insideH w:val="nil"/>
-              <w:insideV w:val="nil"/>
-            </w:tcBorders>
-          </w:tcPr>
-          <w:p>
-            <w:pPr>
-              <w:spacing w:before="0" w:after="0" w:line="240" w:lineRule="auto"/>
-              <w:jc w:val="center"/>
-            </w:pPr>
-            <w:r/>
-            <w:r>
-              <w:rPr>
-                <w:rFonts w:ascii="Times New Roman" w:hAnsi="Times New Roman"/>
-                <w:b w:val="0"/>
-                <w:sz w:val="13"/>
+            <w:tcW w:type="dxa" w:w="656"/>
+            <w:vAlign w:val="center"/>
+            <w:tcMar>
+              <w:top w:w="55" w:type="dxa"/>
+              <w:start w:w="30" w:type="dxa"/>
+              <w:bottom w:w="55" w:type="dxa"/>
+              <w:end w:w="30" w:type="dxa"/>
+            </w:tcMar>
+            <w:noWrap/>
+            <w:tcBorders>
+              <w:top w:val="nil"/>
+              <w:bottom w:val="nil"/>
+              <w:start w:val="nil"/>
+              <w:end w:val="nil"/>
+              <w:insideH w:val="nil"/>
+              <w:insideV w:val="nil"/>
+            </w:tcBorders>
+          </w:tcPr>
+          <w:p>
+            <w:pPr>
+              <w:spacing w:before="0" w:after="0" w:line="240" w:lineRule="auto"/>
+              <w:jc w:val="center"/>
+            </w:pPr>
+            <w:r/>
+            <w:r>
+              <w:rPr>
+                <w:rFonts w:ascii="Times New Roman" w:hAnsi="Times New Roman"/>
+                <w:b w:val="0"/>
+                <w:sz w:val="12"/>
               </w:rPr>
               <w:t>66</w:t>
             </w:r>
@@ -4885,34 +4911,35 @@
         </w:tc>
         <w:tc>
           <w:tcPr>
-            <w:tcW w:type="dxa" w:w="570"/>
-            <w:vAlign w:val="center"/>
-            <w:tcMar>
-              <w:top w:w="65" w:type="dxa"/>
-              <w:start w:w="60" w:type="dxa"/>
-              <w:bottom w:w="65" w:type="dxa"/>
-              <w:end w:w="60" w:type="dxa"/>
-            </w:tcMar>
-            <w:tcBorders>
-              <w:top w:val="nil"/>
-              <w:bottom w:val="nil"/>
-              <w:start w:val="nil"/>
-              <w:end w:val="nil"/>
-              <w:insideH w:val="nil"/>
-              <w:insideV w:val="nil"/>
-            </w:tcBorders>
-          </w:tcPr>
-          <w:p>
-            <w:pPr>
-              <w:spacing w:before="0" w:after="0" w:line="240" w:lineRule="auto"/>
-              <w:jc w:val="center"/>
-            </w:pPr>
-            <w:r/>
-            <w:r>
-              <w:rPr>
-                <w:rFonts w:ascii="Times New Roman" w:hAnsi="Times New Roman"/>
-                <w:b w:val="0"/>
-                <w:sz w:val="13"/>
+            <w:tcW w:type="dxa" w:w="625"/>
+            <w:vAlign w:val="center"/>
+            <w:tcMar>
+              <w:top w:w="55" w:type="dxa"/>
+              <w:start w:w="30" w:type="dxa"/>
+              <w:bottom w:w="55" w:type="dxa"/>
+              <w:end w:w="30" w:type="dxa"/>
+            </w:tcMar>
+            <w:noWrap/>
+            <w:tcBorders>
+              <w:top w:val="nil"/>
+              <w:bottom w:val="nil"/>
+              <w:start w:val="nil"/>
+              <w:end w:val="nil"/>
+              <w:insideH w:val="nil"/>
+              <w:insideV w:val="nil"/>
+            </w:tcBorders>
+          </w:tcPr>
+          <w:p>
+            <w:pPr>
+              <w:spacing w:before="0" w:after="0" w:line="240" w:lineRule="auto"/>
+              <w:jc w:val="center"/>
+            </w:pPr>
+            <w:r/>
+            <w:r>
+              <w:rPr>
+                <w:rFonts w:ascii="Times New Roman" w:hAnsi="Times New Roman"/>
+                <w:b w:val="0"/>
+                <w:sz w:val="12"/>
               </w:rPr>
               <w:t>53</w:t>
             </w:r>
@@ -4920,34 +4947,35 @@
         </w:tc>
         <w:tc>
           <w:tcPr>
-            <w:tcW w:type="dxa" w:w="529"/>
-            <w:vAlign w:val="center"/>
-            <w:tcMar>
-              <w:top w:w="65" w:type="dxa"/>
-              <w:start w:w="60" w:type="dxa"/>
-              <w:bottom w:w="65" w:type="dxa"/>
-              <w:end w:w="60" w:type="dxa"/>
-            </w:tcMar>
-            <w:tcBorders>
-              <w:top w:val="nil"/>
-              <w:bottom w:val="nil"/>
-              <w:start w:val="nil"/>
-              <w:end w:val="nil"/>
-              <w:insideH w:val="nil"/>
-              <w:insideV w:val="nil"/>
-            </w:tcBorders>
-          </w:tcPr>
-          <w:p>
-            <w:pPr>
-              <w:spacing w:before="0" w:after="0" w:line="240" w:lineRule="auto"/>
-              <w:jc w:val="center"/>
-            </w:pPr>
-            <w:r/>
-            <w:r>
-              <w:rPr>
-                <w:rFonts w:ascii="Times New Roman" w:hAnsi="Times New Roman"/>
-                <w:b w:val="0"/>
-                <w:sz w:val="13"/>
+            <w:tcW w:type="dxa" w:w="625"/>
+            <w:vAlign w:val="center"/>
+            <w:tcMar>
+              <w:top w:w="55" w:type="dxa"/>
+              <w:start w:w="30" w:type="dxa"/>
+              <w:bottom w:w="55" w:type="dxa"/>
+              <w:end w:w="30" w:type="dxa"/>
+            </w:tcMar>
+            <w:noWrap/>
+            <w:tcBorders>
+              <w:top w:val="nil"/>
+              <w:bottom w:val="nil"/>
+              <w:start w:val="nil"/>
+              <w:end w:val="nil"/>
+              <w:insideH w:val="nil"/>
+              <w:insideV w:val="nil"/>
+            </w:tcBorders>
+          </w:tcPr>
+          <w:p>
+            <w:pPr>
+              <w:spacing w:before="0" w:after="0" w:line="240" w:lineRule="auto"/>
+              <w:jc w:val="center"/>
+            </w:pPr>
+            <w:r/>
+            <w:r>
+              <w:rPr>
+                <w:rFonts w:ascii="Times New Roman" w:hAnsi="Times New Roman"/>
+                <w:b w:val="0"/>
+                <w:sz w:val="12"/>
               </w:rPr>
               <w:t>27</w:t>
             </w:r>
@@ -4955,34 +4983,35 @@
         </w:tc>
         <w:tc>
           <w:tcPr>
-            <w:tcW w:type="dxa" w:w="917"/>
-            <w:vAlign w:val="center"/>
-            <w:tcMar>
-              <w:top w:w="65" w:type="dxa"/>
-              <w:start w:w="60" w:type="dxa"/>
-              <w:bottom w:w="65" w:type="dxa"/>
-              <w:end w:w="60" w:type="dxa"/>
-            </w:tcMar>
-            <w:tcBorders>
-              <w:top w:val="nil"/>
-              <w:bottom w:val="nil"/>
-              <w:start w:val="nil"/>
-              <w:end w:val="nil"/>
-              <w:insideH w:val="nil"/>
-              <w:insideV w:val="nil"/>
-            </w:tcBorders>
-          </w:tcPr>
-          <w:p>
-            <w:pPr>
-              <w:spacing w:before="0" w:after="0" w:line="240" w:lineRule="auto"/>
-              <w:jc w:val="center"/>
-            </w:pPr>
-            <w:r/>
-            <w:r>
-              <w:rPr>
-                <w:rFonts w:ascii="Times New Roman" w:hAnsi="Times New Roman"/>
-                <w:b w:val="0"/>
-                <w:sz w:val="13"/>
+            <w:tcW w:type="dxa" w:w="656"/>
+            <w:vAlign w:val="center"/>
+            <w:tcMar>
+              <w:top w:w="55" w:type="dxa"/>
+              <w:start w:w="30" w:type="dxa"/>
+              <w:bottom w:w="55" w:type="dxa"/>
+              <w:end w:w="30" w:type="dxa"/>
+            </w:tcMar>
+            <w:noWrap/>
+            <w:tcBorders>
+              <w:top w:val="nil"/>
+              <w:bottom w:val="nil"/>
+              <w:start w:val="nil"/>
+              <w:end w:val="nil"/>
+              <w:insideH w:val="nil"/>
+              <w:insideV w:val="nil"/>
+            </w:tcBorders>
+          </w:tcPr>
+          <w:p>
+            <w:pPr>
+              <w:spacing w:before="0" w:after="0" w:line="240" w:lineRule="auto"/>
+              <w:jc w:val="center"/>
+            </w:pPr>
+            <w:r/>
+            <w:r>
+              <w:rPr>
+                <w:rFonts w:ascii="Times New Roman" w:hAnsi="Times New Roman"/>
+                <w:b w:val="0"/>
+                <w:sz w:val="12"/>
               </w:rPr>
               <w:t>65</w:t>
             </w:r>
@@ -4990,34 +5019,35 @@
         </w:tc>
         <w:tc>
           <w:tcPr>
-            <w:tcW w:type="dxa" w:w="536"/>
-            <w:vAlign w:val="center"/>
-            <w:tcMar>
-              <w:top w:w="65" w:type="dxa"/>
-              <w:start w:w="60" w:type="dxa"/>
-              <w:bottom w:w="65" w:type="dxa"/>
-              <w:end w:w="60" w:type="dxa"/>
-            </w:tcMar>
-            <w:tcBorders>
-              <w:top w:val="nil"/>
-              <w:bottom w:val="nil"/>
-              <w:start w:val="nil"/>
-              <w:end w:val="nil"/>
-              <w:insideH w:val="nil"/>
-              <w:insideV w:val="nil"/>
-            </w:tcBorders>
-          </w:tcPr>
-          <w:p>
-            <w:pPr>
-              <w:spacing w:before="0" w:after="0" w:line="240" w:lineRule="auto"/>
-              <w:jc w:val="center"/>
-            </w:pPr>
-            <w:r/>
-            <w:r>
-              <w:rPr>
-                <w:rFonts w:ascii="Times New Roman" w:hAnsi="Times New Roman"/>
-                <w:b w:val="0"/>
-                <w:sz w:val="13"/>
+            <w:tcW w:type="dxa" w:w="629"/>
+            <w:vAlign w:val="center"/>
+            <w:tcMar>
+              <w:top w:w="55" w:type="dxa"/>
+              <w:start w:w="30" w:type="dxa"/>
+              <w:bottom w:w="55" w:type="dxa"/>
+              <w:end w:w="30" w:type="dxa"/>
+            </w:tcMar>
+            <w:noWrap/>
+            <w:tcBorders>
+              <w:top w:val="nil"/>
+              <w:bottom w:val="nil"/>
+              <w:start w:val="nil"/>
+              <w:end w:val="nil"/>
+              <w:insideH w:val="nil"/>
+              <w:insideV w:val="nil"/>
+            </w:tcBorders>
+          </w:tcPr>
+          <w:p>
+            <w:pPr>
+              <w:spacing w:before="0" w:after="0" w:line="240" w:lineRule="auto"/>
+              <w:jc w:val="center"/>
+            </w:pPr>
+            <w:r/>
+            <w:r>
+              <w:rPr>
+                <w:rFonts w:ascii="Times New Roman" w:hAnsi="Times New Roman"/>
+                <w:b w:val="0"/>
+                <w:sz w:val="12"/>
               </w:rPr>
               <w:t>75</w:t>
             </w:r>
@@ -5027,14 +5057,15 @@
       <w:tr>
         <w:tc>
           <w:tcPr>
-            <w:tcW w:type="dxa" w:w="968"/>
-            <w:vAlign w:val="center"/>
-            <w:tcMar>
-              <w:top w:w="65" w:type="dxa"/>
-              <w:start w:w="60" w:type="dxa"/>
-              <w:bottom w:w="65" w:type="dxa"/>
-              <w:end w:w="60" w:type="dxa"/>
-            </w:tcMar>
+            <w:tcW w:type="dxa" w:w="1025"/>
+            <w:vAlign w:val="center"/>
+            <w:tcMar>
+              <w:top w:w="55" w:type="dxa"/>
+              <w:start w:w="30" w:type="dxa"/>
+              <w:bottom w:w="55" w:type="dxa"/>
+              <w:end w:w="30" w:type="dxa"/>
+            </w:tcMar>
+            <w:noWrap/>
             <w:tcBorders>
               <w:top w:val="nil"/>
               <w:bottom w:val="nil"/>
@@ -5054,7 +5085,7 @@
               <w:rPr>
                 <w:rFonts w:ascii="Times New Roman" w:hAnsi="Times New Roman"/>
                 <w:b w:val="0"/>
-                <w:sz w:val="13"/>
+                <w:sz w:val="12"/>
               </w:rPr>
               <w:t>Gold Test</w:t>
             </w:r>
@@ -5062,34 +5093,35 @@
         </w:tc>
         <w:tc>
           <w:tcPr>
-            <w:tcW w:type="dxa" w:w="570"/>
-            <w:vAlign w:val="center"/>
-            <w:tcMar>
-              <w:top w:w="65" w:type="dxa"/>
-              <w:start w:w="60" w:type="dxa"/>
-              <w:bottom w:w="65" w:type="dxa"/>
-              <w:end w:w="60" w:type="dxa"/>
-            </w:tcMar>
-            <w:tcBorders>
-              <w:top w:val="nil"/>
-              <w:bottom w:val="nil"/>
-              <w:start w:val="nil"/>
-              <w:end w:val="nil"/>
-              <w:insideH w:val="nil"/>
-              <w:insideV w:val="nil"/>
-            </w:tcBorders>
-          </w:tcPr>
-          <w:p>
-            <w:pPr>
-              <w:spacing w:before="0" w:after="0" w:line="240" w:lineRule="auto"/>
-              <w:jc w:val="center"/>
-            </w:pPr>
-            <w:r/>
-            <w:r>
-              <w:rPr>
-                <w:rFonts w:ascii="Times New Roman" w:hAnsi="Times New Roman"/>
-                <w:b w:val="0"/>
-                <w:sz w:val="13"/>
+            <w:tcW w:type="dxa" w:w="707"/>
+            <w:vAlign w:val="center"/>
+            <w:tcMar>
+              <w:top w:w="55" w:type="dxa"/>
+              <w:start w:w="30" w:type="dxa"/>
+              <w:bottom w:w="55" w:type="dxa"/>
+              <w:end w:w="30" w:type="dxa"/>
+            </w:tcMar>
+            <w:noWrap/>
+            <w:tcBorders>
+              <w:top w:val="nil"/>
+              <w:bottom w:val="nil"/>
+              <w:start w:val="nil"/>
+              <w:end w:val="nil"/>
+              <w:insideH w:val="nil"/>
+              <w:insideV w:val="nil"/>
+            </w:tcBorders>
+          </w:tcPr>
+          <w:p>
+            <w:pPr>
+              <w:spacing w:before="0" w:after="0" w:line="240" w:lineRule="auto"/>
+              <w:jc w:val="center"/>
+            </w:pPr>
+            <w:r/>
+            <w:r>
+              <w:rPr>
+                <w:rFonts w:ascii="Times New Roman" w:hAnsi="Times New Roman"/>
+                <w:b w:val="0"/>
+                <w:sz w:val="12"/>
               </w:rPr>
               <w:t>186</w:t>
             </w:r>
@@ -5097,34 +5129,35 @@
         </w:tc>
         <w:tc>
           <w:tcPr>
-            <w:tcW w:type="dxa" w:w="529"/>
-            <w:vAlign w:val="center"/>
-            <w:tcMar>
-              <w:top w:w="65" w:type="dxa"/>
-              <w:start w:w="60" w:type="dxa"/>
-              <w:bottom w:w="65" w:type="dxa"/>
-              <w:end w:w="60" w:type="dxa"/>
-            </w:tcMar>
-            <w:tcBorders>
-              <w:top w:val="nil"/>
-              <w:bottom w:val="nil"/>
-              <w:start w:val="nil"/>
-              <w:end w:val="nil"/>
-              <w:insideH w:val="nil"/>
-              <w:insideV w:val="nil"/>
-            </w:tcBorders>
-          </w:tcPr>
-          <w:p>
-            <w:pPr>
-              <w:spacing w:before="0" w:after="0" w:line="240" w:lineRule="auto"/>
-              <w:jc w:val="center"/>
-            </w:pPr>
-            <w:r/>
-            <w:r>
-              <w:rPr>
-                <w:rFonts w:ascii="Times New Roman" w:hAnsi="Times New Roman"/>
-                <w:b w:val="0"/>
-                <w:sz w:val="13"/>
+            <w:tcW w:type="dxa" w:w="635"/>
+            <w:vAlign w:val="center"/>
+            <w:tcMar>
+              <w:top w:w="55" w:type="dxa"/>
+              <w:start w:w="30" w:type="dxa"/>
+              <w:bottom w:w="55" w:type="dxa"/>
+              <w:end w:w="30" w:type="dxa"/>
+            </w:tcMar>
+            <w:noWrap/>
+            <w:tcBorders>
+              <w:top w:val="nil"/>
+              <w:bottom w:val="nil"/>
+              <w:start w:val="nil"/>
+              <w:end w:val="nil"/>
+              <w:insideH w:val="nil"/>
+              <w:insideV w:val="nil"/>
+            </w:tcBorders>
+          </w:tcPr>
+          <w:p>
+            <w:pPr>
+              <w:spacing w:before="0" w:after="0" w:line="240" w:lineRule="auto"/>
+              <w:jc w:val="center"/>
+            </w:pPr>
+            <w:r/>
+            <w:r>
+              <w:rPr>
+                <w:rFonts w:ascii="Times New Roman" w:hAnsi="Times New Roman"/>
+                <w:b w:val="0"/>
+                <w:sz w:val="12"/>
               </w:rPr>
               <w:t>28</w:t>
             </w:r>
@@ -5132,34 +5165,35 @@
         </w:tc>
         <w:tc>
           <w:tcPr>
-            <w:tcW w:type="dxa" w:w="733"/>
-            <w:vAlign w:val="center"/>
-            <w:tcMar>
-              <w:top w:w="65" w:type="dxa"/>
-              <w:start w:w="60" w:type="dxa"/>
-              <w:bottom w:w="65" w:type="dxa"/>
-              <w:end w:w="60" w:type="dxa"/>
-            </w:tcMar>
-            <w:tcBorders>
-              <w:top w:val="nil"/>
-              <w:bottom w:val="nil"/>
-              <w:start w:val="nil"/>
-              <w:end w:val="nil"/>
-              <w:insideH w:val="nil"/>
-              <w:insideV w:val="nil"/>
-            </w:tcBorders>
-          </w:tcPr>
-          <w:p>
-            <w:pPr>
-              <w:spacing w:before="0" w:after="0" w:line="240" w:lineRule="auto"/>
-              <w:jc w:val="center"/>
-            </w:pPr>
-            <w:r/>
-            <w:r>
-              <w:rPr>
-                <w:rFonts w:ascii="Times New Roman" w:hAnsi="Times New Roman"/>
-                <w:b w:val="0"/>
-                <w:sz w:val="13"/>
+            <w:tcW w:type="dxa" w:w="717"/>
+            <w:vAlign w:val="center"/>
+            <w:tcMar>
+              <w:top w:w="55" w:type="dxa"/>
+              <w:start w:w="30" w:type="dxa"/>
+              <w:bottom w:w="55" w:type="dxa"/>
+              <w:end w:w="30" w:type="dxa"/>
+            </w:tcMar>
+            <w:noWrap/>
+            <w:tcBorders>
+              <w:top w:val="nil"/>
+              <w:bottom w:val="nil"/>
+              <w:start w:val="nil"/>
+              <w:end w:val="nil"/>
+              <w:insideH w:val="nil"/>
+              <w:insideV w:val="nil"/>
+            </w:tcBorders>
+          </w:tcPr>
+          <w:p>
+            <w:pPr>
+              <w:spacing w:before="0" w:after="0" w:line="240" w:lineRule="auto"/>
+              <w:jc w:val="center"/>
+            </w:pPr>
+            <w:r/>
+            <w:r>
+              <w:rPr>
+                <w:rFonts w:ascii="Times New Roman" w:hAnsi="Times New Roman"/>
+                <w:b w:val="0"/>
+                <w:sz w:val="12"/>
               </w:rPr>
               <w:t>158</w:t>
             </w:r>
@@ -5167,34 +5201,35 @@
         </w:tc>
         <w:tc>
           <w:tcPr>
-            <w:tcW w:type="dxa" w:w="631"/>
-            <w:vAlign w:val="center"/>
-            <w:tcMar>
-              <w:top w:w="65" w:type="dxa"/>
-              <w:start w:w="60" w:type="dxa"/>
-              <w:bottom w:w="65" w:type="dxa"/>
-              <w:end w:w="60" w:type="dxa"/>
-            </w:tcMar>
-            <w:tcBorders>
-              <w:top w:val="nil"/>
-              <w:bottom w:val="nil"/>
-              <w:start w:val="nil"/>
-              <w:end w:val="nil"/>
-              <w:insideH w:val="nil"/>
-              <w:insideV w:val="nil"/>
-            </w:tcBorders>
-          </w:tcPr>
-          <w:p>
-            <w:pPr>
-              <w:spacing w:before="0" w:after="0" w:line="240" w:lineRule="auto"/>
-              <w:jc w:val="center"/>
-            </w:pPr>
-            <w:r/>
-            <w:r>
-              <w:rPr>
-                <w:rFonts w:ascii="Times New Roman" w:hAnsi="Times New Roman"/>
-                <w:b w:val="0"/>
-                <w:sz w:val="13"/>
+            <w:tcW w:type="dxa" w:w="625"/>
+            <w:vAlign w:val="center"/>
+            <w:tcMar>
+              <w:top w:w="55" w:type="dxa"/>
+              <w:start w:w="30" w:type="dxa"/>
+              <w:bottom w:w="55" w:type="dxa"/>
+              <w:end w:w="30" w:type="dxa"/>
+            </w:tcMar>
+            <w:noWrap/>
+            <w:tcBorders>
+              <w:top w:val="nil"/>
+              <w:bottom w:val="nil"/>
+              <w:start w:val="nil"/>
+              <w:end w:val="nil"/>
+              <w:insideH w:val="nil"/>
+              <w:insideV w:val="nil"/>
+            </w:tcBorders>
+          </w:tcPr>
+          <w:p>
+            <w:pPr>
+              <w:spacing w:before="0" w:after="0" w:line="240" w:lineRule="auto"/>
+              <w:jc w:val="center"/>
+            </w:pPr>
+            <w:r/>
+            <w:r>
+              <w:rPr>
+                <w:rFonts w:ascii="Times New Roman" w:hAnsi="Times New Roman"/>
+                <w:b w:val="0"/>
+                <w:sz w:val="12"/>
               </w:rPr>
               <w:t>54</w:t>
             </w:r>
@@ -5202,34 +5237,35 @@
         </w:tc>
         <w:tc>
           <w:tcPr>
-            <w:tcW w:type="dxa" w:w="917"/>
-            <w:vAlign w:val="center"/>
-            <w:tcMar>
-              <w:top w:w="65" w:type="dxa"/>
-              <w:start w:w="60" w:type="dxa"/>
-              <w:bottom w:w="65" w:type="dxa"/>
-              <w:end w:w="60" w:type="dxa"/>
-            </w:tcMar>
-            <w:tcBorders>
-              <w:top w:val="nil"/>
-              <w:bottom w:val="nil"/>
-              <w:start w:val="nil"/>
-              <w:end w:val="nil"/>
-              <w:insideH w:val="nil"/>
-              <w:insideV w:val="nil"/>
-            </w:tcBorders>
-          </w:tcPr>
-          <w:p>
-            <w:pPr>
-              <w:spacing w:before="0" w:after="0" w:line="240" w:lineRule="auto"/>
-              <w:jc w:val="center"/>
-            </w:pPr>
-            <w:r/>
-            <w:r>
-              <w:rPr>
-                <w:rFonts w:ascii="Times New Roman" w:hAnsi="Times New Roman"/>
-                <w:b w:val="0"/>
-                <w:sz w:val="13"/>
+            <w:tcW w:type="dxa" w:w="656"/>
+            <w:vAlign w:val="center"/>
+            <w:tcMar>
+              <w:top w:w="55" w:type="dxa"/>
+              <w:start w:w="30" w:type="dxa"/>
+              <w:bottom w:w="55" w:type="dxa"/>
+              <w:end w:w="30" w:type="dxa"/>
+            </w:tcMar>
+            <w:noWrap/>
+            <w:tcBorders>
+              <w:top w:val="nil"/>
+              <w:bottom w:val="nil"/>
+              <w:start w:val="nil"/>
+              <w:end w:val="nil"/>
+              <w:insideH w:val="nil"/>
+              <w:insideV w:val="nil"/>
+            </w:tcBorders>
+          </w:tcPr>
+          <w:p>
+            <w:pPr>
+              <w:spacing w:before="0" w:after="0" w:line="240" w:lineRule="auto"/>
+              <w:jc w:val="center"/>
+            </w:pPr>
+            <w:r/>
+            <w:r>
+              <w:rPr>
+                <w:rFonts w:ascii="Times New Roman" w:hAnsi="Times New Roman"/>
+                <w:b w:val="0"/>
+                <w:sz w:val="12"/>
               </w:rPr>
               <w:t>84</w:t>
             </w:r>
@@ -5237,34 +5273,35 @@
         </w:tc>
         <w:tc>
           <w:tcPr>
-            <w:tcW w:type="dxa" w:w="570"/>
-            <w:vAlign w:val="center"/>
-            <w:tcMar>
-              <w:top w:w="65" w:type="dxa"/>
-              <w:start w:w="60" w:type="dxa"/>
-              <w:bottom w:w="65" w:type="dxa"/>
-              <w:end w:w="60" w:type="dxa"/>
-            </w:tcMar>
-            <w:tcBorders>
-              <w:top w:val="nil"/>
-              <w:bottom w:val="nil"/>
-              <w:start w:val="nil"/>
-              <w:end w:val="nil"/>
-              <w:insideH w:val="nil"/>
-              <w:insideV w:val="nil"/>
-            </w:tcBorders>
-          </w:tcPr>
-          <w:p>
-            <w:pPr>
-              <w:spacing w:before="0" w:after="0" w:line="240" w:lineRule="auto"/>
-              <w:jc w:val="center"/>
-            </w:pPr>
-            <w:r/>
-            <w:r>
-              <w:rPr>
-                <w:rFonts w:ascii="Times New Roman" w:hAnsi="Times New Roman"/>
-                <w:b w:val="0"/>
-                <w:sz w:val="13"/>
+            <w:tcW w:type="dxa" w:w="625"/>
+            <w:vAlign w:val="center"/>
+            <w:tcMar>
+              <w:top w:w="55" w:type="dxa"/>
+              <w:start w:w="30" w:type="dxa"/>
+              <w:bottom w:w="55" w:type="dxa"/>
+              <w:end w:w="30" w:type="dxa"/>
+            </w:tcMar>
+            <w:noWrap/>
+            <w:tcBorders>
+              <w:top w:val="nil"/>
+              <w:bottom w:val="nil"/>
+              <w:start w:val="nil"/>
+              <w:end w:val="nil"/>
+              <w:insideH w:val="nil"/>
+              <w:insideV w:val="nil"/>
+            </w:tcBorders>
+          </w:tcPr>
+          <w:p>
+            <w:pPr>
+              <w:spacing w:before="0" w:after="0" w:line="240" w:lineRule="auto"/>
+              <w:jc w:val="center"/>
+            </w:pPr>
+            <w:r/>
+            <w:r>
+              <w:rPr>
+                <w:rFonts w:ascii="Times New Roman" w:hAnsi="Times New Roman"/>
+                <w:b w:val="0"/>
+                <w:sz w:val="12"/>
               </w:rPr>
               <w:t>48</w:t>
             </w:r>
@@ -5272,34 +5309,35 @@
         </w:tc>
         <w:tc>
           <w:tcPr>
-            <w:tcW w:type="dxa" w:w="529"/>
-            <w:vAlign w:val="center"/>
-            <w:tcMar>
-              <w:top w:w="65" w:type="dxa"/>
-              <w:start w:w="60" w:type="dxa"/>
-              <w:bottom w:w="65" w:type="dxa"/>
-              <w:end w:w="60" w:type="dxa"/>
-            </w:tcMar>
-            <w:tcBorders>
-              <w:top w:val="nil"/>
-              <w:bottom w:val="nil"/>
-              <w:start w:val="nil"/>
-              <w:end w:val="nil"/>
-              <w:insideH w:val="nil"/>
-              <w:insideV w:val="nil"/>
-            </w:tcBorders>
-          </w:tcPr>
-          <w:p>
-            <w:pPr>
-              <w:spacing w:before="0" w:after="0" w:line="240" w:lineRule="auto"/>
-              <w:jc w:val="center"/>
-            </w:pPr>
-            <w:r/>
-            <w:r>
-              <w:rPr>
-                <w:rFonts w:ascii="Times New Roman" w:hAnsi="Times New Roman"/>
-                <w:b w:val="0"/>
-                <w:sz w:val="13"/>
+            <w:tcW w:type="dxa" w:w="625"/>
+            <w:vAlign w:val="center"/>
+            <w:tcMar>
+              <w:top w:w="55" w:type="dxa"/>
+              <w:start w:w="30" w:type="dxa"/>
+              <w:bottom w:w="55" w:type="dxa"/>
+              <w:end w:w="30" w:type="dxa"/>
+            </w:tcMar>
+            <w:noWrap/>
+            <w:tcBorders>
+              <w:top w:val="nil"/>
+              <w:bottom w:val="nil"/>
+              <w:start w:val="nil"/>
+              <w:end w:val="nil"/>
+              <w:insideH w:val="nil"/>
+              <w:insideV w:val="nil"/>
+            </w:tcBorders>
+          </w:tcPr>
+          <w:p>
+            <w:pPr>
+              <w:spacing w:before="0" w:after="0" w:line="240" w:lineRule="auto"/>
+              <w:jc w:val="center"/>
+            </w:pPr>
+            <w:r/>
+            <w:r>
+              <w:rPr>
+                <w:rFonts w:ascii="Times New Roman" w:hAnsi="Times New Roman"/>
+                <w:b w:val="0"/>
+                <w:sz w:val="12"/>
               </w:rPr>
               <w:t>40</w:t>
             </w:r>
@@ -5307,34 +5345,35 @@
         </w:tc>
         <w:tc>
           <w:tcPr>
-            <w:tcW w:type="dxa" w:w="917"/>
-            <w:vAlign w:val="center"/>
-            <w:tcMar>
-              <w:top w:w="65" w:type="dxa"/>
-              <w:start w:w="60" w:type="dxa"/>
-              <w:bottom w:w="65" w:type="dxa"/>
-              <w:end w:w="60" w:type="dxa"/>
-            </w:tcMar>
-            <w:tcBorders>
-              <w:top w:val="nil"/>
-              <w:bottom w:val="nil"/>
-              <w:start w:val="nil"/>
-              <w:end w:val="nil"/>
-              <w:insideH w:val="nil"/>
-              <w:insideV w:val="nil"/>
-            </w:tcBorders>
-          </w:tcPr>
-          <w:p>
-            <w:pPr>
-              <w:spacing w:before="0" w:after="0" w:line="240" w:lineRule="auto"/>
-              <w:jc w:val="center"/>
-            </w:pPr>
-            <w:r/>
-            <w:r>
-              <w:rPr>
-                <w:rFonts w:ascii="Times New Roman" w:hAnsi="Times New Roman"/>
-                <w:b w:val="0"/>
-                <w:sz w:val="13"/>
+            <w:tcW w:type="dxa" w:w="656"/>
+            <w:vAlign w:val="center"/>
+            <w:tcMar>
+              <w:top w:w="55" w:type="dxa"/>
+              <w:start w:w="30" w:type="dxa"/>
+              <w:bottom w:w="55" w:type="dxa"/>
+              <w:end w:w="30" w:type="dxa"/>
+            </w:tcMar>
+            <w:noWrap/>
+            <w:tcBorders>
+              <w:top w:val="nil"/>
+              <w:bottom w:val="nil"/>
+              <w:start w:val="nil"/>
+              <w:end w:val="nil"/>
+              <w:insideH w:val="nil"/>
+              <w:insideV w:val="nil"/>
+            </w:tcBorders>
+          </w:tcPr>
+          <w:p>
+            <w:pPr>
+              <w:spacing w:before="0" w:after="0" w:line="240" w:lineRule="auto"/>
+              <w:jc w:val="center"/>
+            </w:pPr>
+            <w:r/>
+            <w:r>
+              <w:rPr>
+                <w:rFonts w:ascii="Times New Roman" w:hAnsi="Times New Roman"/>
+                <w:b w:val="0"/>
+                <w:sz w:val="12"/>
               </w:rPr>
               <w:t>75</w:t>
             </w:r>
@@ -5342,34 +5381,35 @@
         </w:tc>
         <w:tc>
           <w:tcPr>
-            <w:tcW w:type="dxa" w:w="536"/>
-            <w:vAlign w:val="center"/>
-            <w:tcMar>
-              <w:top w:w="65" w:type="dxa"/>
-              <w:start w:w="60" w:type="dxa"/>
-              <w:bottom w:w="65" w:type="dxa"/>
-              <w:end w:w="60" w:type="dxa"/>
-            </w:tcMar>
-            <w:tcBorders>
-              <w:top w:val="nil"/>
-              <w:bottom w:val="nil"/>
-              <w:start w:val="nil"/>
-              <w:end w:val="nil"/>
-              <w:insideH w:val="nil"/>
-              <w:insideV w:val="nil"/>
-            </w:tcBorders>
-          </w:tcPr>
-          <w:p>
-            <w:pPr>
-              <w:spacing w:before="0" w:after="0" w:line="240" w:lineRule="auto"/>
-              <w:jc w:val="center"/>
-            </w:pPr>
-            <w:r/>
-            <w:r>
-              <w:rPr>
-                <w:rFonts w:ascii="Times New Roman" w:hAnsi="Times New Roman"/>
-                <w:b w:val="0"/>
-                <w:sz w:val="13"/>
+            <w:tcW w:type="dxa" w:w="629"/>
+            <w:vAlign w:val="center"/>
+            <w:tcMar>
+              <w:top w:w="55" w:type="dxa"/>
+              <w:start w:w="30" w:type="dxa"/>
+              <w:bottom w:w="55" w:type="dxa"/>
+              <w:end w:w="30" w:type="dxa"/>
+            </w:tcMar>
+            <w:noWrap/>
+            <w:tcBorders>
+              <w:top w:val="nil"/>
+              <w:bottom w:val="nil"/>
+              <w:start w:val="nil"/>
+              <w:end w:val="nil"/>
+              <w:insideH w:val="nil"/>
+              <w:insideV w:val="nil"/>
+            </w:tcBorders>
+          </w:tcPr>
+          <w:p>
+            <w:pPr>
+              <w:spacing w:before="0" w:after="0" w:line="240" w:lineRule="auto"/>
+              <w:jc w:val="center"/>
+            </w:pPr>
+            <w:r/>
+            <w:r>
+              <w:rPr>
+                <w:rFonts w:ascii="Times New Roman" w:hAnsi="Times New Roman"/>
+                <w:b w:val="0"/>
+                <w:sz w:val="12"/>
               </w:rPr>
               <w:t>71</w:t>
             </w:r>
@@ -5379,14 +5419,15 @@
       <w:tr>
         <w:tc>
           <w:tcPr>
-            <w:tcW w:type="dxa" w:w="968"/>
-            <w:vAlign w:val="center"/>
-            <w:tcMar>
-              <w:top w:w="65" w:type="dxa"/>
-              <w:start w:w="60" w:type="dxa"/>
-              <w:bottom w:w="65" w:type="dxa"/>
-              <w:end w:w="60" w:type="dxa"/>
-            </w:tcMar>
+            <w:tcW w:type="dxa" w:w="1025"/>
+            <w:vAlign w:val="center"/>
+            <w:tcMar>
+              <w:top w:w="55" w:type="dxa"/>
+              <w:start w:w="30" w:type="dxa"/>
+              <w:bottom w:w="55" w:type="dxa"/>
+              <w:end w:w="30" w:type="dxa"/>
+            </w:tcMar>
+            <w:noWrap/>
             <w:tcBorders>
               <w:top w:val="nil"/>
               <w:bottom w:val="single" w:sz="10" w:space="0" w:color="000000"/>
@@ -5406,7 +5447,7 @@
               <w:rPr>
                 <w:rFonts w:ascii="Times New Roman" w:hAnsi="Times New Roman"/>
                 <w:b w:val="0"/>
-                <w:sz w:val="13"/>
+                <w:sz w:val="12"/>
               </w:rPr>
               <w:t>Total</w:t>
             </w:r>
@@ -5414,14 +5455,15 @@
         </w:tc>
         <w:tc>
           <w:tcPr>
-            <w:tcW w:type="dxa" w:w="570"/>
-            <w:vAlign w:val="center"/>
-            <w:tcMar>
-              <w:top w:w="65" w:type="dxa"/>
-              <w:start w:w="60" w:type="dxa"/>
-              <w:bottom w:w="65" w:type="dxa"/>
-              <w:end w:w="60" w:type="dxa"/>
-            </w:tcMar>
+            <w:tcW w:type="dxa" w:w="707"/>
+            <w:vAlign w:val="center"/>
+            <w:tcMar>
+              <w:top w:w="55" w:type="dxa"/>
+              <w:start w:w="30" w:type="dxa"/>
+              <w:bottom w:w="55" w:type="dxa"/>
+              <w:end w:w="30" w:type="dxa"/>
+            </w:tcMar>
+            <w:noWrap/>
             <w:tcBorders>
               <w:top w:val="nil"/>
               <w:bottom w:val="single" w:sz="10" w:space="0" w:color="000000"/>
@@ -5441,22 +5483,23 @@
               <w:rPr>
                 <w:rFonts w:ascii="Times New Roman" w:hAnsi="Times New Roman"/>
                 <w:b w:val="0"/>
-                <w:sz w:val="13"/>
-              </w:rPr>
-              <w:t>1,849</w:t>
-            </w:r>
-          </w:p>
-        </w:tc>
-        <w:tc>
-          <w:tcPr>
-            <w:tcW w:type="dxa" w:w="529"/>
-            <w:vAlign w:val="center"/>
-            <w:tcMar>
-              <w:top w:w="65" w:type="dxa"/>
-              <w:start w:w="60" w:type="dxa"/>
-              <w:bottom w:w="65" w:type="dxa"/>
-              <w:end w:w="60" w:type="dxa"/>
-            </w:tcMar>
+                <w:sz w:val="12"/>
+              </w:rPr>
+              <w:t>1849</w:t>
+            </w:r>
+          </w:p>
+        </w:tc>
+        <w:tc>
+          <w:tcPr>
+            <w:tcW w:type="dxa" w:w="635"/>
+            <w:vAlign w:val="center"/>
+            <w:tcMar>
+              <w:top w:w="55" w:type="dxa"/>
+              <w:start w:w="30" w:type="dxa"/>
+              <w:bottom w:w="55" w:type="dxa"/>
+              <w:end w:w="30" w:type="dxa"/>
+            </w:tcMar>
+            <w:noWrap/>
             <w:tcBorders>
               <w:top w:val="nil"/>
               <w:bottom w:val="single" w:sz="10" w:space="0" w:color="000000"/>
@@ -5476,7 +5519,7 @@
               <w:rPr>
                 <w:rFonts w:ascii="Times New Roman" w:hAnsi="Times New Roman"/>
                 <w:b w:val="0"/>
-                <w:sz w:val="13"/>
+                <w:sz w:val="12"/>
               </w:rPr>
               <w:t>332</w:t>
             </w:r>
@@ -5484,14 +5527,15 @@
         </w:tc>
         <w:tc>
           <w:tcPr>
-            <w:tcW w:type="dxa" w:w="733"/>
-            <w:vAlign w:val="center"/>
-            <w:tcMar>
-              <w:top w:w="65" w:type="dxa"/>
-              <w:start w:w="60" w:type="dxa"/>
-              <w:bottom w:w="65" w:type="dxa"/>
-              <w:end w:w="60" w:type="dxa"/>
-            </w:tcMar>
+            <w:tcW w:type="dxa" w:w="717"/>
+            <w:vAlign w:val="center"/>
+            <w:tcMar>
+              <w:top w:w="55" w:type="dxa"/>
+              <w:start w:w="30" w:type="dxa"/>
+              <w:bottom w:w="55" w:type="dxa"/>
+              <w:end w:w="30" w:type="dxa"/>
+            </w:tcMar>
+            <w:noWrap/>
             <w:tcBorders>
               <w:top w:val="nil"/>
               <w:bottom w:val="single" w:sz="10" w:space="0" w:color="000000"/>
@@ -5511,22 +5555,23 @@
               <w:rPr>
                 <w:rFonts w:ascii="Times New Roman" w:hAnsi="Times New Roman"/>
                 <w:b w:val="0"/>
-                <w:sz w:val="13"/>
-              </w:rPr>
-              <w:t>1,517</w:t>
-            </w:r>
-          </w:p>
-        </w:tc>
-        <w:tc>
-          <w:tcPr>
-            <w:tcW w:type="dxa" w:w="631"/>
-            <w:vAlign w:val="center"/>
-            <w:tcMar>
-              <w:top w:w="65" w:type="dxa"/>
-              <w:start w:w="60" w:type="dxa"/>
-              <w:bottom w:w="65" w:type="dxa"/>
-              <w:end w:w="60" w:type="dxa"/>
-            </w:tcMar>
+                <w:sz w:val="12"/>
+              </w:rPr>
+              <w:t>1517</w:t>
+            </w:r>
+          </w:p>
+        </w:tc>
+        <w:tc>
+          <w:tcPr>
+            <w:tcW w:type="dxa" w:w="625"/>
+            <w:vAlign w:val="center"/>
+            <w:tcMar>
+              <w:top w:w="55" w:type="dxa"/>
+              <w:start w:w="30" w:type="dxa"/>
+              <w:bottom w:w="55" w:type="dxa"/>
+              <w:end w:w="30" w:type="dxa"/>
+            </w:tcMar>
+            <w:noWrap/>
             <w:tcBorders>
               <w:top w:val="nil"/>
               <w:bottom w:val="single" w:sz="10" w:space="0" w:color="000000"/>
@@ -5546,7 +5591,7 @@
               <w:rPr>
                 <w:rFonts w:ascii="Times New Roman" w:hAnsi="Times New Roman"/>
                 <w:b w:val="0"/>
-                <w:sz w:val="13"/>
+                <w:sz w:val="12"/>
               </w:rPr>
               <w:t>529</w:t>
             </w:r>
@@ -5554,14 +5599,15 @@
         </w:tc>
         <w:tc>
           <w:tcPr>
-            <w:tcW w:type="dxa" w:w="917"/>
-            <w:vAlign w:val="center"/>
-            <w:tcMar>
-              <w:top w:w="65" w:type="dxa"/>
-              <w:start w:w="60" w:type="dxa"/>
-              <w:bottom w:w="65" w:type="dxa"/>
-              <w:end w:w="60" w:type="dxa"/>
-            </w:tcMar>
+            <w:tcW w:type="dxa" w:w="656"/>
+            <w:vAlign w:val="center"/>
+            <w:tcMar>
+              <w:top w:w="55" w:type="dxa"/>
+              <w:start w:w="30" w:type="dxa"/>
+              <w:bottom w:w="55" w:type="dxa"/>
+              <w:end w:w="30" w:type="dxa"/>
+            </w:tcMar>
+            <w:noWrap/>
             <w:tcBorders>
               <w:top w:val="nil"/>
               <w:bottom w:val="single" w:sz="10" w:space="0" w:color="000000"/>
@@ -5581,7 +5627,7 @@
               <w:rPr>
                 <w:rFonts w:ascii="Times New Roman" w:hAnsi="Times New Roman"/>
                 <w:b w:val="0"/>
-                <w:sz w:val="13"/>
+                <w:sz w:val="12"/>
               </w:rPr>
               <w:t>772</w:t>
             </w:r>
@@ -5589,14 +5635,15 @@
         </w:tc>
         <w:tc>
           <w:tcPr>
-            <w:tcW w:type="dxa" w:w="570"/>
-            <w:vAlign w:val="center"/>
-            <w:tcMar>
-              <w:top w:w="65" w:type="dxa"/>
-              <w:start w:w="60" w:type="dxa"/>
-              <w:bottom w:w="65" w:type="dxa"/>
-              <w:end w:w="60" w:type="dxa"/>
-            </w:tcMar>
+            <w:tcW w:type="dxa" w:w="625"/>
+            <w:vAlign w:val="center"/>
+            <w:tcMar>
+              <w:top w:w="55" w:type="dxa"/>
+              <w:start w:w="30" w:type="dxa"/>
+              <w:bottom w:w="55" w:type="dxa"/>
+              <w:end w:w="30" w:type="dxa"/>
+            </w:tcMar>
+            <w:noWrap/>
             <w:tcBorders>
               <w:top w:val="nil"/>
               <w:bottom w:val="single" w:sz="10" w:space="0" w:color="000000"/>
@@ -5616,7 +5663,7 @@
               <w:rPr>
                 <w:rFonts w:ascii="Times New Roman" w:hAnsi="Times New Roman"/>
                 <w:b w:val="0"/>
-                <w:sz w:val="13"/>
+                <w:sz w:val="12"/>
               </w:rPr>
               <w:t>548</w:t>
             </w:r>
@@ -5624,14 +5671,15 @@
         </w:tc>
         <w:tc>
           <w:tcPr>
-            <w:tcW w:type="dxa" w:w="529"/>
-            <w:vAlign w:val="center"/>
-            <w:tcMar>
-              <w:top w:w="65" w:type="dxa"/>
-              <w:start w:w="60" w:type="dxa"/>
-              <w:bottom w:w="65" w:type="dxa"/>
-              <w:end w:w="60" w:type="dxa"/>
-            </w:tcMar>
+            <w:tcW w:type="dxa" w:w="625"/>
+            <w:vAlign w:val="center"/>
+            <w:tcMar>
+              <w:top w:w="55" w:type="dxa"/>
+              <w:start w:w="30" w:type="dxa"/>
+              <w:bottom w:w="55" w:type="dxa"/>
+              <w:end w:w="30" w:type="dxa"/>
+            </w:tcMar>
+            <w:noWrap/>
             <w:tcBorders>
               <w:top w:val="nil"/>
               <w:bottom w:val="single" w:sz="10" w:space="0" w:color="000000"/>
@@ -5651,7 +5699,7 @@
               <w:rPr>
                 <w:rFonts w:ascii="Times New Roman" w:hAnsi="Times New Roman"/>
                 <w:b w:val="0"/>
-                <w:sz w:val="13"/>
+                <w:sz w:val="12"/>
               </w:rPr>
               <w:t>370</w:t>
             </w:r>
@@ -5659,14 +5707,15 @@
         </w:tc>
         <w:tc>
           <w:tcPr>
-            <w:tcW w:type="dxa" w:w="917"/>
-            <w:vAlign w:val="center"/>
-            <w:tcMar>
-              <w:top w:w="65" w:type="dxa"/>
-              <w:start w:w="60" w:type="dxa"/>
-              <w:bottom w:w="65" w:type="dxa"/>
-              <w:end w:w="60" w:type="dxa"/>
-            </w:tcMar>
+            <w:tcW w:type="dxa" w:w="656"/>
+            <w:vAlign w:val="center"/>
+            <w:tcMar>
+              <w:top w:w="55" w:type="dxa"/>
+              <w:start w:w="30" w:type="dxa"/>
+              <w:bottom w:w="55" w:type="dxa"/>
+              <w:end w:w="30" w:type="dxa"/>
+            </w:tcMar>
+            <w:noWrap/>
             <w:tcBorders>
               <w:top w:val="nil"/>
               <w:bottom w:val="single" w:sz="10" w:space="0" w:color="000000"/>
@@ -5686,7 +5735,7 @@
               <w:rPr>
                 <w:rFonts w:ascii="Times New Roman" w:hAnsi="Times New Roman"/>
                 <w:b w:val="0"/>
-                <w:sz w:val="13"/>
+                <w:sz w:val="12"/>
               </w:rPr>
               <w:t>711</w:t>
             </w:r>
@@ -5694,14 +5743,15 @@
         </w:tc>
         <w:tc>
           <w:tcPr>
-            <w:tcW w:type="dxa" w:w="536"/>
-            <w:vAlign w:val="center"/>
-            <w:tcMar>
-              <w:top w:w="65" w:type="dxa"/>
-              <w:start w:w="60" w:type="dxa"/>
-              <w:bottom w:w="65" w:type="dxa"/>
-              <w:end w:w="60" w:type="dxa"/>
-            </w:tcMar>
+            <w:tcW w:type="dxa" w:w="629"/>
+            <w:vAlign w:val="center"/>
+            <w:tcMar>
+              <w:top w:w="55" w:type="dxa"/>
+              <w:start w:w="30" w:type="dxa"/>
+              <w:bottom w:w="55" w:type="dxa"/>
+              <w:end w:w="30" w:type="dxa"/>
+            </w:tcMar>
+            <w:noWrap/>
             <w:tcBorders>
               <w:top w:val="nil"/>
               <w:bottom w:val="single" w:sz="10" w:space="0" w:color="000000"/>
@@ -5721,7 +5771,7 @@
               <w:rPr>
                 <w:rFonts w:ascii="Times New Roman" w:hAnsi="Times New Roman"/>
                 <w:b w:val="0"/>
-                <w:sz w:val="13"/>
+                <w:sz w:val="12"/>
               </w:rPr>
               <w:t>768</w:t>
             </w:r>
@@ -5747,7 +5797,7 @@
           <w:rFonts w:ascii="Times New Roman" w:hAnsi="Times New Roman"/>
           <w:sz w:val="16"/>
         </w:rPr>
-        <w:t>Mis. = misinformation; Supp. = supportive stance; Opp. = opposing or hesitant stance; Pos./Neg. = positive/negative sentiment. Seven samples were dropped before modeling because word segmentation removed malformed or empty rows.</w:t>
+        <w:t>Mis. = misinformation; Corr. = correct/not misleading; Sup. = supportive stance; Neu-S = neutral stance; Opp. = opposing or hesitant stance; Neu-E = neutral sentiment; Pos./Neg. = positive/negative sentiment. Seven samples were dropped before modeling because word segmentation removed malformed or empty rows.</w:t>
       </w:r>
     </w:p>
     <w:p>

</xml_diff>

<commit_message>
Add LNCS running headers to FISAT Word paper
</commit_message>
<xml_diff>
--- a/submission_fisat/VaccineNLP_FISAT_FINAL_CONTACT_UPDATED.docx
+++ b/submission_fisat/VaccineNLP_FISAT_FINAL_CONTACT_UPDATED.docx
@@ -17546,8 +17546,9 @@
     <w:sectPr>
       <w:headerReference w:type="even" r:id="rId11"/>
       <w:headerReference w:type="default" r:id="rId12"/>
+      <w:headerReference w:type="first" r:id="rId15"/>
       <w:pgSz w:w="11906" w:h="16838" w:code="9"/>
-      <w:pgMar w:top="2948" w:right="2494" w:bottom="2948" w:left="2494" w:header="2381" w:footer="2324" w:gutter="0"/>
+      <w:pgMar w:top="2948" w:right="2494" w:bottom="2948" w:left="2494" w:header="709" w:footer="2324" w:gutter="0"/>
       <w:cols w:space="227"/>
       <w:titlePg/>
       <w:docGrid w:linePitch="240"/>
@@ -17604,25 +17605,55 @@
 <w:hdr xmlns:wpc="http://schemas.microsoft.com/office/word/2010/wordprocessingCanvas" xmlns:mc="http://schemas.openxmlformats.org/markup-compatibility/2006" xmlns:o="urn:schemas-microsoft-com:office:office" xmlns:r="http://schemas.openxmlformats.org/officeDocument/2006/relationships" xmlns:m="http://schemas.openxmlformats.org/officeDocument/2006/math" xmlns:v="urn:schemas-microsoft-com:vml" xmlns:wp14="http://schemas.microsoft.com/office/word/2010/wordprocessingDrawing" xmlns:wp="http://schemas.openxmlformats.org/drawingml/2006/wordprocessingDrawing" xmlns:w10="urn:schemas-microsoft-com:office:word" xmlns:w="http://schemas.openxmlformats.org/wordprocessingml/2006/main" xmlns:w14="http://schemas.microsoft.com/office/word/2010/wordml" xmlns:wpg="http://schemas.microsoft.com/office/word/2010/wordprocessingGroup" xmlns:wpi="http://schemas.microsoft.com/office/word/2010/wordprocessingInk" xmlns:wne="http://schemas.microsoft.com/office/word/2006/wordml" xmlns:wps="http://schemas.microsoft.com/office/word/2010/wordprocessingShape" mc:Ignorable="w14 wp14">
   <w:p>
     <w:pPr>
-      <w:pStyle w:val="header"/>
+      <w:tabs>
+        <w:tab w:pos="6918" w:val="right"/>
+      </w:tabs>
+      <w:spacing w:before="0" w:after="0" w:line="240" w:lineRule="auto"/>
     </w:pPr>
     <w:r>
+      <w:rPr>
+        <w:rFonts w:ascii="Times New Roman" w:hAnsi="Times New Roman"/>
+        <w:sz w:val="16"/>
+      </w:rPr>
       <w:fldChar w:fldCharType="begin"/>
     </w:r>
     <w:r>
-      <w:instrText>PAGE   \* MERGEFORMAT</w:instrText>
+      <w:rPr>
+        <w:rFonts w:ascii="Times New Roman" w:hAnsi="Times New Roman"/>
+        <w:sz w:val="16"/>
+      </w:rPr>
+      <w:instrText xml:space="preserve"> PAGE </w:instrText>
     </w:r>
     <w:r>
+      <w:rPr>
+        <w:rFonts w:ascii="Times New Roman" w:hAnsi="Times New Roman"/>
+        <w:sz w:val="16"/>
+      </w:rPr>
       <w:fldChar w:fldCharType="separate"/>
     </w:r>
     <w:r>
       <w:rPr>
-        <w:noProof/>
+        <w:rFonts w:ascii="Times New Roman" w:hAnsi="Times New Roman"/>
+        <w:sz w:val="16"/>
       </w:rPr>
-      <w:t>2</w:t>
+      <w:t>1</w:t>
     </w:r>
     <w:r>
+      <w:rPr>
+        <w:rFonts w:ascii="Times New Roman" w:hAnsi="Times New Roman"/>
+        <w:sz w:val="16"/>
+      </w:rPr>
       <w:fldChar w:fldCharType="end"/>
+    </w:r>
+    <w:r>
+      <w:tab/>
+    </w:r>
+    <w:r>
+      <w:rPr>
+        <w:rFonts w:ascii="Times New Roman" w:hAnsi="Times New Roman"/>
+        <w:sz w:val="16"/>
+      </w:rPr>
+      <w:t>M. H. Kim et al.</w:t>
     </w:r>
   </w:p>
 </w:hdr>
@@ -17632,29 +17663,62 @@
 <w:hdr xmlns:wpc="http://schemas.microsoft.com/office/word/2010/wordprocessingCanvas" xmlns:mc="http://schemas.openxmlformats.org/markup-compatibility/2006" xmlns:o="urn:schemas-microsoft-com:office:office" xmlns:r="http://schemas.openxmlformats.org/officeDocument/2006/relationships" xmlns:m="http://schemas.openxmlformats.org/officeDocument/2006/math" xmlns:v="urn:schemas-microsoft-com:vml" xmlns:wp14="http://schemas.microsoft.com/office/word/2010/wordprocessingDrawing" xmlns:wp="http://schemas.openxmlformats.org/drawingml/2006/wordprocessingDrawing" xmlns:w10="urn:schemas-microsoft-com:office:word" xmlns:w="http://schemas.openxmlformats.org/wordprocessingml/2006/main" xmlns:w14="http://schemas.microsoft.com/office/word/2010/wordml" xmlns:wpg="http://schemas.microsoft.com/office/word/2010/wordprocessingGroup" xmlns:wpi="http://schemas.microsoft.com/office/word/2010/wordprocessingInk" xmlns:wne="http://schemas.microsoft.com/office/word/2006/wordml" xmlns:wps="http://schemas.microsoft.com/office/word/2010/wordprocessingShape" mc:Ignorable="w14 wp14">
   <w:p>
     <w:pPr>
-      <w:pStyle w:val="header"/>
-      <w:jc w:val="right"/>
+      <w:tabs>
+        <w:tab w:pos="6918" w:val="right"/>
+      </w:tabs>
+      <w:spacing w:before="0" w:after="0" w:line="240" w:lineRule="auto"/>
     </w:pPr>
     <w:r>
+      <w:rPr>
+        <w:rFonts w:ascii="Times New Roman" w:hAnsi="Times New Roman"/>
+        <w:sz w:val="16"/>
+      </w:rPr>
+      <w:t>VaccineNLP: HITL Multi-Task Misinformation Surveillance</w:t>
+    </w:r>
+    <w:r>
+      <w:tab/>
+    </w:r>
+    <w:r>
+      <w:rPr>
+        <w:rFonts w:ascii="Times New Roman" w:hAnsi="Times New Roman"/>
+        <w:sz w:val="16"/>
+      </w:rPr>
       <w:fldChar w:fldCharType="begin"/>
     </w:r>
     <w:r>
-      <w:instrText>PAGE   \* MERGEFORMAT</w:instrText>
+      <w:rPr>
+        <w:rFonts w:ascii="Times New Roman" w:hAnsi="Times New Roman"/>
+        <w:sz w:val="16"/>
+      </w:rPr>
+      <w:instrText xml:space="preserve"> PAGE </w:instrText>
     </w:r>
     <w:r>
+      <w:rPr>
+        <w:rFonts w:ascii="Times New Roman" w:hAnsi="Times New Roman"/>
+        <w:sz w:val="16"/>
+      </w:rPr>
       <w:fldChar w:fldCharType="separate"/>
     </w:r>
     <w:r>
       <w:rPr>
-        <w:noProof/>
+        <w:rFonts w:ascii="Times New Roman" w:hAnsi="Times New Roman"/>
+        <w:sz w:val="16"/>
       </w:rPr>
-      <w:t>3</w:t>
+      <w:t>1</w:t>
     </w:r>
     <w:r>
+      <w:rPr>
+        <w:rFonts w:ascii="Times New Roman" w:hAnsi="Times New Roman"/>
+        <w:sz w:val="16"/>
+      </w:rPr>
       <w:fldChar w:fldCharType="end"/>
     </w:r>
   </w:p>
 </w:hdr>
+</file>
+
+<file path=word/header3.xml><?xml version="1.0" encoding="utf-8"?>
+<w:hdr xmlns:m="http://schemas.openxmlformats.org/officeDocument/2006/math" xmlns:mc="http://schemas.openxmlformats.org/markup-compatibility/2006" xmlns:mo="http://schemas.microsoft.com/office/mac/office/2008/main" xmlns:mv="urn:schemas-microsoft-com:mac:vml" xmlns:o="urn:schemas-microsoft-com:office:office" xmlns:r="http://schemas.openxmlformats.org/officeDocument/2006/relationships" xmlns:v="urn:schemas-microsoft-com:vml" xmlns:w10="urn:schemas-microsoft-com:office:word" xmlns:w14="http://schemas.microsoft.com/office/word/2010/wordml" xmlns:w="http://schemas.openxmlformats.org/wordprocessingml/2006/main" xmlns:wne="http://schemas.microsoft.com/office/word/2006/wordml" xmlns:wp14="http://schemas.microsoft.com/office/word/2010/wordprocessingDrawing" xmlns:wp="http://schemas.openxmlformats.org/drawingml/2006/wordprocessingDrawing" xmlns:wpc="http://schemas.microsoft.com/office/word/2010/wordprocessingCanvas" xmlns:wpg="http://schemas.microsoft.com/office/word/2010/wordprocessingGroup" xmlns:wpi="http://schemas.microsoft.com/office/word/2010/wordprocessingInk" xmlns:wps="http://schemas.microsoft.com/office/word/2010/wordprocessingShape" mc:Ignorable="w14 wp14"/>
 </file>
 
 <file path=word/numbering.xml><?xml version="1.0" encoding="utf-8"?>

</xml_diff>

<commit_message>
Match LNCS page header layout
</commit_message>
<xml_diff>
--- a/submission_fisat/VaccineNLP_FISAT_FINAL_CONTACT_UPDATED.docx
+++ b/submission_fisat/VaccineNLP_FISAT_FINAL_CONTACT_UPDATED.docx
@@ -17606,13 +17606,14 @@
   <w:p>
     <w:pPr>
       <w:tabs>
-        <w:tab w:pos="6918" w:val="right"/>
+        <w:tab w:pos="397" w:val="left"/>
       </w:tabs>
       <w:spacing w:before="0" w:after="0" w:line="240" w:lineRule="auto"/>
     </w:pPr>
     <w:r>
       <w:rPr>
         <w:rFonts w:ascii="Times New Roman" w:hAnsi="Times New Roman"/>
+        <w:b/>
         <w:sz w:val="16"/>
       </w:rPr>
       <w:fldChar w:fldCharType="begin"/>
@@ -17620,6 +17621,7 @@
     <w:r>
       <w:rPr>
         <w:rFonts w:ascii="Times New Roman" w:hAnsi="Times New Roman"/>
+        <w:b/>
         <w:sz w:val="16"/>
       </w:rPr>
       <w:instrText xml:space="preserve"> PAGE </w:instrText>
@@ -17627,6 +17629,7 @@
     <w:r>
       <w:rPr>
         <w:rFonts w:ascii="Times New Roman" w:hAnsi="Times New Roman"/>
+        <w:b/>
         <w:sz w:val="16"/>
       </w:rPr>
       <w:fldChar w:fldCharType="separate"/>
@@ -17634,6 +17637,7 @@
     <w:r>
       <w:rPr>
         <w:rFonts w:ascii="Times New Roman" w:hAnsi="Times New Roman"/>
+        <w:b/>
         <w:sz w:val="16"/>
       </w:rPr>
       <w:t>1</w:t>
@@ -17641,6 +17645,7 @@
     <w:r>
       <w:rPr>
         <w:rFonts w:ascii="Times New Roman" w:hAnsi="Times New Roman"/>
+        <w:b/>
         <w:sz w:val="16"/>
       </w:rPr>
       <w:fldChar w:fldCharType="end"/>
@@ -17651,9 +17656,10 @@
     <w:r>
       <w:rPr>
         <w:rFonts w:ascii="Times New Roman" w:hAnsi="Times New Roman"/>
+        <w:b/>
         <w:sz w:val="16"/>
       </w:rPr>
-      <w:t>M. H. Kim et al.</w:t>
+      <w:t>Manh Hung Kim et al.</w:t>
     </w:r>
   </w:p>
 </w:hdr>
@@ -17671,6 +17677,7 @@
     <w:r>
       <w:rPr>
         <w:rFonts w:ascii="Times New Roman" w:hAnsi="Times New Roman"/>
+        <w:b/>
         <w:sz w:val="16"/>
       </w:rPr>
       <w:t>VaccineNLP: HITL Multi-Task Misinformation Surveillance</w:t>
@@ -17681,6 +17688,7 @@
     <w:r>
       <w:rPr>
         <w:rFonts w:ascii="Times New Roman" w:hAnsi="Times New Roman"/>
+        <w:b/>
         <w:sz w:val="16"/>
       </w:rPr>
       <w:fldChar w:fldCharType="begin"/>
@@ -17688,6 +17696,7 @@
     <w:r>
       <w:rPr>
         <w:rFonts w:ascii="Times New Roman" w:hAnsi="Times New Roman"/>
+        <w:b/>
         <w:sz w:val="16"/>
       </w:rPr>
       <w:instrText xml:space="preserve"> PAGE </w:instrText>
@@ -17695,6 +17704,7 @@
     <w:r>
       <w:rPr>
         <w:rFonts w:ascii="Times New Roman" w:hAnsi="Times New Roman"/>
+        <w:b/>
         <w:sz w:val="16"/>
       </w:rPr>
       <w:fldChar w:fldCharType="separate"/>
@@ -17702,6 +17712,7 @@
     <w:r>
       <w:rPr>
         <w:rFonts w:ascii="Times New Roman" w:hAnsi="Times New Roman"/>
+        <w:b/>
         <w:sz w:val="16"/>
       </w:rPr>
       <w:t>1</w:t>
@@ -17709,6 +17720,7 @@
     <w:r>
       <w:rPr>
         <w:rFonts w:ascii="Times New Roman" w:hAnsi="Times New Roman"/>
+        <w:b/>
         <w:sz w:val="16"/>
       </w:rPr>
       <w:fldChar w:fldCharType="end"/>

</xml_diff>

<commit_message>
Polish VaccineNLP paper and presentation
</commit_message>
<xml_diff>
--- a/submission_fisat/VaccineNLP_FISAT_FINAL_CONTACT_UPDATED.docx
+++ b/submission_fisat/VaccineNLP_FISAT_FINAL_CONTACT_UPDATED.docx
@@ -7,7 +7,7 @@
         <w:pStyle w:val="papertitle"/>
       </w:pPr>
       <w:r>
-        <w:t>VaccineNLP: A Human-in-the-Loop Explainable Multi-Task NLP Framework for Vietnamese Vaccine Misinformation Surveillance</w:t>
+        <w:t>VaccineNLP: An Explainable Human-in-the-Loop Multi-Task NLP Framework for Vietnamese Vaccine Misinformation Surveillance</w:t>
       </w:r>
     </w:p>
     <w:p>
@@ -84,7 +84,7 @@
         <w:pStyle w:val="abstract"/>
       </w:pPr>
       <w:r>
-        <w:t>Abstract. Vaccine misinformation has become a public-health informatics challenge in Vietnamese digital environments, where social media posts, online comments, and informal vaccine narratives can shape vaccine confidence. This paper presents VaccineNLP, a human-in-the-loop and explainable multi-task natural language processing framework for Vietnamese vaccine misinformation surveillance. We collected 1,856 Vietnamese vaccine-related texts from Facebook, YouTube, online news, Reddit, and public forums during 2020--2026, then applied an eight-step Vietnamese preprocessing pipeline and a three-axis annotation schema covering misinformation, stance, and sentiment. A 186-sample expert-validated Gold Test Set was used to compare XLM-RoBERTa, PhoBERT-v2 multi-task learning, and a Gemma-4 4B QLoRA reasoning model. PhoBERT-v2 achieved the highest average Macro F1 (0.6967), while XLM-RoBERTa obtained the best misinformation Macro F1 (0.7038) and Gemma-4 4B obtained the best sentiment Macro F1 (0.7700). Temperature Scaling reduced Expected Calibration Error by 44--56% across the three axes. However, agreement between the LLM annotator and expert labels was very low for misinformation (Cohen's kappa = 0.0525), indicating that LLMs should support, not replace, expert medical fact-checking. Statistical tests further showed that anti-vaccine stance and negative sentiment were strongly associated with misinformation risk. The results support a cautious trustworthy-AI design for Vietnamese infodemic monitoring.</w:t>
+        <w:t>Abstract. Vaccine misinformation has become a public-health informatics challenge in Vietnamese digital environments, where social media posts, online comments, and informal vaccine narratives can shape vaccine confidence. This paper presents VaccineNLP, an explainable human-in-the-loop multi-task natural language processing framework for Vietnamese vaccine misinformation surveillance. We collected 1,856 Vietnamese vaccine-related texts from Facebook, YouTube, online news, Reddit, and public forums during 2020--2026, then applied an eight-step Vietnamese preprocessing pipeline and a three-axis annotation schema covering misinformation, stance, and sentiment. A 186-sample expert-validated Gold Test Set was used to compare XLM-RoBERTa, PhoBERT-v2 multi-task learning, and a Gemma-4 4B QLoRA reasoning model. PhoBERT-v2 achieved the highest average Macro F1 (0.6967), while XLM-RoBERTa obtained the best misinformation Macro F1 (0.7038) and Gemma-4 4B obtained the best sentiment Macro F1 (0.7700). Temperature Scaling reduced Expected Calibration Error by 44--56% across the three axes. However, agreement between the LLM annotator and expert labels was very low for misinformation (Cohen's kappa = 0.0525), indicating that LLMs should support, not replace, expert medical fact-checking. Statistical tests further showed that anti-vaccine stance and negative sentiment were strongly associated with misinformation risk. The results support a cautious trustworthy-AI design for Vietnamese infodemic monitoring.</w:t>
       </w:r>
     </w:p>
     <w:p>
@@ -131,8 +131,19 @@
       </w:r>
     </w:p>
     <w:p>
-      <w:r>
-        <w:t>This paper contributes an applied intelligent-system study for the FISAT/Springer proceedings scope, at the intersection of natural language processing, trustworthy AI, health informatics, and social media analytics. Consistent with the original study protocol, the paper addresses two aims: (i) to build and evaluate Vietnamese NLP models for vaccine-related misinformation, stance, and sentiment classification; and (ii) to assess the usefulness and limitations of LLM support for medical text annotation and explanation. The contribution is fourfold: an expert-validated Vietnamese Gold Test Set for vaccine-related misinformation, stance, and sentiment; a comparative evaluation of XLM-RoBERTa, PhoBERT-v2, and Gemma-4 4B on the same test set; confidence calibration analysis for trustworthy deployment; and empirical evidence that LLM-based annotation remains insufficient as a replacement for expert medical fact-checking.</w:t>
+      <w:pPr>
+        <w:pStyle w:val="heading2"/>
+      </w:pPr>
+      <w:r>
+        <w:t>Research Contributions</w:t>
+      </w:r>
+    </w:p>
+    <w:p>
+      <w:pPr>
+        <w:pStyle w:val="p1a"/>
+      </w:pPr>
+      <w:r>
+        <w:t>This paper contributes an applied intelligent-system study for the FISAT/Springer proceedings scope, at the intersection of natural language processing, trustworthy AI, health informatics, and social media analytics. Consistent with the original study protocol, the paper addresses two aims: (i) to build and evaluate Vietnamese NLP models for vaccine-related misinformation, stance, and sentiment classification; and (ii) to assess the usefulness and limitations of LLM support for medical text annotation and explanation. To make the research contribution explicit, the paper reports four concrete outputs: C1, an expert-validated Vietnamese Gold Test Set for vaccine-related misinformation, stance, and sentiment; C2, a controlled benchmark of XLM-RoBERTa, PhoBERT-v2, and Gemma-4 4B on the same evaluation split; C3, a confidence-calibrated explainable HITL workflow for trustworthy public-health deployment; and C4, empirical evidence that LLM-based annotation remains insufficient as a replacement for expert medical fact-checking.</w:t>
       </w:r>
     </w:p>
     <w:p>
@@ -140,6 +151,7 @@
         <w:pStyle w:val="heading1"/>
       </w:pPr>
       <w:r>
+        <w:lastRenderedPageBreak/>
         <w:t>Related Work and Research Gap</w:t>
       </w:r>
     </w:p>
@@ -148,11 +160,7 @@
         <w:pStyle w:val="p1a"/>
       </w:pPr>
       <w:r>
-        <w:t xml:space="preserve">Research on vaccine misinformation detection has progressed rapidly in English, including specialized datasets such as ANTi-Vax, where fine-tuned transformer models can reach high scores under in-domain conditions [5]. Susceptibility to COVID-19 </w:t>
-      </w:r>
-      <w:r>
-        <w:lastRenderedPageBreak/>
-        <w:t>misinformation is also shaped by social-media exposure and analytic reasoning [6]. However, direct transfer to Vietnamese vaccine discourse is limited by language shift, platform shift, and annotation-policy differences. Existing Vietnamese fake-news resources are useful but are generally small or not specific to vaccine and public-health communication.</w:t>
+        <w:t>Research on vaccine misinformation detection has progressed rapidly in English, including specialized datasets such as ANTi-Vax, where fine-tuned transformer models can reach high scores under in-domain conditions [5]. Susceptibility to COVID-19 misinformation is also shaped by social-media exposure and analytic reasoning [6]. However, direct transfer to Vietnamese vaccine discourse is limited by language shift, platform shift, and annotation-policy differences. Existing Vietnamese fake-news resources are useful but are generally small or not specific to vaccine and public-health communication.</w:t>
       </w:r>
     </w:p>
     <w:p>
@@ -167,7 +175,7 @@
     </w:p>
     <w:p>
       <w:r>
-        <w:t>Table 1 positions the proposed study against related work. The table is not intended as a leaderboard because reported scores in the literature come from different languages, platforms, annotation policies, and class distributions. Instead, it clarifies the research gap addressed by VaccineNLP: Vietnamese vaccine misinformation has not been evaluated as a combined misinformation-stance-sentiment problem with expert validation, calibration, and operational XAI in one pipeline.</w:t>
+        <w:t>Table 1 positions the proposed study against related work. The table is intentionally presented as a research-positioning comparison, not as a direct leaderboard, because reported scores in the literature come from different languages, platforms, annotation policies, and class distributions. Instead, it clarifies the research gap addressed by VaccineNLP: Vietnamese vaccine misinformation has not been evaluated as a combined misinformation-stance-sentiment problem with expert validation, calibration, and operational XAI in one pipeline.</w:t>
       </w:r>
     </w:p>
     <w:p>
@@ -185,7 +193,7 @@
         <w:rPr>
           <w:i/>
         </w:rPr>
-        <w:t>Positioning of VaccineNLP against related misinformation and vaccine NLP studies.</w:t>
+        <w:t>Research-positioning comparison of VaccineNLP against related misinformation and vaccine NLP studies.</w:t>
       </w:r>
     </w:p>
     <w:tbl>
@@ -228,7 +236,7 @@
             <w:pPr>
               <w:spacing w:line="240" w:lineRule="auto"/>
               <w:ind w:firstLine="0"/>
-              <w:jc w:val="center"/>
+              <w:jc w:val="left"/>
             </w:pPr>
             <w:r>
               <w:rPr>
@@ -260,7 +268,7 @@
             <w:pPr>
               <w:spacing w:line="240" w:lineRule="auto"/>
               <w:ind w:firstLine="0"/>
-              <w:jc w:val="center"/>
+              <w:jc w:val="left"/>
             </w:pPr>
             <w:r>
               <w:rPr>
@@ -292,7 +300,7 @@
             <w:pPr>
               <w:spacing w:line="240" w:lineRule="auto"/>
               <w:ind w:firstLine="0"/>
-              <w:jc w:val="center"/>
+              <w:jc w:val="left"/>
             </w:pPr>
             <w:r>
               <w:rPr>
@@ -324,7 +332,7 @@
             <w:pPr>
               <w:spacing w:line="240" w:lineRule="auto"/>
               <w:ind w:firstLine="0"/>
-              <w:jc w:val="center"/>
+              <w:jc w:val="left"/>
             </w:pPr>
             <w:r>
               <w:rPr>
@@ -356,7 +364,7 @@
             <w:pPr>
               <w:spacing w:line="240" w:lineRule="auto"/>
               <w:ind w:firstLine="0"/>
-              <w:jc w:val="center"/>
+              <w:jc w:val="left"/>
             </w:pPr>
             <w:r>
               <w:rPr>
@@ -393,7 +401,7 @@
             <w:pPr>
               <w:spacing w:line="240" w:lineRule="auto"/>
               <w:ind w:firstLine="0"/>
-              <w:jc w:val="center"/>
+              <w:jc w:val="left"/>
             </w:pPr>
             <w:r>
               <w:rPr>
@@ -424,7 +432,7 @@
             <w:pPr>
               <w:spacing w:line="240" w:lineRule="auto"/>
               <w:ind w:firstLine="0"/>
-              <w:jc w:val="center"/>
+              <w:jc w:val="left"/>
             </w:pPr>
             <w:r>
               <w:rPr>
@@ -455,7 +463,7 @@
             <w:pPr>
               <w:spacing w:line="240" w:lineRule="auto"/>
               <w:ind w:firstLine="0"/>
-              <w:jc w:val="center"/>
+              <w:jc w:val="left"/>
             </w:pPr>
             <w:r>
               <w:rPr>
@@ -486,7 +494,7 @@
             <w:pPr>
               <w:spacing w:line="240" w:lineRule="auto"/>
               <w:ind w:firstLine="0"/>
-              <w:jc w:val="center"/>
+              <w:jc w:val="left"/>
             </w:pPr>
             <w:r>
               <w:rPr>
@@ -517,7 +525,7 @@
             <w:pPr>
               <w:spacing w:line="240" w:lineRule="auto"/>
               <w:ind w:firstLine="0"/>
-              <w:jc w:val="center"/>
+              <w:jc w:val="left"/>
             </w:pPr>
             <w:r>
               <w:rPr>
@@ -553,7 +561,7 @@
             <w:pPr>
               <w:spacing w:line="240" w:lineRule="auto"/>
               <w:ind w:firstLine="0"/>
-              <w:jc w:val="center"/>
+              <w:jc w:val="left"/>
             </w:pPr>
             <w:r>
               <w:rPr>
@@ -584,7 +592,7 @@
             <w:pPr>
               <w:spacing w:line="240" w:lineRule="auto"/>
               <w:ind w:firstLine="0"/>
-              <w:jc w:val="center"/>
+              <w:jc w:val="left"/>
             </w:pPr>
             <w:r>
               <w:rPr>
@@ -615,7 +623,7 @@
             <w:pPr>
               <w:spacing w:line="240" w:lineRule="auto"/>
               <w:ind w:firstLine="0"/>
-              <w:jc w:val="center"/>
+              <w:jc w:val="left"/>
             </w:pPr>
             <w:r>
               <w:rPr>
@@ -646,7 +654,7 @@
             <w:pPr>
               <w:spacing w:line="240" w:lineRule="auto"/>
               <w:ind w:firstLine="0"/>
-              <w:jc w:val="center"/>
+              <w:jc w:val="left"/>
             </w:pPr>
             <w:r>
               <w:rPr>
@@ -677,7 +685,7 @@
             <w:pPr>
               <w:spacing w:line="240" w:lineRule="auto"/>
               <w:ind w:firstLine="0"/>
-              <w:jc w:val="center"/>
+              <w:jc w:val="left"/>
             </w:pPr>
             <w:r>
               <w:rPr>
@@ -713,7 +721,7 @@
             <w:pPr>
               <w:spacing w:line="240" w:lineRule="auto"/>
               <w:ind w:firstLine="0"/>
-              <w:jc w:val="center"/>
+              <w:jc w:val="left"/>
             </w:pPr>
             <w:r>
               <w:rPr>
@@ -744,7 +752,7 @@
             <w:pPr>
               <w:spacing w:line="240" w:lineRule="auto"/>
               <w:ind w:firstLine="0"/>
-              <w:jc w:val="center"/>
+              <w:jc w:val="left"/>
             </w:pPr>
             <w:r>
               <w:rPr>
@@ -775,7 +783,7 @@
             <w:pPr>
               <w:spacing w:line="240" w:lineRule="auto"/>
               <w:ind w:firstLine="0"/>
-              <w:jc w:val="center"/>
+              <w:jc w:val="left"/>
             </w:pPr>
             <w:r>
               <w:rPr>
@@ -806,13 +814,20 @@
             <w:pPr>
               <w:spacing w:line="240" w:lineRule="auto"/>
               <w:ind w:firstLine="0"/>
-              <w:jc w:val="center"/>
+              <w:jc w:val="left"/>
             </w:pPr>
             <w:r>
               <w:rPr>
                 <w:sz w:val="13"/>
               </w:rPr>
-              <w:t>Strong F1 under Twitter-based COVID-19 detection settings</w:t>
+              <w:t xml:space="preserve">Strong F1 under Twitter-based COVID-19 </w:t>
+            </w:r>
+            <w:r>
+              <w:rPr>
+                <w:sz w:val="13"/>
+              </w:rPr>
+              <w:lastRenderedPageBreak/>
+              <w:t>detection settings</w:t>
             </w:r>
           </w:p>
         </w:tc>
@@ -837,13 +852,21 @@
             <w:pPr>
               <w:spacing w:line="240" w:lineRule="auto"/>
               <w:ind w:firstLine="0"/>
-              <w:jc w:val="center"/>
+              <w:jc w:val="left"/>
             </w:pPr>
             <w:r>
               <w:rPr>
                 <w:sz w:val="13"/>
               </w:rPr>
-              <w:t>Relies on Twitter-centric features; not tailored to Vietnamese vaccine discourse.</w:t>
+              <w:lastRenderedPageBreak/>
+              <w:t xml:space="preserve">Relies on Twitter-centric features; not </w:t>
+            </w:r>
+            <w:r>
+              <w:rPr>
+                <w:sz w:val="13"/>
+              </w:rPr>
+              <w:lastRenderedPageBreak/>
+              <w:t>tailored to Vietnamese vaccine discourse.</w:t>
             </w:r>
           </w:p>
         </w:tc>
@@ -873,12 +896,13 @@
             <w:pPr>
               <w:spacing w:line="240" w:lineRule="auto"/>
               <w:ind w:firstLine="0"/>
-              <w:jc w:val="center"/>
+              <w:jc w:val="left"/>
             </w:pPr>
             <w:r>
               <w:rPr>
                 <w:sz w:val="13"/>
               </w:rPr>
+              <w:lastRenderedPageBreak/>
               <w:t>DANN + LIME on CoAID/MiSoVac [27]</w:t>
             </w:r>
           </w:p>
@@ -904,7 +928,7 @@
             <w:pPr>
               <w:spacing w:line="240" w:lineRule="auto"/>
               <w:ind w:firstLine="0"/>
-              <w:jc w:val="center"/>
+              <w:jc w:val="left"/>
             </w:pPr>
             <w:r>
               <w:rPr>
@@ -935,7 +959,7 @@
             <w:pPr>
               <w:spacing w:line="240" w:lineRule="auto"/>
               <w:ind w:firstLine="0"/>
-              <w:jc w:val="center"/>
+              <w:jc w:val="left"/>
             </w:pPr>
             <w:r>
               <w:rPr>
@@ -966,7 +990,7 @@
             <w:pPr>
               <w:spacing w:line="240" w:lineRule="auto"/>
               <w:ind w:firstLine="0"/>
-              <w:jc w:val="center"/>
+              <w:jc w:val="left"/>
             </w:pPr>
             <w:r>
               <w:rPr>
@@ -997,7 +1021,7 @@
             <w:pPr>
               <w:spacing w:line="240" w:lineRule="auto"/>
               <w:ind w:firstLine="0"/>
-              <w:jc w:val="center"/>
+              <w:jc w:val="left"/>
             </w:pPr>
             <w:r>
               <w:rPr>
@@ -1033,7 +1057,7 @@
             <w:pPr>
               <w:spacing w:line="240" w:lineRule="auto"/>
               <w:ind w:firstLine="0"/>
-              <w:jc w:val="center"/>
+              <w:jc w:val="left"/>
             </w:pPr>
             <w:r>
               <w:rPr>
@@ -1064,7 +1088,7 @@
             <w:pPr>
               <w:spacing w:line="240" w:lineRule="auto"/>
               <w:ind w:firstLine="0"/>
-              <w:jc w:val="center"/>
+              <w:jc w:val="left"/>
             </w:pPr>
             <w:r>
               <w:rPr>
@@ -1095,7 +1119,7 @@
             <w:pPr>
               <w:spacing w:line="240" w:lineRule="auto"/>
               <w:ind w:firstLine="0"/>
-              <w:jc w:val="center"/>
+              <w:jc w:val="left"/>
             </w:pPr>
             <w:r>
               <w:rPr>
@@ -1126,7 +1150,7 @@
             <w:pPr>
               <w:spacing w:line="240" w:lineRule="auto"/>
               <w:ind w:firstLine="0"/>
-              <w:jc w:val="center"/>
+              <w:jc w:val="left"/>
             </w:pPr>
             <w:r>
               <w:rPr>
@@ -1157,20 +1181,13 @@
             <w:pPr>
               <w:spacing w:line="240" w:lineRule="auto"/>
               <w:ind w:firstLine="0"/>
-              <w:jc w:val="center"/>
+              <w:jc w:val="left"/>
             </w:pPr>
             <w:r>
               <w:rPr>
                 <w:sz w:val="13"/>
               </w:rPr>
-              <w:t xml:space="preserve">Medical truth claims still require expert review; our misinformation kappa was only </w:t>
-            </w:r>
-            <w:r>
-              <w:rPr>
-                <w:sz w:val="13"/>
-              </w:rPr>
-              <w:lastRenderedPageBreak/>
-              <w:t>0.0525.</w:t>
+              <w:t>Medical truth claims still require expert review; our misinformation kappa was only 0.0525.</w:t>
             </w:r>
           </w:p>
         </w:tc>
@@ -1200,13 +1217,12 @@
             <w:pPr>
               <w:spacing w:line="240" w:lineRule="auto"/>
               <w:ind w:firstLine="0"/>
-              <w:jc w:val="center"/>
+              <w:jc w:val="left"/>
             </w:pPr>
             <w:r>
               <w:rPr>
                 <w:sz w:val="13"/>
               </w:rPr>
-              <w:lastRenderedPageBreak/>
               <w:t>VaccineNLP (this study)</w:t>
             </w:r>
           </w:p>
@@ -1232,7 +1248,7 @@
             <w:pPr>
               <w:spacing w:line="240" w:lineRule="auto"/>
               <w:ind w:firstLine="0"/>
-              <w:jc w:val="center"/>
+              <w:jc w:val="left"/>
             </w:pPr>
             <w:r>
               <w:rPr>
@@ -1263,7 +1279,7 @@
             <w:pPr>
               <w:spacing w:line="240" w:lineRule="auto"/>
               <w:ind w:firstLine="0"/>
-              <w:jc w:val="center"/>
+              <w:jc w:val="left"/>
             </w:pPr>
             <w:r>
               <w:rPr>
@@ -1294,7 +1310,7 @@
             <w:pPr>
               <w:spacing w:line="240" w:lineRule="auto"/>
               <w:ind w:firstLine="0"/>
-              <w:jc w:val="center"/>
+              <w:jc w:val="left"/>
             </w:pPr>
             <w:r>
               <w:rPr>
@@ -1325,7 +1341,7 @@
             <w:pPr>
               <w:spacing w:line="240" w:lineRule="auto"/>
               <w:ind w:firstLine="0"/>
-              <w:jc w:val="center"/>
+              <w:jc w:val="left"/>
             </w:pPr>
             <w:r>
               <w:rPr>
@@ -1361,6 +1377,11 @@
         <w:pStyle w:val="p1a"/>
       </w:pPr>
       <w:r>
+        <w:t>Accordingly, Table 1 should be read as a research-positioning comparison rather than as a direct benchmark. The controlled experimental comparison is reported later in Tables 6 and 7, where XLM-RoBERTa, PhoBERT-v2, and Gemma-4 4B are evaluated on the same Vietnamese Gold Test Set under the same label schema.</w:t>
+      </w:r>
+    </w:p>
+    <w:p>
+      <w:r>
         <w:t>The distinction between encoder and decoder models is important for this study. Encoder-only models are optimized for stable representations and classification, while decoder-only LLMs produce free-form explanations that can be useful for analysts but difficult to parse into controlled labels. This motivates the Dual-Student Hybrid architecture: PhoBERT-v2 performs routine multi-task classification, and Gemma-4 4B supports explanation for difficult cases. The design aligns with a practical division of labor instead of forcing a single model to be the classifier, annotator, fact-checker, and explainer at once.</w:t>
       </w:r>
     </w:p>
@@ -1390,7 +1411,11 @@
         <w:pStyle w:val="p1a"/>
       </w:pPr>
       <w:r>
-        <w:t>The study uses secondary public text data and a supervised machine-learning design. The unit of analysis is a Vietnamese vaccine-related post, article, video description, or comment. Data were collected from January 2020 to March 2026 from online news, Facebook, YouTube, Reddit, and public forums. Private messages were excluded. Table 2 summarizes the source-level collection and cleaning pipeline.</w:t>
+        <w:t xml:space="preserve">The study uses secondary public text data and a supervised machine-learning design. The unit of analysis is a Vietnamese vaccine-related post, article, video description, or comment. Data were collected from January 2020 to March 2026 from online news, </w:t>
+      </w:r>
+      <w:r>
+        <w:lastRenderedPageBreak/>
+        <w:t>Facebook, YouTube, Reddit, and public forums. Private messages were excluded. Table 2 summarizes the source-level collection and cleaning pipeline.</w:t>
       </w:r>
     </w:p>
     <w:p>
@@ -1407,7 +1432,6 @@
           <w:b/>
           <w:i/>
         </w:rPr>
-        <w:lastRenderedPageBreak/>
         <w:t xml:space="preserve">Table 2. </w:t>
       </w:r>
       <w:r>
@@ -2589,7 +2613,11 @@
     </w:p>
     <w:p>
       <w:r>
-        <w:t>The preprocessing pipeline was designed for Vietnamese social-media noise rather than formal newspaper text alone. It retained diacritics because accent removal can collapse medically meaningful tokens, but it normalized Unicode variants and conversational abbreviations. Hashtags were split into word-like units, emojis were converted into textual sentiment cues, and URLs were removed while preserving the surrounding claim. For PhoBERT-v2, the cleaned text was subsequently word-segmented so that the model received the tokenization format expected by Vietnamese pre-training.</w:t>
+        <w:t>The preprocessing pipeline was designed for Vietnamese social-media noise rather than formal newspaper text alone. It retained diacritics because accent removal can collapse medically meaningful tokens, but it normalized Unicode variants and conversational abbreviations. Hashtags were split into word-like units, emojis were converted into textual sentiment cues, and URLs were removed while preserving the sur</w:t>
+      </w:r>
+      <w:r>
+        <w:lastRenderedPageBreak/>
+        <w:t>rounding claim. For PhoBERT-v2, the cleaned text was subsequently word-segmented so that the model received the tokenization format expected by Vietnamese pre-training.</w:t>
       </w:r>
     </w:p>
     <w:p>
@@ -2605,11 +2633,7 @@
         <w:pStyle w:val="p1a"/>
       </w:pPr>
       <w:r>
-        <w:t>Each sample was labeled on three axes. The misinformation axis is binary: misinformation versus correct or not evidently misleading information. The stance axis has three classes: supportive, neutral, and opposing or hesitant. The sentiment axis has three classes: positive, neutral, and negative. This separation between stance and sen</w:t>
-      </w:r>
-      <w:r>
-        <w:lastRenderedPageBreak/>
-        <w:t>timent follows the broader distinction between opinion orientation and affective polarity in sentiment analysis [12]. Borderline cases were adjudicated by expert review, and the expert label was treated as the reference label in the Gold Test Set.</w:t>
+        <w:t>Each sample was labeled on three axes. The misinformation axis is binary: misinformation versus correct or not evidently misleading information. The stance axis has three classes: supportive, neutral, and opposing or hesitant. The sentiment axis has three classes: positive, neutral, and negative. This separation between stance and sentiment follows the broader distinction between opinion orientation and affective polarity in sentiment analysis [12]. Borderline cases were adjudicated by expert review, and the expert label was treated as the reference label in the Gold Test Set.</w:t>
       </w:r>
     </w:p>
     <w:p>
@@ -2673,7 +2697,7 @@
             <w:pPr>
               <w:spacing w:line="240" w:lineRule="auto"/>
               <w:ind w:firstLine="0"/>
-              <w:jc w:val="center"/>
+              <w:jc w:val="left"/>
             </w:pPr>
             <w:r>
               <w:rPr>
@@ -2705,7 +2729,7 @@
             <w:pPr>
               <w:spacing w:line="240" w:lineRule="auto"/>
               <w:ind w:firstLine="0"/>
-              <w:jc w:val="center"/>
+              <w:jc w:val="left"/>
             </w:pPr>
             <w:r>
               <w:rPr>
@@ -2737,7 +2761,7 @@
             <w:pPr>
               <w:spacing w:line="240" w:lineRule="auto"/>
               <w:ind w:firstLine="0"/>
-              <w:jc w:val="center"/>
+              <w:jc w:val="left"/>
             </w:pPr>
             <w:r>
               <w:rPr>
@@ -2774,7 +2798,7 @@
             <w:pPr>
               <w:spacing w:line="240" w:lineRule="auto"/>
               <w:ind w:firstLine="0"/>
-              <w:jc w:val="center"/>
+              <w:jc w:val="left"/>
             </w:pPr>
             <w:r>
               <w:rPr>
@@ -2805,7 +2829,7 @@
             <w:pPr>
               <w:spacing w:line="240" w:lineRule="auto"/>
               <w:ind w:firstLine="0"/>
-              <w:jc w:val="center"/>
+              <w:jc w:val="left"/>
             </w:pPr>
             <w:r>
               <w:rPr>
@@ -2836,7 +2860,7 @@
             <w:pPr>
               <w:spacing w:line="240" w:lineRule="auto"/>
               <w:ind w:firstLine="0"/>
-              <w:jc w:val="center"/>
+              <w:jc w:val="left"/>
             </w:pPr>
             <w:r>
               <w:rPr>
@@ -2872,7 +2896,7 @@
             <w:pPr>
               <w:spacing w:line="240" w:lineRule="auto"/>
               <w:ind w:firstLine="0"/>
-              <w:jc w:val="center"/>
+              <w:jc w:val="left"/>
             </w:pPr>
             <w:r>
               <w:rPr>
@@ -2903,7 +2927,7 @@
             <w:pPr>
               <w:spacing w:line="240" w:lineRule="auto"/>
               <w:ind w:firstLine="0"/>
-              <w:jc w:val="center"/>
+              <w:jc w:val="left"/>
             </w:pPr>
             <w:r>
               <w:rPr>
@@ -2934,7 +2958,7 @@
             <w:pPr>
               <w:spacing w:line="240" w:lineRule="auto"/>
               <w:ind w:firstLine="0"/>
-              <w:jc w:val="center"/>
+              <w:jc w:val="left"/>
             </w:pPr>
             <w:r>
               <w:rPr>
@@ -2970,7 +2994,7 @@
             <w:pPr>
               <w:spacing w:line="240" w:lineRule="auto"/>
               <w:ind w:firstLine="0"/>
-              <w:jc w:val="center"/>
+              <w:jc w:val="left"/>
             </w:pPr>
             <w:r>
               <w:rPr>
@@ -3001,7 +3025,7 @@
             <w:pPr>
               <w:spacing w:line="240" w:lineRule="auto"/>
               <w:ind w:firstLine="0"/>
-              <w:jc w:val="center"/>
+              <w:jc w:val="left"/>
             </w:pPr>
             <w:r>
               <w:rPr>
@@ -3032,7 +3056,7 @@
             <w:pPr>
               <w:spacing w:line="240" w:lineRule="auto"/>
               <w:ind w:firstLine="0"/>
-              <w:jc w:val="center"/>
+              <w:jc w:val="left"/>
             </w:pPr>
             <w:r>
               <w:rPr>
@@ -3068,7 +3092,7 @@
             <w:pPr>
               <w:spacing w:line="240" w:lineRule="auto"/>
               <w:ind w:firstLine="0"/>
-              <w:jc w:val="center"/>
+              <w:jc w:val="left"/>
             </w:pPr>
             <w:r>
               <w:rPr>
@@ -3099,7 +3123,7 @@
             <w:pPr>
               <w:spacing w:line="240" w:lineRule="auto"/>
               <w:ind w:firstLine="0"/>
-              <w:jc w:val="center"/>
+              <w:jc w:val="left"/>
             </w:pPr>
             <w:r>
               <w:rPr>
@@ -3130,7 +3154,7 @@
             <w:pPr>
               <w:spacing w:line="240" w:lineRule="auto"/>
               <w:ind w:firstLine="0"/>
-              <w:jc w:val="center"/>
+              <w:jc w:val="left"/>
             </w:pPr>
             <w:r>
               <w:rPr>
@@ -3166,7 +3190,7 @@
             <w:pPr>
               <w:spacing w:line="240" w:lineRule="auto"/>
               <w:ind w:firstLine="0"/>
-              <w:jc w:val="center"/>
+              <w:jc w:val="left"/>
             </w:pPr>
             <w:r>
               <w:rPr>
@@ -3197,7 +3221,7 @@
             <w:pPr>
               <w:spacing w:line="240" w:lineRule="auto"/>
               <w:ind w:firstLine="0"/>
-              <w:jc w:val="center"/>
+              <w:jc w:val="left"/>
             </w:pPr>
             <w:r>
               <w:rPr>
@@ -3228,7 +3252,7 @@
             <w:pPr>
               <w:spacing w:line="240" w:lineRule="auto"/>
               <w:ind w:firstLine="0"/>
-              <w:jc w:val="center"/>
+              <w:jc w:val="left"/>
             </w:pPr>
             <w:r>
               <w:rPr>
@@ -3264,7 +3288,7 @@
             <w:pPr>
               <w:spacing w:line="240" w:lineRule="auto"/>
               <w:ind w:firstLine="0"/>
-              <w:jc w:val="center"/>
+              <w:jc w:val="left"/>
             </w:pPr>
             <w:r>
               <w:rPr>
@@ -3295,7 +3319,7 @@
             <w:pPr>
               <w:spacing w:line="240" w:lineRule="auto"/>
               <w:ind w:firstLine="0"/>
-              <w:jc w:val="center"/>
+              <w:jc w:val="left"/>
             </w:pPr>
             <w:r>
               <w:rPr>
@@ -3326,7 +3350,7 @@
             <w:pPr>
               <w:spacing w:line="240" w:lineRule="auto"/>
               <w:ind w:firstLine="0"/>
-              <w:jc w:val="center"/>
+              <w:jc w:val="left"/>
             </w:pPr>
             <w:r>
               <w:rPr>
@@ -3362,7 +3386,7 @@
             <w:pPr>
               <w:spacing w:line="240" w:lineRule="auto"/>
               <w:ind w:firstLine="0"/>
-              <w:jc w:val="center"/>
+              <w:jc w:val="left"/>
             </w:pPr>
             <w:r>
               <w:rPr>
@@ -3393,7 +3417,7 @@
             <w:pPr>
               <w:spacing w:line="240" w:lineRule="auto"/>
               <w:ind w:firstLine="0"/>
-              <w:jc w:val="center"/>
+              <w:jc w:val="left"/>
             </w:pPr>
             <w:r>
               <w:rPr>
@@ -3424,7 +3448,7 @@
             <w:pPr>
               <w:spacing w:line="240" w:lineRule="auto"/>
               <w:ind w:firstLine="0"/>
-              <w:jc w:val="center"/>
+              <w:jc w:val="left"/>
             </w:pPr>
             <w:r>
               <w:rPr>
@@ -3460,7 +3484,7 @@
             <w:pPr>
               <w:spacing w:line="240" w:lineRule="auto"/>
               <w:ind w:firstLine="0"/>
-              <w:jc w:val="center"/>
+              <w:jc w:val="left"/>
             </w:pPr>
             <w:r>
               <w:rPr>
@@ -3491,7 +3515,7 @@
             <w:pPr>
               <w:spacing w:line="240" w:lineRule="auto"/>
               <w:ind w:firstLine="0"/>
-              <w:jc w:val="center"/>
+              <w:jc w:val="left"/>
             </w:pPr>
             <w:r>
               <w:rPr>
@@ -3522,7 +3546,7 @@
             <w:pPr>
               <w:spacing w:line="240" w:lineRule="auto"/>
               <w:ind w:firstLine="0"/>
-              <w:jc w:val="center"/>
+              <w:jc w:val="left"/>
             </w:pPr>
             <w:r>
               <w:rPr>
@@ -3570,6 +3594,7 @@
           <w:b/>
           <w:i/>
         </w:rPr>
+        <w:lastRenderedPageBreak/>
         <w:t xml:space="preserve">Table 4. </w:t>
       </w:r>
       <w:r>
@@ -5201,14 +5226,23 @@
         <w:rPr>
           <w:sz w:val="16"/>
         </w:rPr>
-        <w:t>Mis. = misinformation; Corr. = correct/not misleading; Sup. = supportive stance; Neu-S = neutral stance; Opp. = opposing or hesitant stance; Neu-E = neutral sentiment; Pos./Neg. = positive/negative sen</w:t>
-      </w:r>
-      <w:r>
-        <w:rPr>
-          <w:sz w:val="16"/>
-        </w:rPr>
-        <w:lastRenderedPageBreak/>
-        <w:t>timent. Seven samples were dropped before modeling because word segmentation removed malformed or empty rows.</w:t>
+        <w:t>Mis. = misinformation; Corr. = correct/not misleading; Sup. = supportive stance; Neu-S = neutral stance; Opp. = opposing or hesitant stance; Neu-E = neutral sentiment; Pos./Neg. = positive/negative sentiment. Seven samples were dropped before modeling because word segmentation removed malformed or empty rows.</w:t>
+      </w:r>
+    </w:p>
+    <w:p>
+      <w:pPr>
+        <w:pStyle w:val="heading2"/>
+      </w:pPr>
+      <w:r>
+        <w:t>Implementation Workflow</w:t>
+      </w:r>
+    </w:p>
+    <w:p>
+      <w:pPr>
+        <w:pStyle w:val="p1a"/>
+      </w:pPr>
+      <w:r>
+        <w:t>The implementation can be summarized as a six-stage algorithmic workflow. Step 1 collects vaccine-related Vietnamese texts from news, social media, video comments, and public forums. Step 2 applies the Vietnamese preprocessing pipeline, including Unicode normalization, URL and HTML removal, hashtag segmentation, slang normalization, and word segmentation. Step 3 assigns three-axis labels for misinformation, stance, and sentiment through LLM-assisted annotation followed by HITL expert validation. Step 4 trains XLM-RoBERTa and PhoBERT-v2 classifiers and fine-tunes Gemma-4 4B with QLoRA for explanation-oriented reasoning. Step 5 evaluates all models on the expert-validated Gold Test Set using Macro F1, per-class F1, calibration error, parsing reliability, and agreement with expert labels. Step 6 deploys the calibrated PhoBERT-v2 output as the first-tier screening signal and escalates low-confidence or high-risk cases to the explanation and expert-review layer. This workflow is the operational algorithm used throughout the experiments, linking data preparation, modeling, evaluation, and human review in a single reproducible pipeline.</w:t>
       </w:r>
     </w:p>
     <w:p>
@@ -5236,8 +5270,9 @@
         <w:rPr>
           <w:noProof/>
         </w:rPr>
+        <w:lastRenderedPageBreak/>
         <w:drawing>
-          <wp:inline distT="0" distB="0" distL="0" distR="0" wp14:anchorId="68A1C6D7" wp14:editId="21561154">
+          <wp:inline distT="0" distB="0" distL="0" distR="0" wp14:anchorId="00294BE7" wp14:editId="4B517D49">
             <wp:extent cx="4356000" cy="4307600"/>
             <wp:effectExtent l="0" t="0" r="0" b="0"/>
             <wp:docPr id="1" name="Fig. 1" descr="VaccineNLP architecture diagram showing preprocessing, PhoBERT-v2 classification, Gemma-4 explanation, RAG evidence checking, and cognitive integrity output." title="VaccineNLP two-tier human-in-the-loop architecture for Vietnamese vaccine misinformation surveillance."/>
@@ -5301,7 +5336,6 @@
         <w:pStyle w:val="p1a"/>
       </w:pPr>
       <w:r>
-        <w:lastRenderedPageBreak/>
         <w:t>The misinformation loss was upweighted because misinformation is the minority but highest-risk class. In operational use, the classifier screens all incoming items and the reasoning engine supports explanation, triage, and expert review for high-risk or low-confidence cases.</w:t>
       </w:r>
     </w:p>
@@ -5312,6 +5346,7 @@
     </w:p>
     <w:p>
       <w:r>
+        <w:lastRenderedPageBreak/>
         <w:t>The encoder implementation used PhoBERT-base-v2 with a 768-dimensional pooled representation and parallel classification heads for the three annotation axes. AdamW optimization used a learning rate of 2e-5, weight decay of 0.01, three to five epochs, and a warm-up schedule of approximately 10% of training steps. Checkpoints were selected by validation loss and monitored with Macro F1 to prevent the majority classes from dominating model selection.</w:t>
       </w:r>
     </w:p>
@@ -5343,11 +5378,7 @@
     </w:p>
     <w:p>
       <w:r>
-        <w:t>Temperature Scaling was fitted on the validation set and evaluated on the Gold Test Set. This method learns a single positive temperature that rescales logits before softmax, reducing overconfidence without changing the predicted class. For a public-health dashboard, this distinction matters: a calibrated confidence score supports re</w:t>
-      </w:r>
-      <w:r>
-        <w:lastRenderedPageBreak/>
-        <w:t>view prioritization, whereas an overconfident but wrong prediction can mislead analysts.</w:t>
+        <w:t>Temperature Scaling was fitted on the validation set and evaluated on the Gold Test Set. This method learns a single positive temperature that rescales logits before softmax, reducing overconfidence without changing the predicted class. For a public-health dashboard, this distinction matters: a calibrated confidence score supports review prioritization, whereas an overconfident but wrong prediction can mislead analysts.</w:t>
       </w:r>
     </w:p>
     <w:p>
@@ -5357,7 +5388,11 @@
     </w:p>
     <w:p>
       <w:r>
-        <w:t>Error analysis was defined on randomly sampled false-positive and false-negative cases from the best-performing classifier. The thesis protocol grouped errors into four categories: sarcasm or irony, borderline medical content, out-of-vocabulary or emerging slang, and very short texts with insufficient context. These categories informed the future-work recommendations on sarcasm handling, active learning, and evidence-aware explanation.</w:t>
+        <w:t>Error analysis was defined on randomly sampled false-positive and false-negative cases from the best-performing classifier. The thesis protocol grouped errors into four categories: sarcasm or irony, borderline medical content, out-of-vocabulary or emerg</w:t>
+      </w:r>
+      <w:r>
+        <w:lastRenderedPageBreak/>
+        <w:t>ing slang, and very short texts with insufficient context. These categories informed the future-work recommendations on sarcasm handling, active learning, and evidence-aware explanation.</w:t>
       </w:r>
     </w:p>
     <w:p>
@@ -5377,6 +5412,11 @@
       <w:pPr>
         <w:pStyle w:val="p1a"/>
       </w:pPr>
+      <w:r>
+        <w:t>The experimental results are organized so that each table answers a specific evaluation question. Table 5 describes the Gold Test Set used for evaluation. Table 6 is the primary model-comparison table: it reports task-level Macro F1 for XLM-RoBERTa, PhoBERT-v2, and Gemma-4 4B on the same expert-validated split. Table 7 provides the per-class F1 details behind those macro scores. Table 8 reports confidence calibration after Temperature Scaling, while Table 9 reports the reliability of LLM-assisted annotation against expert review. Tables 10--13 provide statistical evidence for public-health risk associations among sentiment, stance, platform, and misinformation.</w:t>
+      </w:r>
+    </w:p>
+    <w:p>
       <w:r>
         <w:t>The Gold Test Set contains 186 expert-reviewed Vietnamese samples. Misinformation is the minority class, with 28 samples (15.1%), while 158 samples were labeled as correct or not clearly misleading. For stance, 54 samples were supportive, 48 opposing or hesitant, and 84 neutral. For sentiment, 71 samples were negative, 75 neutral, and 40 positive (Table 5).</w:t>
       </w:r>
@@ -6553,16 +6593,13 @@
         <w:pStyle w:val="p1a"/>
       </w:pPr>
       <w:r>
-        <w:t xml:space="preserve">The label distribution confirms why Macro F1 was selected as the primary metric. Accuracy alone would overstate system performance because the correct/not-misleading class dominates the misinformation axis. A classifier that misses most harmful misinformation could still appear acceptable under accuracy, but would be </w:t>
-      </w:r>
-      <w:r>
-        <w:lastRenderedPageBreak/>
-        <w:t>unsafe for infodemic surveillance. Macro F1 gives each class equal weight and therefore makes minority-class weakness visible.</w:t>
+        <w:t>The label distribution confirms why Macro F1 was selected as the primary metric. Accuracy alone would overstate system performance because the correct/not-misleading class dominates the misinformation axis. A classifier that misses most harmful misinformation could still appear acceptable under accuracy, but would be unsafe for infodemic surveillance. Macro F1 gives each class equal weight and therefore makes minority-class weakness visible.</w:t>
       </w:r>
     </w:p>
     <w:p>
       <w:r>
-        <w:t>Table 6 summarizes Macro F1 across the three tasks. PhoBERT-v2 achieved the highest average Macro F1 (0.6967), suggesting that a Vietnamese-specific encoder is effective for multi-task health-text classification. XLM-RoBERTa slightly outperformed PhoBERT-v2 on the misinformation axis (0.7038 versus 0.6996), while Gemma-4 4B performed best on sentiment (0.7700), consistent with the strength of generative models in affective and contextual interpretation.</w:t>
+        <w:lastRenderedPageBreak/>
+        <w:t>Table 6 is therefore the main experimental-results table for model performance. It summarizes Macro F1 across the three tasks. PhoBERT-v2 achieved the highest average Macro F1 (0.6967), suggesting that a Vietnamese-specific encoder is effective for multi-task health-text classification. XLM-RoBERTa slightly outperformed PhoBERT-v2 on the misinformation axis (0.7038 versus 0.6996), while Gemma-4 4B performed best on sentiment (0.7700), consistent with the strength of generative models in affective and contextual interpretation.</w:t>
       </w:r>
     </w:p>
     <w:p>
@@ -6580,7 +6617,7 @@
         <w:rPr>
           <w:i/>
         </w:rPr>
-        <w:t>Macro F1 on the expert-validated Gold Test Set.</w:t>
+        <w:t>Primary experimental results: Macro F1 on the expert-validated Gold Test Set.</w:t>
       </w:r>
     </w:p>
     <w:tbl>
@@ -7408,7 +7445,7 @@
         <w:rPr>
           <w:i/>
         </w:rPr>
-        <w:t>Per-class F1 by task on the Gold Test Set.</w:t>
+        <w:t>Detailed experimental results: per-class F1 by task on the Gold Test Set.</w:t>
       </w:r>
     </w:p>
     <w:tbl>
@@ -8419,7 +8456,6 @@
               <w:rPr>
                 <w:sz w:val="15"/>
               </w:rPr>
-              <w:lastRenderedPageBreak/>
               <w:t>Stance</w:t>
             </w:r>
           </w:p>
@@ -8611,6 +8647,7 @@
               <w:rPr>
                 <w:sz w:val="15"/>
               </w:rPr>
+              <w:lastRenderedPageBreak/>
               <w:t>Sentiment</w:t>
             </w:r>
           </w:p>
@@ -9183,7 +9220,7 @@
           <w:noProof/>
         </w:rPr>
         <w:drawing>
-          <wp:inline distT="0" distB="0" distL="0" distR="0" wp14:anchorId="7DE39A94" wp14:editId="1FAE2285">
+          <wp:inline distT="0" distB="0" distL="0" distR="0" wp14:anchorId="10404559" wp14:editId="0CB11172">
             <wp:extent cx="4392000" cy="1462909"/>
             <wp:effectExtent l="0" t="0" r="0" b="0"/>
             <wp:docPr id="2" name="Fig. 2" descr="Bar charts comparing per-class F1 for misinformation, stance, and sentiment across XLM-RoBERTa, PhoBERT-v2, and Gemma-4 4B." title="Per-class F1 scores of XLM-RoBERTa, PhoBERT-v2, and Gemma-4 4B on the Gold Test Set."/>
@@ -9308,7 +9345,7 @@
             <w:pPr>
               <w:spacing w:line="240" w:lineRule="auto"/>
               <w:ind w:firstLine="0"/>
-              <w:jc w:val="center"/>
+              <w:jc w:val="left"/>
             </w:pPr>
             <w:r>
               <w:rPr>
@@ -9577,7 +9614,7 @@
             <w:pPr>
               <w:spacing w:line="240" w:lineRule="auto"/>
               <w:ind w:firstLine="0"/>
-              <w:jc w:val="center"/>
+              <w:jc w:val="left"/>
             </w:pPr>
             <w:r>
               <w:rPr>
@@ -9838,7 +9875,7 @@
             <w:pPr>
               <w:spacing w:line="240" w:lineRule="auto"/>
               <w:ind w:firstLine="0"/>
-              <w:jc w:val="center"/>
+              <w:jc w:val="left"/>
             </w:pPr>
             <w:r>
               <w:rPr>
@@ -10099,7 +10136,7 @@
             <w:pPr>
               <w:spacing w:line="240" w:lineRule="auto"/>
               <w:ind w:firstLine="0"/>
-              <w:jc w:val="center"/>
+              <w:jc w:val="left"/>
             </w:pPr>
             <w:r>
               <w:rPr>
@@ -10365,7 +10402,7 @@
         </w:rPr>
         <w:lastRenderedPageBreak/>
         <w:drawing>
-          <wp:inline distT="0" distB="0" distL="0" distR="0" wp14:anchorId="766EFA71" wp14:editId="1A8AAEC0">
+          <wp:inline distT="0" distB="0" distL="0" distR="0" wp14:anchorId="7FF6F909" wp14:editId="40BCB812">
             <wp:extent cx="4392000" cy="1212094"/>
             <wp:effectExtent l="0" t="0" r="0" b="0"/>
             <wp:docPr id="3" name="Fig. 3" descr="Reliability diagrams showing raw and calibrated confidence versus accuracy for misinformation, stance, and sentiment." title="PhoBERT-v2 reliability diagrams before and after Temperature Scaling across the three tasks."/>
@@ -13980,7 +14017,7 @@
             <w:pPr>
               <w:spacing w:line="240" w:lineRule="auto"/>
               <w:ind w:firstLine="0"/>
-              <w:jc w:val="center"/>
+              <w:jc w:val="left"/>
             </w:pPr>
             <w:r>
               <w:rPr>
@@ -14012,7 +14049,7 @@
             <w:pPr>
               <w:spacing w:line="240" w:lineRule="auto"/>
               <w:ind w:firstLine="0"/>
-              <w:jc w:val="center"/>
+              <w:jc w:val="left"/>
             </w:pPr>
             <w:r>
               <w:rPr>
@@ -14176,7 +14213,7 @@
             <w:pPr>
               <w:spacing w:line="240" w:lineRule="auto"/>
               <w:ind w:firstLine="0"/>
-              <w:jc w:val="center"/>
+              <w:jc w:val="left"/>
             </w:pPr>
             <w:r>
               <w:rPr>
@@ -14207,7 +14244,7 @@
             <w:pPr>
               <w:spacing w:line="240" w:lineRule="auto"/>
               <w:ind w:firstLine="0"/>
-              <w:jc w:val="center"/>
+              <w:jc w:val="left"/>
             </w:pPr>
             <w:r>
               <w:rPr>
@@ -14367,7 +14404,7 @@
             <w:pPr>
               <w:spacing w:line="240" w:lineRule="auto"/>
               <w:ind w:firstLine="0"/>
-              <w:jc w:val="center"/>
+              <w:jc w:val="left"/>
             </w:pPr>
             <w:r>
               <w:rPr>
@@ -14398,7 +14435,7 @@
             <w:pPr>
               <w:spacing w:line="240" w:lineRule="auto"/>
               <w:ind w:firstLine="0"/>
-              <w:jc w:val="center"/>
+              <w:jc w:val="left"/>
             </w:pPr>
             <w:r>
               <w:rPr>
@@ -14558,7 +14595,7 @@
             <w:pPr>
               <w:spacing w:line="240" w:lineRule="auto"/>
               <w:ind w:firstLine="0"/>
-              <w:jc w:val="center"/>
+              <w:jc w:val="left"/>
             </w:pPr>
             <w:r>
               <w:rPr>
@@ -14589,7 +14626,7 @@
             <w:pPr>
               <w:spacing w:line="240" w:lineRule="auto"/>
               <w:ind w:firstLine="0"/>
-              <w:jc w:val="center"/>
+              <w:jc w:val="left"/>
             </w:pPr>
             <w:r>
               <w:rPr>
@@ -14766,7 +14803,7 @@
           <w:noProof/>
         </w:rPr>
         <w:drawing>
-          <wp:inline distT="0" distB="0" distL="0" distR="0" wp14:anchorId="555EAC3A" wp14:editId="2C021AEB">
+          <wp:inline distT="0" distB="0" distL="0" distR="0" wp14:anchorId="22EE504D" wp14:editId="2B8B5192">
             <wp:extent cx="4392000" cy="2309286"/>
             <wp:effectExtent l="0" t="0" r="0" b="0"/>
             <wp:docPr id="4" name="Fig. 4" descr="Screenshot of the VaccineNLP web prototype showing conversation-flow analysis, risk indicators, contextual evidence, and review output." title="VaccineNLP prototype interface for conversation-flow screening and evidence-oriented review."/>
@@ -16003,7 +16040,7 @@
         <w:b/>
         <w:sz w:val="16"/>
       </w:rPr>
-      <w:t>VaccineNLP: HITL Multi-Task Misinformation Surveillance</w:t>
+      <w:t>VaccineNLP: Explainable HITL Misinformation Surveillance</w:t>
     </w:r>
     <w:r>
       <w:tab/>
@@ -16744,31 +16781,31 @@
       </w:rPr>
     </w:lvl>
   </w:abstractNum>
-  <w:num w:numId="1" w16cid:durableId="489904611">
+  <w:num w:numId="1" w16cid:durableId="155611379">
     <w:abstractNumId w:val="0"/>
   </w:num>
-  <w:num w:numId="2" w16cid:durableId="1651248285">
+  <w:num w:numId="2" w16cid:durableId="1442723007">
     <w:abstractNumId w:val="0"/>
   </w:num>
-  <w:num w:numId="3" w16cid:durableId="647706607">
+  <w:num w:numId="3" w16cid:durableId="1482234873">
     <w:abstractNumId w:val="1"/>
   </w:num>
-  <w:num w:numId="4" w16cid:durableId="1077483193">
+  <w:num w:numId="4" w16cid:durableId="1274559736">
     <w:abstractNumId w:val="1"/>
   </w:num>
-  <w:num w:numId="5" w16cid:durableId="2102409556">
+  <w:num w:numId="5" w16cid:durableId="786776548">
     <w:abstractNumId w:val="3"/>
   </w:num>
-  <w:num w:numId="6" w16cid:durableId="1657956425">
+  <w:num w:numId="6" w16cid:durableId="335771146">
     <w:abstractNumId w:val="3"/>
   </w:num>
-  <w:num w:numId="7" w16cid:durableId="1032221601">
+  <w:num w:numId="7" w16cid:durableId="1200320046">
     <w:abstractNumId w:val="2"/>
   </w:num>
-  <w:num w:numId="8" w16cid:durableId="935795798">
+  <w:num w:numId="8" w16cid:durableId="161629791">
     <w:abstractNumId w:val="4"/>
   </w:num>
-  <w:num w:numId="9" w16cid:durableId="1016004825">
+  <w:num w:numId="9" w16cid:durableId="607155995">
     <w:abstractNumId w:val="4"/>
   </w:num>
   <w:numIdMacAtCleanup w:val="4"/>

</xml_diff>

<commit_message>
Normalize table indentation and spacing
</commit_message>
<xml_diff>
--- a/submission_fisat/VaccineNLP_FISAT_FINAL_CONTACT_UPDATED.docx
+++ b/submission_fisat/VaccineNLP_FISAT_FINAL_CONTACT_UPDATED.docx
@@ -224,6 +224,8 @@
     <w:p>
       <w:pPr>
         <w:pStyle w:val="tablecaption"/>
+        <w:spacing w:before="80" w:after="20" w:line="240" w:lineRule="auto"/>
+        <w:ind w:left="0" w:right="0" w:firstLine="0"/>
       </w:pPr>
       <w:r>
         <w:rPr>
@@ -245,6 +247,7 @@
         <w:jc w:val="center"/>
         <w:tblLayout w:type="fixed"/>
         <w:tblLook w:firstColumn="1" w:firstRow="1" w:lastColumn="0" w:lastRow="0" w:noHBand="0" w:noVBand="1" w:val="04A0"/>
+        <w:tblInd w:w="0" w:type="dxa"/>
       </w:tblPr>
       <w:tblGrid>
         <w:gridCol w:w="1097"/>
@@ -279,6 +282,7 @@
           <w:p>
             <w:pPr>
               <w:spacing w:before="0" w:after="0" w:line="240" w:lineRule="auto"/>
+              <w:ind w:left="0" w:right="0" w:firstLine="0"/>
               <w:jc w:val="left"/>
             </w:pPr>
             <w:r/>
@@ -314,6 +318,7 @@
           <w:p>
             <w:pPr>
               <w:spacing w:before="0" w:after="0" w:line="240" w:lineRule="auto"/>
+              <w:ind w:left="0" w:right="0" w:firstLine="0"/>
               <w:jc w:val="left"/>
             </w:pPr>
             <w:r/>
@@ -349,6 +354,7 @@
           <w:p>
             <w:pPr>
               <w:spacing w:before="0" w:after="0" w:line="240" w:lineRule="auto"/>
+              <w:ind w:left="0" w:right="0" w:firstLine="0"/>
               <w:jc w:val="left"/>
             </w:pPr>
             <w:r/>
@@ -384,6 +390,7 @@
           <w:p>
             <w:pPr>
               <w:spacing w:before="0" w:after="0" w:line="240" w:lineRule="auto"/>
+              <w:ind w:left="0" w:right="0" w:firstLine="0"/>
               <w:jc w:val="left"/>
             </w:pPr>
             <w:r/>
@@ -419,6 +426,7 @@
           <w:p>
             <w:pPr>
               <w:spacing w:before="0" w:after="0" w:line="240" w:lineRule="auto"/>
+              <w:ind w:left="0" w:right="0" w:firstLine="0"/>
               <w:jc w:val="left"/>
             </w:pPr>
             <w:r/>
@@ -456,6 +464,7 @@
           <w:p>
             <w:pPr>
               <w:spacing w:before="0" w:after="0" w:line="240" w:lineRule="auto"/>
+              <w:ind w:left="0" w:right="0" w:firstLine="0"/>
               <w:jc w:val="left"/>
             </w:pPr>
             <w:r/>
@@ -491,6 +500,7 @@
           <w:p>
             <w:pPr>
               <w:spacing w:before="0" w:after="0" w:line="240" w:lineRule="auto"/>
+              <w:ind w:left="0" w:right="0" w:firstLine="0"/>
               <w:jc w:val="left"/>
             </w:pPr>
             <w:r/>
@@ -526,6 +536,7 @@
           <w:p>
             <w:pPr>
               <w:spacing w:before="0" w:after="0" w:line="240" w:lineRule="auto"/>
+              <w:ind w:left="0" w:right="0" w:firstLine="0"/>
               <w:jc w:val="left"/>
             </w:pPr>
             <w:r/>
@@ -561,6 +572,7 @@
           <w:p>
             <w:pPr>
               <w:spacing w:before="0" w:after="0" w:line="240" w:lineRule="auto"/>
+              <w:ind w:left="0" w:right="0" w:firstLine="0"/>
               <w:jc w:val="left"/>
             </w:pPr>
             <w:r/>
@@ -596,6 +608,7 @@
           <w:p>
             <w:pPr>
               <w:spacing w:before="0" w:after="0" w:line="240" w:lineRule="auto"/>
+              <w:ind w:left="0" w:right="0" w:firstLine="0"/>
               <w:jc w:val="left"/>
             </w:pPr>
             <w:r/>
@@ -633,6 +646,7 @@
           <w:p>
             <w:pPr>
               <w:spacing w:before="0" w:after="0" w:line="240" w:lineRule="auto"/>
+              <w:ind w:left="0" w:right="0" w:firstLine="0"/>
               <w:jc w:val="left"/>
             </w:pPr>
             <w:r/>
@@ -668,6 +682,7 @@
           <w:p>
             <w:pPr>
               <w:spacing w:before="0" w:after="0" w:line="240" w:lineRule="auto"/>
+              <w:ind w:left="0" w:right="0" w:firstLine="0"/>
               <w:jc w:val="left"/>
             </w:pPr>
             <w:r/>
@@ -703,6 +718,7 @@
           <w:p>
             <w:pPr>
               <w:spacing w:before="0" w:after="0" w:line="240" w:lineRule="auto"/>
+              <w:ind w:left="0" w:right="0" w:firstLine="0"/>
               <w:jc w:val="left"/>
             </w:pPr>
             <w:r/>
@@ -738,6 +754,7 @@
           <w:p>
             <w:pPr>
               <w:spacing w:before="0" w:after="0" w:line="240" w:lineRule="auto"/>
+              <w:ind w:left="0" w:right="0" w:firstLine="0"/>
               <w:jc w:val="left"/>
             </w:pPr>
             <w:r/>
@@ -773,6 +790,7 @@
           <w:p>
             <w:pPr>
               <w:spacing w:before="0" w:after="0" w:line="240" w:lineRule="auto"/>
+              <w:ind w:left="0" w:right="0" w:firstLine="0"/>
               <w:jc w:val="left"/>
             </w:pPr>
             <w:r/>
@@ -810,6 +828,7 @@
           <w:p>
             <w:pPr>
               <w:spacing w:before="0" w:after="0" w:line="240" w:lineRule="auto"/>
+              <w:ind w:left="0" w:right="0" w:firstLine="0"/>
               <w:jc w:val="left"/>
             </w:pPr>
             <w:r/>
@@ -845,6 +864,7 @@
           <w:p>
             <w:pPr>
               <w:spacing w:before="0" w:after="0" w:line="240" w:lineRule="auto"/>
+              <w:ind w:left="0" w:right="0" w:firstLine="0"/>
               <w:jc w:val="left"/>
             </w:pPr>
             <w:r/>
@@ -880,6 +900,7 @@
           <w:p>
             <w:pPr>
               <w:spacing w:before="0" w:after="0" w:line="240" w:lineRule="auto"/>
+              <w:ind w:left="0" w:right="0" w:firstLine="0"/>
               <w:jc w:val="left"/>
             </w:pPr>
             <w:r/>
@@ -915,6 +936,7 @@
           <w:p>
             <w:pPr>
               <w:spacing w:before="0" w:after="0" w:line="240" w:lineRule="auto"/>
+              <w:ind w:left="0" w:right="0" w:firstLine="0"/>
               <w:jc w:val="left"/>
             </w:pPr>
             <w:r/>
@@ -950,6 +972,7 @@
           <w:p>
             <w:pPr>
               <w:spacing w:before="0" w:after="0" w:line="240" w:lineRule="auto"/>
+              <w:ind w:left="0" w:right="0" w:firstLine="0"/>
               <w:jc w:val="left"/>
             </w:pPr>
             <w:r/>
@@ -987,6 +1010,7 @@
           <w:p>
             <w:pPr>
               <w:spacing w:before="0" w:after="0" w:line="240" w:lineRule="auto"/>
+              <w:ind w:left="0" w:right="0" w:firstLine="0"/>
               <w:jc w:val="left"/>
             </w:pPr>
             <w:r/>
@@ -1022,6 +1046,7 @@
           <w:p>
             <w:pPr>
               <w:spacing w:before="0" w:after="0" w:line="240" w:lineRule="auto"/>
+              <w:ind w:left="0" w:right="0" w:firstLine="0"/>
               <w:jc w:val="left"/>
             </w:pPr>
             <w:r/>
@@ -1057,6 +1082,7 @@
           <w:p>
             <w:pPr>
               <w:spacing w:before="0" w:after="0" w:line="240" w:lineRule="auto"/>
+              <w:ind w:left="0" w:right="0" w:firstLine="0"/>
               <w:jc w:val="left"/>
             </w:pPr>
             <w:r/>
@@ -1092,6 +1118,7 @@
           <w:p>
             <w:pPr>
               <w:spacing w:before="0" w:after="0" w:line="240" w:lineRule="auto"/>
+              <w:ind w:left="0" w:right="0" w:firstLine="0"/>
               <w:jc w:val="left"/>
             </w:pPr>
             <w:r/>
@@ -1127,6 +1154,7 @@
           <w:p>
             <w:pPr>
               <w:spacing w:before="0" w:after="0" w:line="240" w:lineRule="auto"/>
+              <w:ind w:left="0" w:right="0" w:firstLine="0"/>
               <w:jc w:val="left"/>
             </w:pPr>
             <w:r/>
@@ -1164,6 +1192,7 @@
           <w:p>
             <w:pPr>
               <w:spacing w:before="0" w:after="0" w:line="240" w:lineRule="auto"/>
+              <w:ind w:left="0" w:right="0" w:firstLine="0"/>
               <w:jc w:val="left"/>
             </w:pPr>
             <w:r/>
@@ -1199,6 +1228,7 @@
           <w:p>
             <w:pPr>
               <w:spacing w:before="0" w:after="0" w:line="240" w:lineRule="auto"/>
+              <w:ind w:left="0" w:right="0" w:firstLine="0"/>
               <w:jc w:val="left"/>
             </w:pPr>
             <w:r/>
@@ -1234,6 +1264,7 @@
           <w:p>
             <w:pPr>
               <w:spacing w:before="0" w:after="0" w:line="240" w:lineRule="auto"/>
+              <w:ind w:left="0" w:right="0" w:firstLine="0"/>
               <w:jc w:val="left"/>
             </w:pPr>
             <w:r/>
@@ -1269,6 +1300,7 @@
           <w:p>
             <w:pPr>
               <w:spacing w:before="0" w:after="0" w:line="240" w:lineRule="auto"/>
+              <w:ind w:left="0" w:right="0" w:firstLine="0"/>
               <w:jc w:val="left"/>
             </w:pPr>
             <w:r/>
@@ -1304,6 +1336,7 @@
           <w:p>
             <w:pPr>
               <w:spacing w:before="0" w:after="0" w:line="240" w:lineRule="auto"/>
+              <w:ind w:left="0" w:right="0" w:firstLine="0"/>
               <w:jc w:val="left"/>
             </w:pPr>
             <w:r/>
@@ -1341,6 +1374,7 @@
           <w:p>
             <w:pPr>
               <w:spacing w:before="0" w:after="0" w:line="240" w:lineRule="auto"/>
+              <w:ind w:left="0" w:right="0" w:firstLine="0"/>
               <w:jc w:val="left"/>
             </w:pPr>
             <w:r/>
@@ -1376,6 +1410,7 @@
           <w:p>
             <w:pPr>
               <w:spacing w:before="0" w:after="0" w:line="240" w:lineRule="auto"/>
+              <w:ind w:left="0" w:right="0" w:firstLine="0"/>
               <w:jc w:val="left"/>
             </w:pPr>
             <w:r/>
@@ -1411,6 +1446,7 @@
           <w:p>
             <w:pPr>
               <w:spacing w:before="0" w:after="0" w:line="240" w:lineRule="auto"/>
+              <w:ind w:left="0" w:right="0" w:firstLine="0"/>
               <w:jc w:val="left"/>
             </w:pPr>
             <w:r/>
@@ -1446,6 +1482,7 @@
           <w:p>
             <w:pPr>
               <w:spacing w:before="0" w:after="0" w:line="240" w:lineRule="auto"/>
+              <w:ind w:left="0" w:right="0" w:firstLine="0"/>
               <w:jc w:val="left"/>
             </w:pPr>
             <w:r/>
@@ -1481,6 +1518,7 @@
           <w:p>
             <w:pPr>
               <w:spacing w:before="0" w:after="0" w:line="240" w:lineRule="auto"/>
+              <w:ind w:left="0" w:right="0" w:firstLine="0"/>
               <w:jc w:val="left"/>
             </w:pPr>
             <w:r/>
@@ -1499,6 +1537,7 @@
     <w:p>
       <w:pPr>
         <w:spacing w:before="20" w:after="40" w:line="240" w:lineRule="auto"/>
+        <w:ind w:left="0" w:right="0" w:firstLine="0"/>
         <w:jc w:val="left"/>
       </w:pPr>
       <w:r>
@@ -1570,6 +1609,8 @@
     <w:p>
       <w:pPr>
         <w:pStyle w:val="tablecaption"/>
+        <w:spacing w:before="80" w:after="20" w:line="240" w:lineRule="auto"/>
+        <w:ind w:left="0" w:right="0" w:firstLine="0"/>
       </w:pPr>
       <w:r>
         <w:rPr>
@@ -1591,6 +1632,7 @@
         <w:jc w:val="center"/>
         <w:tblLayout w:type="fixed"/>
         <w:tblLook w:firstColumn="1" w:firstRow="1" w:lastColumn="0" w:lastRow="0" w:noHBand="0" w:noVBand="1" w:val="04A0"/>
+        <w:tblInd w:w="0" w:type="dxa"/>
       </w:tblPr>
       <w:tblGrid>
         <w:gridCol w:w="1861"/>
@@ -1626,6 +1668,7 @@
           <w:p>
             <w:pPr>
               <w:spacing w:before="0" w:after="0" w:line="240" w:lineRule="auto"/>
+              <w:ind w:left="0" w:right="0" w:firstLine="0"/>
               <w:jc w:val="left"/>
             </w:pPr>
             <w:r/>
@@ -1661,6 +1704,7 @@
           <w:p>
             <w:pPr>
               <w:spacing w:before="0" w:after="0" w:line="240" w:lineRule="auto"/>
+              <w:ind w:left="0" w:right="0" w:firstLine="0"/>
               <w:jc w:val="center"/>
             </w:pPr>
             <w:r/>
@@ -1696,6 +1740,7 @@
           <w:p>
             <w:pPr>
               <w:spacing w:before="0" w:after="0" w:line="240" w:lineRule="auto"/>
+              <w:ind w:left="0" w:right="0" w:firstLine="0"/>
               <w:jc w:val="center"/>
             </w:pPr>
             <w:r/>
@@ -1731,6 +1776,7 @@
           <w:p>
             <w:pPr>
               <w:spacing w:before="0" w:after="0" w:line="240" w:lineRule="auto"/>
+              <w:ind w:left="0" w:right="0" w:firstLine="0"/>
               <w:jc w:val="center"/>
             </w:pPr>
             <w:r/>
@@ -1766,6 +1812,7 @@
           <w:p>
             <w:pPr>
               <w:spacing w:before="0" w:after="0" w:line="240" w:lineRule="auto"/>
+              <w:ind w:left="0" w:right="0" w:firstLine="0"/>
               <w:jc w:val="center"/>
             </w:pPr>
             <w:r/>
@@ -1801,6 +1848,7 @@
           <w:p>
             <w:pPr>
               <w:spacing w:before="0" w:after="0" w:line="240" w:lineRule="auto"/>
+              <w:ind w:left="0" w:right="0" w:firstLine="0"/>
               <w:jc w:val="center"/>
             </w:pPr>
             <w:r/>
@@ -1838,6 +1886,7 @@
           <w:p>
             <w:pPr>
               <w:spacing w:before="0" w:after="0" w:line="240" w:lineRule="auto"/>
+              <w:ind w:left="0" w:right="0" w:firstLine="0"/>
               <w:jc w:val="left"/>
             </w:pPr>
             <w:r/>
@@ -1873,6 +1922,7 @@
           <w:p>
             <w:pPr>
               <w:spacing w:before="0" w:after="0" w:line="240" w:lineRule="auto"/>
+              <w:ind w:left="0" w:right="0" w:firstLine="0"/>
               <w:jc w:val="center"/>
             </w:pPr>
             <w:r/>
@@ -1908,6 +1958,7 @@
           <w:p>
             <w:pPr>
               <w:spacing w:before="0" w:after="0" w:line="240" w:lineRule="auto"/>
+              <w:ind w:left="0" w:right="0" w:firstLine="0"/>
               <w:jc w:val="center"/>
             </w:pPr>
             <w:r/>
@@ -1943,6 +1994,7 @@
           <w:p>
             <w:pPr>
               <w:spacing w:before="0" w:after="0" w:line="240" w:lineRule="auto"/>
+              <w:ind w:left="0" w:right="0" w:firstLine="0"/>
               <w:jc w:val="center"/>
             </w:pPr>
             <w:r/>
@@ -1978,6 +2030,7 @@
           <w:p>
             <w:pPr>
               <w:spacing w:before="0" w:after="0" w:line="240" w:lineRule="auto"/>
+              <w:ind w:left="0" w:right="0" w:firstLine="0"/>
               <w:jc w:val="center"/>
             </w:pPr>
             <w:r/>
@@ -2013,6 +2066,7 @@
           <w:p>
             <w:pPr>
               <w:spacing w:before="0" w:after="0" w:line="240" w:lineRule="auto"/>
+              <w:ind w:left="0" w:right="0" w:firstLine="0"/>
               <w:jc w:val="center"/>
             </w:pPr>
             <w:r/>
@@ -2050,6 +2104,7 @@
           <w:p>
             <w:pPr>
               <w:spacing w:before="0" w:after="0" w:line="240" w:lineRule="auto"/>
+              <w:ind w:left="0" w:right="0" w:firstLine="0"/>
               <w:jc w:val="left"/>
             </w:pPr>
             <w:r/>
@@ -2085,6 +2140,7 @@
           <w:p>
             <w:pPr>
               <w:spacing w:before="0" w:after="0" w:line="240" w:lineRule="auto"/>
+              <w:ind w:left="0" w:right="0" w:firstLine="0"/>
               <w:jc w:val="center"/>
             </w:pPr>
             <w:r/>
@@ -2120,6 +2176,7 @@
           <w:p>
             <w:pPr>
               <w:spacing w:before="0" w:after="0" w:line="240" w:lineRule="auto"/>
+              <w:ind w:left="0" w:right="0" w:firstLine="0"/>
               <w:jc w:val="center"/>
             </w:pPr>
             <w:r/>
@@ -2155,6 +2212,7 @@
           <w:p>
             <w:pPr>
               <w:spacing w:before="0" w:after="0" w:line="240" w:lineRule="auto"/>
+              <w:ind w:left="0" w:right="0" w:firstLine="0"/>
               <w:jc w:val="center"/>
             </w:pPr>
             <w:r/>
@@ -2190,6 +2248,7 @@
           <w:p>
             <w:pPr>
               <w:spacing w:before="0" w:after="0" w:line="240" w:lineRule="auto"/>
+              <w:ind w:left="0" w:right="0" w:firstLine="0"/>
               <w:jc w:val="center"/>
             </w:pPr>
             <w:r/>
@@ -2225,6 +2284,7 @@
           <w:p>
             <w:pPr>
               <w:spacing w:before="0" w:after="0" w:line="240" w:lineRule="auto"/>
+              <w:ind w:left="0" w:right="0" w:firstLine="0"/>
               <w:jc w:val="center"/>
             </w:pPr>
             <w:r/>
@@ -2262,6 +2322,7 @@
           <w:p>
             <w:pPr>
               <w:spacing w:before="0" w:after="0" w:line="240" w:lineRule="auto"/>
+              <w:ind w:left="0" w:right="0" w:firstLine="0"/>
               <w:jc w:val="left"/>
             </w:pPr>
             <w:r/>
@@ -2297,6 +2358,7 @@
           <w:p>
             <w:pPr>
               <w:spacing w:before="0" w:after="0" w:line="240" w:lineRule="auto"/>
+              <w:ind w:left="0" w:right="0" w:firstLine="0"/>
               <w:jc w:val="center"/>
             </w:pPr>
             <w:r/>
@@ -2332,6 +2394,7 @@
           <w:p>
             <w:pPr>
               <w:spacing w:before="0" w:after="0" w:line="240" w:lineRule="auto"/>
+              <w:ind w:left="0" w:right="0" w:firstLine="0"/>
               <w:jc w:val="center"/>
             </w:pPr>
             <w:r/>
@@ -2367,6 +2430,7 @@
           <w:p>
             <w:pPr>
               <w:spacing w:before="0" w:after="0" w:line="240" w:lineRule="auto"/>
+              <w:ind w:left="0" w:right="0" w:firstLine="0"/>
               <w:jc w:val="center"/>
             </w:pPr>
             <w:r/>
@@ -2402,6 +2466,7 @@
           <w:p>
             <w:pPr>
               <w:spacing w:before="0" w:after="0" w:line="240" w:lineRule="auto"/>
+              <w:ind w:left="0" w:right="0" w:firstLine="0"/>
               <w:jc w:val="center"/>
             </w:pPr>
             <w:r/>
@@ -2437,6 +2502,7 @@
           <w:p>
             <w:pPr>
               <w:spacing w:before="0" w:after="0" w:line="240" w:lineRule="auto"/>
+              <w:ind w:left="0" w:right="0" w:firstLine="0"/>
               <w:jc w:val="center"/>
             </w:pPr>
             <w:r/>
@@ -2474,6 +2540,7 @@
           <w:p>
             <w:pPr>
               <w:spacing w:before="0" w:after="0" w:line="240" w:lineRule="auto"/>
+              <w:ind w:left="0" w:right="0" w:firstLine="0"/>
               <w:jc w:val="left"/>
             </w:pPr>
             <w:r/>
@@ -2509,6 +2576,7 @@
           <w:p>
             <w:pPr>
               <w:spacing w:before="0" w:after="0" w:line="240" w:lineRule="auto"/>
+              <w:ind w:left="0" w:right="0" w:firstLine="0"/>
               <w:jc w:val="center"/>
             </w:pPr>
             <w:r/>
@@ -2544,6 +2612,7 @@
           <w:p>
             <w:pPr>
               <w:spacing w:before="0" w:after="0" w:line="240" w:lineRule="auto"/>
+              <w:ind w:left="0" w:right="0" w:firstLine="0"/>
               <w:jc w:val="center"/>
             </w:pPr>
             <w:r/>
@@ -2579,6 +2648,7 @@
           <w:p>
             <w:pPr>
               <w:spacing w:before="0" w:after="0" w:line="240" w:lineRule="auto"/>
+              <w:ind w:left="0" w:right="0" w:firstLine="0"/>
               <w:jc w:val="center"/>
             </w:pPr>
             <w:r/>
@@ -2614,6 +2684,7 @@
           <w:p>
             <w:pPr>
               <w:spacing w:before="0" w:after="0" w:line="240" w:lineRule="auto"/>
+              <w:ind w:left="0" w:right="0" w:firstLine="0"/>
               <w:jc w:val="center"/>
             </w:pPr>
             <w:r/>
@@ -2649,6 +2720,7 @@
           <w:p>
             <w:pPr>
               <w:spacing w:before="0" w:after="0" w:line="240" w:lineRule="auto"/>
+              <w:ind w:left="0" w:right="0" w:firstLine="0"/>
               <w:jc w:val="center"/>
             </w:pPr>
             <w:r/>
@@ -2686,6 +2758,7 @@
           <w:p>
             <w:pPr>
               <w:spacing w:before="0" w:after="0" w:line="240" w:lineRule="auto"/>
+              <w:ind w:left="0" w:right="0" w:firstLine="0"/>
               <w:jc w:val="left"/>
             </w:pPr>
             <w:r/>
@@ -2721,6 +2794,7 @@
           <w:p>
             <w:pPr>
               <w:spacing w:before="0" w:after="0" w:line="240" w:lineRule="auto"/>
+              <w:ind w:left="0" w:right="0" w:firstLine="0"/>
               <w:jc w:val="center"/>
             </w:pPr>
             <w:r/>
@@ -2756,6 +2830,7 @@
           <w:p>
             <w:pPr>
               <w:spacing w:before="0" w:after="0" w:line="240" w:lineRule="auto"/>
+              <w:ind w:left="0" w:right="0" w:firstLine="0"/>
               <w:jc w:val="center"/>
             </w:pPr>
             <w:r/>
@@ -2791,6 +2866,7 @@
           <w:p>
             <w:pPr>
               <w:spacing w:before="0" w:after="0" w:line="240" w:lineRule="auto"/>
+              <w:ind w:left="0" w:right="0" w:firstLine="0"/>
               <w:jc w:val="center"/>
             </w:pPr>
             <w:r/>
@@ -2826,6 +2902,7 @@
           <w:p>
             <w:pPr>
               <w:spacing w:before="0" w:after="0" w:line="240" w:lineRule="auto"/>
+              <w:ind w:left="0" w:right="0" w:firstLine="0"/>
               <w:jc w:val="center"/>
             </w:pPr>
             <w:r/>
@@ -2861,6 +2938,7 @@
           <w:p>
             <w:pPr>
               <w:spacing w:before="0" w:after="0" w:line="240" w:lineRule="auto"/>
+              <w:ind w:left="0" w:right="0" w:firstLine="0"/>
               <w:jc w:val="center"/>
             </w:pPr>
             <w:r/>
@@ -2879,6 +2957,7 @@
     <w:p>
       <w:pPr>
         <w:spacing w:before="20" w:after="40" w:line="240" w:lineRule="auto"/>
+        <w:ind w:left="0" w:right="0" w:firstLine="0"/>
         <w:jc w:val="left"/>
       </w:pPr>
       <w:r>
@@ -2948,6 +3027,8 @@
     <w:p>
       <w:pPr>
         <w:pStyle w:val="tablecaption"/>
+        <w:spacing w:before="80" w:after="20" w:line="240" w:lineRule="auto"/>
+        <w:ind w:left="0" w:right="0" w:firstLine="0"/>
       </w:pPr>
       <w:r>
         <w:rPr>
@@ -2969,6 +3050,7 @@
         <w:jc w:val="center"/>
         <w:tblLayout w:type="fixed"/>
         <w:tblLook w:firstColumn="1" w:firstRow="1" w:lastColumn="0" w:lastRow="0" w:noHBand="0" w:noVBand="1" w:val="04A0"/>
+        <w:tblInd w:w="0" w:type="dxa"/>
       </w:tblPr>
       <w:tblGrid>
         <w:gridCol w:w="1515"/>
@@ -3001,6 +3083,7 @@
           <w:p>
             <w:pPr>
               <w:spacing w:before="0" w:after="0" w:line="240" w:lineRule="auto"/>
+              <w:ind w:left="0" w:right="0" w:firstLine="0"/>
               <w:jc w:val="left"/>
             </w:pPr>
             <w:r/>
@@ -3036,6 +3119,7 @@
           <w:p>
             <w:pPr>
               <w:spacing w:before="0" w:after="0" w:line="240" w:lineRule="auto"/>
+              <w:ind w:left="0" w:right="0" w:firstLine="0"/>
               <w:jc w:val="left"/>
             </w:pPr>
             <w:r/>
@@ -3071,6 +3155,7 @@
           <w:p>
             <w:pPr>
               <w:spacing w:before="0" w:after="0" w:line="240" w:lineRule="auto"/>
+              <w:ind w:left="0" w:right="0" w:firstLine="0"/>
               <w:jc w:val="left"/>
             </w:pPr>
             <w:r/>
@@ -3108,6 +3193,7 @@
           <w:p>
             <w:pPr>
               <w:spacing w:before="0" w:after="0" w:line="240" w:lineRule="auto"/>
+              <w:ind w:left="0" w:right="0" w:firstLine="0"/>
               <w:jc w:val="left"/>
             </w:pPr>
             <w:r/>
@@ -3143,6 +3229,7 @@
           <w:p>
             <w:pPr>
               <w:spacing w:before="0" w:after="0" w:line="240" w:lineRule="auto"/>
+              <w:ind w:left="0" w:right="0" w:firstLine="0"/>
               <w:jc w:val="left"/>
             </w:pPr>
             <w:r/>
@@ -3178,6 +3265,7 @@
           <w:p>
             <w:pPr>
               <w:spacing w:before="0" w:after="0" w:line="240" w:lineRule="auto"/>
+              <w:ind w:left="0" w:right="0" w:firstLine="0"/>
               <w:jc w:val="left"/>
             </w:pPr>
             <w:r/>
@@ -3215,6 +3303,7 @@
           <w:p>
             <w:pPr>
               <w:spacing w:before="0" w:after="0" w:line="240" w:lineRule="auto"/>
+              <w:ind w:left="0" w:right="0" w:firstLine="0"/>
               <w:jc w:val="left"/>
             </w:pPr>
             <w:r/>
@@ -3250,6 +3339,7 @@
           <w:p>
             <w:pPr>
               <w:spacing w:before="0" w:after="0" w:line="240" w:lineRule="auto"/>
+              <w:ind w:left="0" w:right="0" w:firstLine="0"/>
               <w:jc w:val="left"/>
             </w:pPr>
             <w:r/>
@@ -3285,6 +3375,7 @@
           <w:p>
             <w:pPr>
               <w:spacing w:before="0" w:after="0" w:line="240" w:lineRule="auto"/>
+              <w:ind w:left="0" w:right="0" w:firstLine="0"/>
               <w:jc w:val="left"/>
             </w:pPr>
             <w:r/>
@@ -3322,6 +3413,7 @@
           <w:p>
             <w:pPr>
               <w:spacing w:before="0" w:after="0" w:line="240" w:lineRule="auto"/>
+              <w:ind w:left="0" w:right="0" w:firstLine="0"/>
               <w:jc w:val="left"/>
             </w:pPr>
             <w:r/>
@@ -3357,6 +3449,7 @@
           <w:p>
             <w:pPr>
               <w:spacing w:before="0" w:after="0" w:line="240" w:lineRule="auto"/>
+              <w:ind w:left="0" w:right="0" w:firstLine="0"/>
               <w:jc w:val="left"/>
             </w:pPr>
             <w:r/>
@@ -3392,6 +3485,7 @@
           <w:p>
             <w:pPr>
               <w:spacing w:before="0" w:after="0" w:line="240" w:lineRule="auto"/>
+              <w:ind w:left="0" w:right="0" w:firstLine="0"/>
               <w:jc w:val="left"/>
             </w:pPr>
             <w:r/>
@@ -3429,6 +3523,7 @@
           <w:p>
             <w:pPr>
               <w:spacing w:before="0" w:after="0" w:line="240" w:lineRule="auto"/>
+              <w:ind w:left="0" w:right="0" w:firstLine="0"/>
               <w:jc w:val="left"/>
             </w:pPr>
             <w:r/>
@@ -3464,6 +3559,7 @@
           <w:p>
             <w:pPr>
               <w:spacing w:before="0" w:after="0" w:line="240" w:lineRule="auto"/>
+              <w:ind w:left="0" w:right="0" w:firstLine="0"/>
               <w:jc w:val="left"/>
             </w:pPr>
             <w:r/>
@@ -3499,6 +3595,7 @@
           <w:p>
             <w:pPr>
               <w:spacing w:before="0" w:after="0" w:line="240" w:lineRule="auto"/>
+              <w:ind w:left="0" w:right="0" w:firstLine="0"/>
               <w:jc w:val="left"/>
             </w:pPr>
             <w:r/>
@@ -3536,6 +3633,7 @@
           <w:p>
             <w:pPr>
               <w:spacing w:before="0" w:after="0" w:line="240" w:lineRule="auto"/>
+              <w:ind w:left="0" w:right="0" w:firstLine="0"/>
               <w:jc w:val="left"/>
             </w:pPr>
             <w:r/>
@@ -3571,6 +3669,7 @@
           <w:p>
             <w:pPr>
               <w:spacing w:before="0" w:after="0" w:line="240" w:lineRule="auto"/>
+              <w:ind w:left="0" w:right="0" w:firstLine="0"/>
               <w:jc w:val="left"/>
             </w:pPr>
             <w:r/>
@@ -3606,6 +3705,7 @@
           <w:p>
             <w:pPr>
               <w:spacing w:before="0" w:after="0" w:line="240" w:lineRule="auto"/>
+              <w:ind w:left="0" w:right="0" w:firstLine="0"/>
               <w:jc w:val="left"/>
             </w:pPr>
             <w:r/>
@@ -3643,6 +3743,7 @@
           <w:p>
             <w:pPr>
               <w:spacing w:before="0" w:after="0" w:line="240" w:lineRule="auto"/>
+              <w:ind w:left="0" w:right="0" w:firstLine="0"/>
               <w:jc w:val="left"/>
             </w:pPr>
             <w:r/>
@@ -3678,6 +3779,7 @@
           <w:p>
             <w:pPr>
               <w:spacing w:before="0" w:after="0" w:line="240" w:lineRule="auto"/>
+              <w:ind w:left="0" w:right="0" w:firstLine="0"/>
               <w:jc w:val="left"/>
             </w:pPr>
             <w:r/>
@@ -3713,6 +3815,7 @@
           <w:p>
             <w:pPr>
               <w:spacing w:before="0" w:after="0" w:line="240" w:lineRule="auto"/>
+              <w:ind w:left="0" w:right="0" w:firstLine="0"/>
               <w:jc w:val="left"/>
             </w:pPr>
             <w:r/>
@@ -3750,6 +3853,7 @@
           <w:p>
             <w:pPr>
               <w:spacing w:before="0" w:after="0" w:line="240" w:lineRule="auto"/>
+              <w:ind w:left="0" w:right="0" w:firstLine="0"/>
               <w:jc w:val="left"/>
             </w:pPr>
             <w:r/>
@@ -3785,6 +3889,7 @@
           <w:p>
             <w:pPr>
               <w:spacing w:before="0" w:after="0" w:line="240" w:lineRule="auto"/>
+              <w:ind w:left="0" w:right="0" w:firstLine="0"/>
               <w:jc w:val="left"/>
             </w:pPr>
             <w:r/>
@@ -3820,6 +3925,7 @@
           <w:p>
             <w:pPr>
               <w:spacing w:before="0" w:after="0" w:line="240" w:lineRule="auto"/>
+              <w:ind w:left="0" w:right="0" w:firstLine="0"/>
               <w:jc w:val="left"/>
             </w:pPr>
             <w:r/>
@@ -3857,6 +3963,7 @@
           <w:p>
             <w:pPr>
               <w:spacing w:before="0" w:after="0" w:line="240" w:lineRule="auto"/>
+              <w:ind w:left="0" w:right="0" w:firstLine="0"/>
               <w:jc w:val="left"/>
             </w:pPr>
             <w:r/>
@@ -3892,6 +3999,7 @@
           <w:p>
             <w:pPr>
               <w:spacing w:before="0" w:after="0" w:line="240" w:lineRule="auto"/>
+              <w:ind w:left="0" w:right="0" w:firstLine="0"/>
               <w:jc w:val="left"/>
             </w:pPr>
             <w:r/>
@@ -3927,6 +4035,7 @@
           <w:p>
             <w:pPr>
               <w:spacing w:before="0" w:after="0" w:line="240" w:lineRule="auto"/>
+              <w:ind w:left="0" w:right="0" w:firstLine="0"/>
               <w:jc w:val="left"/>
             </w:pPr>
             <w:r/>
@@ -3945,6 +4054,7 @@
     <w:p>
       <w:pPr>
         <w:spacing w:before="20" w:after="40" w:line="240" w:lineRule="auto"/>
+        <w:ind w:left="0" w:right="0" w:firstLine="0"/>
         <w:jc w:val="left"/>
       </w:pPr>
       <w:r>
@@ -3974,6 +4084,8 @@
     <w:p>
       <w:pPr>
         <w:pStyle w:val="tablecaption"/>
+        <w:spacing w:before="80" w:after="20" w:line="240" w:lineRule="auto"/>
+        <w:ind w:left="0" w:right="0" w:firstLine="0"/>
       </w:pPr>
       <w:r>
         <w:rPr>
@@ -3995,6 +4107,7 @@
         <w:jc w:val="center"/>
         <w:tblLayout w:type="fixed"/>
         <w:tblLook w:firstColumn="1" w:firstRow="1" w:lastColumn="0" w:lastRow="0" w:noHBand="0" w:noVBand="1" w:val="04A0"/>
+        <w:tblInd w:w="0" w:type="dxa"/>
       </w:tblPr>
       <w:tblGrid>
         <w:gridCol w:w="1025"/>
@@ -4035,6 +4148,7 @@
           <w:p>
             <w:pPr>
               <w:spacing w:before="0" w:after="0" w:line="240" w:lineRule="auto"/>
+              <w:ind w:left="0" w:right="0" w:firstLine="0"/>
               <w:jc w:val="left"/>
             </w:pPr>
             <w:r/>
@@ -4071,6 +4185,7 @@
           <w:p>
             <w:pPr>
               <w:spacing w:before="0" w:after="0" w:line="240" w:lineRule="auto"/>
+              <w:ind w:left="0" w:right="0" w:firstLine="0"/>
               <w:jc w:val="center"/>
             </w:pPr>
             <w:r/>
@@ -4107,6 +4222,7 @@
           <w:p>
             <w:pPr>
               <w:spacing w:before="0" w:after="0" w:line="240" w:lineRule="auto"/>
+              <w:ind w:left="0" w:right="0" w:firstLine="0"/>
               <w:jc w:val="center"/>
             </w:pPr>
             <w:r/>
@@ -4143,6 +4259,7 @@
           <w:p>
             <w:pPr>
               <w:spacing w:before="0" w:after="0" w:line="240" w:lineRule="auto"/>
+              <w:ind w:left="0" w:right="0" w:firstLine="0"/>
               <w:jc w:val="center"/>
             </w:pPr>
             <w:r/>
@@ -4179,6 +4296,7 @@
           <w:p>
             <w:pPr>
               <w:spacing w:before="0" w:after="0" w:line="240" w:lineRule="auto"/>
+              <w:ind w:left="0" w:right="0" w:firstLine="0"/>
               <w:jc w:val="center"/>
             </w:pPr>
             <w:r/>
@@ -4215,6 +4333,7 @@
           <w:p>
             <w:pPr>
               <w:spacing w:before="0" w:after="0" w:line="240" w:lineRule="auto"/>
+              <w:ind w:left="0" w:right="0" w:firstLine="0"/>
               <w:jc w:val="center"/>
             </w:pPr>
             <w:r/>
@@ -4251,6 +4370,7 @@
           <w:p>
             <w:pPr>
               <w:spacing w:before="0" w:after="0" w:line="240" w:lineRule="auto"/>
+              <w:ind w:left="0" w:right="0" w:firstLine="0"/>
               <w:jc w:val="center"/>
             </w:pPr>
             <w:r/>
@@ -4287,6 +4407,7 @@
           <w:p>
             <w:pPr>
               <w:spacing w:before="0" w:after="0" w:line="240" w:lineRule="auto"/>
+              <w:ind w:left="0" w:right="0" w:firstLine="0"/>
               <w:jc w:val="center"/>
             </w:pPr>
             <w:r/>
@@ -4323,6 +4444,7 @@
           <w:p>
             <w:pPr>
               <w:spacing w:before="0" w:after="0" w:line="240" w:lineRule="auto"/>
+              <w:ind w:left="0" w:right="0" w:firstLine="0"/>
               <w:jc w:val="center"/>
             </w:pPr>
             <w:r/>
@@ -4359,6 +4481,7 @@
           <w:p>
             <w:pPr>
               <w:spacing w:before="0" w:after="0" w:line="240" w:lineRule="auto"/>
+              <w:ind w:left="0" w:right="0" w:firstLine="0"/>
               <w:jc w:val="center"/>
             </w:pPr>
             <w:r/>
@@ -4397,6 +4520,7 @@
           <w:p>
             <w:pPr>
               <w:spacing w:before="0" w:after="0" w:line="240" w:lineRule="auto"/>
+              <w:ind w:left="0" w:right="0" w:firstLine="0"/>
               <w:jc w:val="left"/>
             </w:pPr>
             <w:r/>
@@ -4433,6 +4557,7 @@
           <w:p>
             <w:pPr>
               <w:spacing w:before="0" w:after="0" w:line="240" w:lineRule="auto"/>
+              <w:ind w:left="0" w:right="0" w:firstLine="0"/>
               <w:jc w:val="center"/>
             </w:pPr>
             <w:r/>
@@ -4469,6 +4594,7 @@
           <w:p>
             <w:pPr>
               <w:spacing w:before="0" w:after="0" w:line="240" w:lineRule="auto"/>
+              <w:ind w:left="0" w:right="0" w:firstLine="0"/>
               <w:jc w:val="center"/>
             </w:pPr>
             <w:r/>
@@ -4505,6 +4631,7 @@
           <w:p>
             <w:pPr>
               <w:spacing w:before="0" w:after="0" w:line="240" w:lineRule="auto"/>
+              <w:ind w:left="0" w:right="0" w:firstLine="0"/>
               <w:jc w:val="center"/>
             </w:pPr>
             <w:r/>
@@ -4541,6 +4668,7 @@
           <w:p>
             <w:pPr>
               <w:spacing w:before="0" w:after="0" w:line="240" w:lineRule="auto"/>
+              <w:ind w:left="0" w:right="0" w:firstLine="0"/>
               <w:jc w:val="center"/>
             </w:pPr>
             <w:r/>
@@ -4577,6 +4705,7 @@
           <w:p>
             <w:pPr>
               <w:spacing w:before="0" w:after="0" w:line="240" w:lineRule="auto"/>
+              <w:ind w:left="0" w:right="0" w:firstLine="0"/>
               <w:jc w:val="center"/>
             </w:pPr>
             <w:r/>
@@ -4613,6 +4742,7 @@
           <w:p>
             <w:pPr>
               <w:spacing w:before="0" w:after="0" w:line="240" w:lineRule="auto"/>
+              <w:ind w:left="0" w:right="0" w:firstLine="0"/>
               <w:jc w:val="center"/>
             </w:pPr>
             <w:r/>
@@ -4649,6 +4779,7 @@
           <w:p>
             <w:pPr>
               <w:spacing w:before="0" w:after="0" w:line="240" w:lineRule="auto"/>
+              <w:ind w:left="0" w:right="0" w:firstLine="0"/>
               <w:jc w:val="center"/>
             </w:pPr>
             <w:r/>
@@ -4685,6 +4816,7 @@
           <w:p>
             <w:pPr>
               <w:spacing w:before="0" w:after="0" w:line="240" w:lineRule="auto"/>
+              <w:ind w:left="0" w:right="0" w:firstLine="0"/>
               <w:jc w:val="center"/>
             </w:pPr>
             <w:r/>
@@ -4721,6 +4853,7 @@
           <w:p>
             <w:pPr>
               <w:spacing w:before="0" w:after="0" w:line="240" w:lineRule="auto"/>
+              <w:ind w:left="0" w:right="0" w:firstLine="0"/>
               <w:jc w:val="center"/>
             </w:pPr>
             <w:r/>
@@ -4759,6 +4892,7 @@
           <w:p>
             <w:pPr>
               <w:spacing w:before="0" w:after="0" w:line="240" w:lineRule="auto"/>
+              <w:ind w:left="0" w:right="0" w:firstLine="0"/>
               <w:jc w:val="left"/>
             </w:pPr>
             <w:r/>
@@ -4795,6 +4929,7 @@
           <w:p>
             <w:pPr>
               <w:spacing w:before="0" w:after="0" w:line="240" w:lineRule="auto"/>
+              <w:ind w:left="0" w:right="0" w:firstLine="0"/>
               <w:jc w:val="center"/>
             </w:pPr>
             <w:r/>
@@ -4831,6 +4966,7 @@
           <w:p>
             <w:pPr>
               <w:spacing w:before="0" w:after="0" w:line="240" w:lineRule="auto"/>
+              <w:ind w:left="0" w:right="0" w:firstLine="0"/>
               <w:jc w:val="center"/>
             </w:pPr>
             <w:r/>
@@ -4867,6 +5003,7 @@
           <w:p>
             <w:pPr>
               <w:spacing w:before="0" w:after="0" w:line="240" w:lineRule="auto"/>
+              <w:ind w:left="0" w:right="0" w:firstLine="0"/>
               <w:jc w:val="center"/>
             </w:pPr>
             <w:r/>
@@ -4903,6 +5040,7 @@
           <w:p>
             <w:pPr>
               <w:spacing w:before="0" w:after="0" w:line="240" w:lineRule="auto"/>
+              <w:ind w:left="0" w:right="0" w:firstLine="0"/>
               <w:jc w:val="center"/>
             </w:pPr>
             <w:r/>
@@ -4939,6 +5077,7 @@
           <w:p>
             <w:pPr>
               <w:spacing w:before="0" w:after="0" w:line="240" w:lineRule="auto"/>
+              <w:ind w:left="0" w:right="0" w:firstLine="0"/>
               <w:jc w:val="center"/>
             </w:pPr>
             <w:r/>
@@ -4975,6 +5114,7 @@
           <w:p>
             <w:pPr>
               <w:spacing w:before="0" w:after="0" w:line="240" w:lineRule="auto"/>
+              <w:ind w:left="0" w:right="0" w:firstLine="0"/>
               <w:jc w:val="center"/>
             </w:pPr>
             <w:r/>
@@ -5011,6 +5151,7 @@
           <w:p>
             <w:pPr>
               <w:spacing w:before="0" w:after="0" w:line="240" w:lineRule="auto"/>
+              <w:ind w:left="0" w:right="0" w:firstLine="0"/>
               <w:jc w:val="center"/>
             </w:pPr>
             <w:r/>
@@ -5047,6 +5188,7 @@
           <w:p>
             <w:pPr>
               <w:spacing w:before="0" w:after="0" w:line="240" w:lineRule="auto"/>
+              <w:ind w:left="0" w:right="0" w:firstLine="0"/>
               <w:jc w:val="center"/>
             </w:pPr>
             <w:r/>
@@ -5083,6 +5225,7 @@
           <w:p>
             <w:pPr>
               <w:spacing w:before="0" w:after="0" w:line="240" w:lineRule="auto"/>
+              <w:ind w:left="0" w:right="0" w:firstLine="0"/>
               <w:jc w:val="center"/>
             </w:pPr>
             <w:r/>
@@ -5121,6 +5264,7 @@
           <w:p>
             <w:pPr>
               <w:spacing w:before="0" w:after="0" w:line="240" w:lineRule="auto"/>
+              <w:ind w:left="0" w:right="0" w:firstLine="0"/>
               <w:jc w:val="left"/>
             </w:pPr>
             <w:r/>
@@ -5157,6 +5301,7 @@
           <w:p>
             <w:pPr>
               <w:spacing w:before="0" w:after="0" w:line="240" w:lineRule="auto"/>
+              <w:ind w:left="0" w:right="0" w:firstLine="0"/>
               <w:jc w:val="center"/>
             </w:pPr>
             <w:r/>
@@ -5193,6 +5338,7 @@
           <w:p>
             <w:pPr>
               <w:spacing w:before="0" w:after="0" w:line="240" w:lineRule="auto"/>
+              <w:ind w:left="0" w:right="0" w:firstLine="0"/>
               <w:jc w:val="center"/>
             </w:pPr>
             <w:r/>
@@ -5229,6 +5375,7 @@
           <w:p>
             <w:pPr>
               <w:spacing w:before="0" w:after="0" w:line="240" w:lineRule="auto"/>
+              <w:ind w:left="0" w:right="0" w:firstLine="0"/>
               <w:jc w:val="center"/>
             </w:pPr>
             <w:r/>
@@ -5265,6 +5412,7 @@
           <w:p>
             <w:pPr>
               <w:spacing w:before="0" w:after="0" w:line="240" w:lineRule="auto"/>
+              <w:ind w:left="0" w:right="0" w:firstLine="0"/>
               <w:jc w:val="center"/>
             </w:pPr>
             <w:r/>
@@ -5301,6 +5449,7 @@
           <w:p>
             <w:pPr>
               <w:spacing w:before="0" w:after="0" w:line="240" w:lineRule="auto"/>
+              <w:ind w:left="0" w:right="0" w:firstLine="0"/>
               <w:jc w:val="center"/>
             </w:pPr>
             <w:r/>
@@ -5337,6 +5486,7 @@
           <w:p>
             <w:pPr>
               <w:spacing w:before="0" w:after="0" w:line="240" w:lineRule="auto"/>
+              <w:ind w:left="0" w:right="0" w:firstLine="0"/>
               <w:jc w:val="center"/>
             </w:pPr>
             <w:r/>
@@ -5373,6 +5523,7 @@
           <w:p>
             <w:pPr>
               <w:spacing w:before="0" w:after="0" w:line="240" w:lineRule="auto"/>
+              <w:ind w:left="0" w:right="0" w:firstLine="0"/>
               <w:jc w:val="center"/>
             </w:pPr>
             <w:r/>
@@ -5409,6 +5560,7 @@
           <w:p>
             <w:pPr>
               <w:spacing w:before="0" w:after="0" w:line="240" w:lineRule="auto"/>
+              <w:ind w:left="0" w:right="0" w:firstLine="0"/>
               <w:jc w:val="center"/>
             </w:pPr>
             <w:r/>
@@ -5445,6 +5597,7 @@
           <w:p>
             <w:pPr>
               <w:spacing w:before="0" w:after="0" w:line="240" w:lineRule="auto"/>
+              <w:ind w:left="0" w:right="0" w:firstLine="0"/>
               <w:jc w:val="center"/>
             </w:pPr>
             <w:r/>
@@ -5483,6 +5636,7 @@
           <w:p>
             <w:pPr>
               <w:spacing w:before="0" w:after="0" w:line="240" w:lineRule="auto"/>
+              <w:ind w:left="0" w:right="0" w:firstLine="0"/>
               <w:jc w:val="left"/>
             </w:pPr>
             <w:r/>
@@ -5519,6 +5673,7 @@
           <w:p>
             <w:pPr>
               <w:spacing w:before="0" w:after="0" w:line="240" w:lineRule="auto"/>
+              <w:ind w:left="0" w:right="0" w:firstLine="0"/>
               <w:jc w:val="center"/>
             </w:pPr>
             <w:r/>
@@ -5555,6 +5710,7 @@
           <w:p>
             <w:pPr>
               <w:spacing w:before="0" w:after="0" w:line="240" w:lineRule="auto"/>
+              <w:ind w:left="0" w:right="0" w:firstLine="0"/>
               <w:jc w:val="center"/>
             </w:pPr>
             <w:r/>
@@ -5591,6 +5747,7 @@
           <w:p>
             <w:pPr>
               <w:spacing w:before="0" w:after="0" w:line="240" w:lineRule="auto"/>
+              <w:ind w:left="0" w:right="0" w:firstLine="0"/>
               <w:jc w:val="center"/>
             </w:pPr>
             <w:r/>
@@ -5627,6 +5784,7 @@
           <w:p>
             <w:pPr>
               <w:spacing w:before="0" w:after="0" w:line="240" w:lineRule="auto"/>
+              <w:ind w:left="0" w:right="0" w:firstLine="0"/>
               <w:jc w:val="center"/>
             </w:pPr>
             <w:r/>
@@ -5663,6 +5821,7 @@
           <w:p>
             <w:pPr>
               <w:spacing w:before="0" w:after="0" w:line="240" w:lineRule="auto"/>
+              <w:ind w:left="0" w:right="0" w:firstLine="0"/>
               <w:jc w:val="center"/>
             </w:pPr>
             <w:r/>
@@ -5699,6 +5858,7 @@
           <w:p>
             <w:pPr>
               <w:spacing w:before="0" w:after="0" w:line="240" w:lineRule="auto"/>
+              <w:ind w:left="0" w:right="0" w:firstLine="0"/>
               <w:jc w:val="center"/>
             </w:pPr>
             <w:r/>
@@ -5735,6 +5895,7 @@
           <w:p>
             <w:pPr>
               <w:spacing w:before="0" w:after="0" w:line="240" w:lineRule="auto"/>
+              <w:ind w:left="0" w:right="0" w:firstLine="0"/>
               <w:jc w:val="center"/>
             </w:pPr>
             <w:r/>
@@ -5771,6 +5932,7 @@
           <w:p>
             <w:pPr>
               <w:spacing w:before="0" w:after="0" w:line="240" w:lineRule="auto"/>
+              <w:ind w:left="0" w:right="0" w:firstLine="0"/>
               <w:jc w:val="center"/>
             </w:pPr>
             <w:r/>
@@ -5807,6 +5969,7 @@
           <w:p>
             <w:pPr>
               <w:spacing w:before="0" w:after="0" w:line="240" w:lineRule="auto"/>
+              <w:ind w:left="0" w:right="0" w:firstLine="0"/>
               <w:jc w:val="center"/>
             </w:pPr>
             <w:r/>
@@ -5825,6 +5988,7 @@
     <w:p>
       <w:pPr>
         <w:spacing w:before="20" w:after="40" w:line="240" w:lineRule="auto"/>
+        <w:ind w:left="0" w:right="0" w:firstLine="0"/>
         <w:jc w:val="left"/>
       </w:pPr>
       <w:r>
@@ -6035,6 +6199,8 @@
     <w:p>
       <w:pPr>
         <w:pStyle w:val="tablecaption"/>
+        <w:spacing w:before="80" w:after="20" w:line="240" w:lineRule="auto"/>
+        <w:ind w:left="0" w:right="0" w:firstLine="0"/>
       </w:pPr>
       <w:r>
         <w:rPr>
@@ -6056,6 +6222,7 @@
         <w:jc w:val="center"/>
         <w:tblLayout w:type="fixed"/>
         <w:tblLook w:firstColumn="1" w:firstRow="1" w:lastColumn="0" w:lastRow="0" w:noHBand="0" w:noVBand="1" w:val="04A0"/>
+        <w:tblInd w:w="0" w:type="dxa"/>
       </w:tblPr>
       <w:tblGrid>
         <w:gridCol w:w="1672"/>
@@ -6089,6 +6256,7 @@
           <w:p>
             <w:pPr>
               <w:spacing w:before="0" w:after="0" w:line="240" w:lineRule="auto"/>
+              <w:ind w:left="0" w:right="0" w:firstLine="0"/>
               <w:jc w:val="left"/>
             </w:pPr>
             <w:r/>
@@ -6124,6 +6292,7 @@
           <w:p>
             <w:pPr>
               <w:spacing w:before="0" w:after="0" w:line="240" w:lineRule="auto"/>
+              <w:ind w:left="0" w:right="0" w:firstLine="0"/>
               <w:jc w:val="left"/>
             </w:pPr>
             <w:r/>
@@ -6159,6 +6328,7 @@
           <w:p>
             <w:pPr>
               <w:spacing w:before="0" w:after="0" w:line="240" w:lineRule="auto"/>
+              <w:ind w:left="0" w:right="0" w:firstLine="0"/>
               <w:jc w:val="center"/>
             </w:pPr>
             <w:r/>
@@ -6194,6 +6364,7 @@
           <w:p>
             <w:pPr>
               <w:spacing w:before="0" w:after="0" w:line="240" w:lineRule="auto"/>
+              <w:ind w:left="0" w:right="0" w:firstLine="0"/>
               <w:jc w:val="center"/>
             </w:pPr>
             <w:r/>
@@ -6231,6 +6402,7 @@
           <w:p>
             <w:pPr>
               <w:spacing w:before="0" w:after="0" w:line="240" w:lineRule="auto"/>
+              <w:ind w:left="0" w:right="0" w:firstLine="0"/>
               <w:jc w:val="left"/>
             </w:pPr>
             <w:r/>
@@ -6266,6 +6438,7 @@
           <w:p>
             <w:pPr>
               <w:spacing w:before="0" w:after="0" w:line="240" w:lineRule="auto"/>
+              <w:ind w:left="0" w:right="0" w:firstLine="0"/>
               <w:jc w:val="left"/>
             </w:pPr>
             <w:r/>
@@ -6301,6 +6474,7 @@
           <w:p>
             <w:pPr>
               <w:spacing w:before="0" w:after="0" w:line="240" w:lineRule="auto"/>
+              <w:ind w:left="0" w:right="0" w:firstLine="0"/>
               <w:jc w:val="center"/>
             </w:pPr>
             <w:r/>
@@ -6336,6 +6510,7 @@
           <w:p>
             <w:pPr>
               <w:spacing w:before="0" w:after="0" w:line="240" w:lineRule="auto"/>
+              <w:ind w:left="0" w:right="0" w:firstLine="0"/>
               <w:jc w:val="center"/>
             </w:pPr>
             <w:r/>
@@ -6373,6 +6548,7 @@
           <w:p>
             <w:pPr>
               <w:spacing w:before="0" w:after="0" w:line="240" w:lineRule="auto"/>
+              <w:ind w:left="0" w:right="0" w:firstLine="0"/>
               <w:jc w:val="left"/>
             </w:pPr>
             <w:r/>
@@ -6408,6 +6584,7 @@
           <w:p>
             <w:pPr>
               <w:spacing w:before="0" w:after="0" w:line="240" w:lineRule="auto"/>
+              <w:ind w:left="0" w:right="0" w:firstLine="0"/>
               <w:jc w:val="left"/>
             </w:pPr>
             <w:r/>
@@ -6443,6 +6620,7 @@
           <w:p>
             <w:pPr>
               <w:spacing w:before="0" w:after="0" w:line="240" w:lineRule="auto"/>
+              <w:ind w:left="0" w:right="0" w:firstLine="0"/>
               <w:jc w:val="center"/>
             </w:pPr>
             <w:r/>
@@ -6478,6 +6656,7 @@
           <w:p>
             <w:pPr>
               <w:spacing w:before="0" w:after="0" w:line="240" w:lineRule="auto"/>
+              <w:ind w:left="0" w:right="0" w:firstLine="0"/>
               <w:jc w:val="center"/>
             </w:pPr>
             <w:r/>
@@ -6515,6 +6694,7 @@
           <w:p>
             <w:pPr>
               <w:spacing w:before="0" w:after="0" w:line="240" w:lineRule="auto"/>
+              <w:ind w:left="0" w:right="0" w:firstLine="0"/>
               <w:jc w:val="left"/>
             </w:pPr>
             <w:r/>
@@ -6550,6 +6730,7 @@
           <w:p>
             <w:pPr>
               <w:spacing w:before="0" w:after="0" w:line="240" w:lineRule="auto"/>
+              <w:ind w:left="0" w:right="0" w:firstLine="0"/>
               <w:jc w:val="left"/>
             </w:pPr>
             <w:r/>
@@ -6585,6 +6766,7 @@
           <w:p>
             <w:pPr>
               <w:spacing w:before="0" w:after="0" w:line="240" w:lineRule="auto"/>
+              <w:ind w:left="0" w:right="0" w:firstLine="0"/>
               <w:jc w:val="center"/>
             </w:pPr>
             <w:r/>
@@ -6620,6 +6802,7 @@
           <w:p>
             <w:pPr>
               <w:spacing w:before="0" w:after="0" w:line="240" w:lineRule="auto"/>
+              <w:ind w:left="0" w:right="0" w:firstLine="0"/>
               <w:jc w:val="center"/>
             </w:pPr>
             <w:r/>
@@ -6657,6 +6840,7 @@
           <w:p>
             <w:pPr>
               <w:spacing w:before="0" w:after="0" w:line="240" w:lineRule="auto"/>
+              <w:ind w:left="0" w:right="0" w:firstLine="0"/>
               <w:jc w:val="left"/>
             </w:pPr>
             <w:r/>
@@ -6692,6 +6876,7 @@
           <w:p>
             <w:pPr>
               <w:spacing w:before="0" w:after="0" w:line="240" w:lineRule="auto"/>
+              <w:ind w:left="0" w:right="0" w:firstLine="0"/>
               <w:jc w:val="left"/>
             </w:pPr>
             <w:r/>
@@ -6727,6 +6912,7 @@
           <w:p>
             <w:pPr>
               <w:spacing w:before="0" w:after="0" w:line="240" w:lineRule="auto"/>
+              <w:ind w:left="0" w:right="0" w:firstLine="0"/>
               <w:jc w:val="center"/>
             </w:pPr>
             <w:r/>
@@ -6762,6 +6948,7 @@
           <w:p>
             <w:pPr>
               <w:spacing w:before="0" w:after="0" w:line="240" w:lineRule="auto"/>
+              <w:ind w:left="0" w:right="0" w:firstLine="0"/>
               <w:jc w:val="center"/>
             </w:pPr>
             <w:r/>
@@ -6799,6 +6986,7 @@
           <w:p>
             <w:pPr>
               <w:spacing w:before="0" w:after="0" w:line="240" w:lineRule="auto"/>
+              <w:ind w:left="0" w:right="0" w:firstLine="0"/>
               <w:jc w:val="left"/>
             </w:pPr>
             <w:r/>
@@ -6834,6 +7022,7 @@
           <w:p>
             <w:pPr>
               <w:spacing w:before="0" w:after="0" w:line="240" w:lineRule="auto"/>
+              <w:ind w:left="0" w:right="0" w:firstLine="0"/>
               <w:jc w:val="left"/>
             </w:pPr>
             <w:r/>
@@ -6869,6 +7058,7 @@
           <w:p>
             <w:pPr>
               <w:spacing w:before="0" w:after="0" w:line="240" w:lineRule="auto"/>
+              <w:ind w:left="0" w:right="0" w:firstLine="0"/>
               <w:jc w:val="center"/>
             </w:pPr>
             <w:r/>
@@ -6904,6 +7094,7 @@
           <w:p>
             <w:pPr>
               <w:spacing w:before="0" w:after="0" w:line="240" w:lineRule="auto"/>
+              <w:ind w:left="0" w:right="0" w:firstLine="0"/>
               <w:jc w:val="center"/>
             </w:pPr>
             <w:r/>
@@ -6941,6 +7132,7 @@
           <w:p>
             <w:pPr>
               <w:spacing w:before="0" w:after="0" w:line="240" w:lineRule="auto"/>
+              <w:ind w:left="0" w:right="0" w:firstLine="0"/>
               <w:jc w:val="left"/>
             </w:pPr>
             <w:r/>
@@ -6976,6 +7168,7 @@
           <w:p>
             <w:pPr>
               <w:spacing w:before="0" w:after="0" w:line="240" w:lineRule="auto"/>
+              <w:ind w:left="0" w:right="0" w:firstLine="0"/>
               <w:jc w:val="left"/>
             </w:pPr>
             <w:r/>
@@ -7011,6 +7204,7 @@
           <w:p>
             <w:pPr>
               <w:spacing w:before="0" w:after="0" w:line="240" w:lineRule="auto"/>
+              <w:ind w:left="0" w:right="0" w:firstLine="0"/>
               <w:jc w:val="center"/>
             </w:pPr>
             <w:r/>
@@ -7046,6 +7240,7 @@
           <w:p>
             <w:pPr>
               <w:spacing w:before="0" w:after="0" w:line="240" w:lineRule="auto"/>
+              <w:ind w:left="0" w:right="0" w:firstLine="0"/>
               <w:jc w:val="center"/>
             </w:pPr>
             <w:r/>
@@ -7083,6 +7278,7 @@
           <w:p>
             <w:pPr>
               <w:spacing w:before="0" w:after="0" w:line="240" w:lineRule="auto"/>
+              <w:ind w:left="0" w:right="0" w:firstLine="0"/>
               <w:jc w:val="left"/>
             </w:pPr>
             <w:r/>
@@ -7118,6 +7314,7 @@
           <w:p>
             <w:pPr>
               <w:spacing w:before="0" w:after="0" w:line="240" w:lineRule="auto"/>
+              <w:ind w:left="0" w:right="0" w:firstLine="0"/>
               <w:jc w:val="left"/>
             </w:pPr>
             <w:r/>
@@ -7153,6 +7350,7 @@
           <w:p>
             <w:pPr>
               <w:spacing w:before="0" w:after="0" w:line="240" w:lineRule="auto"/>
+              <w:ind w:left="0" w:right="0" w:firstLine="0"/>
               <w:jc w:val="center"/>
             </w:pPr>
             <w:r/>
@@ -7188,6 +7386,7 @@
           <w:p>
             <w:pPr>
               <w:spacing w:before="0" w:after="0" w:line="240" w:lineRule="auto"/>
+              <w:ind w:left="0" w:right="0" w:firstLine="0"/>
               <w:jc w:val="center"/>
             </w:pPr>
             <w:r/>
@@ -7225,6 +7424,7 @@
           <w:p>
             <w:pPr>
               <w:spacing w:before="0" w:after="0" w:line="240" w:lineRule="auto"/>
+              <w:ind w:left="0" w:right="0" w:firstLine="0"/>
               <w:jc w:val="left"/>
             </w:pPr>
             <w:r/>
@@ -7260,6 +7460,7 @@
           <w:p>
             <w:pPr>
               <w:spacing w:before="0" w:after="0" w:line="240" w:lineRule="auto"/>
+              <w:ind w:left="0" w:right="0" w:firstLine="0"/>
               <w:jc w:val="left"/>
             </w:pPr>
             <w:r/>
@@ -7295,6 +7496,7 @@
           <w:p>
             <w:pPr>
               <w:spacing w:before="0" w:after="0" w:line="240" w:lineRule="auto"/>
+              <w:ind w:left="0" w:right="0" w:firstLine="0"/>
               <w:jc w:val="center"/>
             </w:pPr>
             <w:r/>
@@ -7330,6 +7532,7 @@
           <w:p>
             <w:pPr>
               <w:spacing w:before="0" w:after="0" w:line="240" w:lineRule="auto"/>
+              <w:ind w:left="0" w:right="0" w:firstLine="0"/>
               <w:jc w:val="center"/>
             </w:pPr>
             <w:r/>
@@ -7347,7 +7550,8 @@
     </w:tbl>
     <w:p>
       <w:pPr>
-        <w:spacing w:after="80"/>
+        <w:spacing w:before="0" w:after="80" w:line="240" w:lineRule="auto"/>
+        <w:ind w:left="0" w:right="0" w:firstLine="0"/>
       </w:pPr>
     </w:p>
     <w:p>
@@ -7367,6 +7571,8 @@
     <w:p>
       <w:pPr>
         <w:pStyle w:val="tablecaption"/>
+        <w:spacing w:before="80" w:after="20" w:line="240" w:lineRule="auto"/>
+        <w:ind w:left="0" w:right="0" w:firstLine="0"/>
       </w:pPr>
       <w:r>
         <w:rPr>
@@ -7388,6 +7594,7 @@
         <w:jc w:val="center"/>
         <w:tblLayout w:type="fixed"/>
         <w:tblLook w:firstColumn="1" w:firstRow="1" w:lastColumn="0" w:lastRow="0" w:noHBand="0" w:noVBand="1" w:val="04A0"/>
+        <w:tblInd w:w="0" w:type="dxa"/>
       </w:tblPr>
       <w:tblGrid>
         <w:gridCol w:w="1306"/>
@@ -7423,6 +7630,7 @@
           <w:p>
             <w:pPr>
               <w:spacing w:before="0" w:after="0" w:line="240" w:lineRule="auto"/>
+              <w:ind w:left="0" w:right="0" w:firstLine="0"/>
               <w:jc w:val="left"/>
             </w:pPr>
             <w:r/>
@@ -7458,6 +7666,7 @@
           <w:p>
             <w:pPr>
               <w:spacing w:before="0" w:after="0" w:line="240" w:lineRule="auto"/>
+              <w:ind w:left="0" w:right="0" w:firstLine="0"/>
               <w:jc w:val="left"/>
             </w:pPr>
             <w:r/>
@@ -7493,6 +7702,7 @@
           <w:p>
             <w:pPr>
               <w:spacing w:before="0" w:after="0" w:line="240" w:lineRule="auto"/>
+              <w:ind w:left="0" w:right="0" w:firstLine="0"/>
               <w:jc w:val="center"/>
             </w:pPr>
             <w:r/>
@@ -7528,6 +7738,7 @@
           <w:p>
             <w:pPr>
               <w:spacing w:before="0" w:after="0" w:line="240" w:lineRule="auto"/>
+              <w:ind w:left="0" w:right="0" w:firstLine="0"/>
               <w:jc w:val="center"/>
             </w:pPr>
             <w:r/>
@@ -7563,6 +7774,7 @@
           <w:p>
             <w:pPr>
               <w:spacing w:before="0" w:after="0" w:line="240" w:lineRule="auto"/>
+              <w:ind w:left="0" w:right="0" w:firstLine="0"/>
               <w:jc w:val="center"/>
             </w:pPr>
             <w:r/>
@@ -7598,6 +7810,7 @@
           <w:p>
             <w:pPr>
               <w:spacing w:before="0" w:after="0" w:line="240" w:lineRule="auto"/>
+              <w:ind w:left="0" w:right="0" w:firstLine="0"/>
               <w:jc w:val="center"/>
             </w:pPr>
             <w:r/>
@@ -7635,6 +7848,7 @@
           <w:p>
             <w:pPr>
               <w:spacing w:before="0" w:after="0" w:line="240" w:lineRule="auto"/>
+              <w:ind w:left="0" w:right="0" w:firstLine="0"/>
               <w:jc w:val="left"/>
             </w:pPr>
             <w:r/>
@@ -7670,6 +7884,7 @@
           <w:p>
             <w:pPr>
               <w:spacing w:before="0" w:after="0" w:line="240" w:lineRule="auto"/>
+              <w:ind w:left="0" w:right="0" w:firstLine="0"/>
               <w:jc w:val="left"/>
             </w:pPr>
             <w:r/>
@@ -7705,6 +7920,7 @@
           <w:p>
             <w:pPr>
               <w:spacing w:before="0" w:after="0" w:line="240" w:lineRule="auto"/>
+              <w:ind w:left="0" w:right="0" w:firstLine="0"/>
               <w:jc w:val="center"/>
             </w:pPr>
             <w:r/>
@@ -7740,6 +7956,7 @@
           <w:p>
             <w:pPr>
               <w:spacing w:before="0" w:after="0" w:line="240" w:lineRule="auto"/>
+              <w:ind w:left="0" w:right="0" w:firstLine="0"/>
               <w:jc w:val="center"/>
             </w:pPr>
             <w:r/>
@@ -7775,6 +7992,7 @@
           <w:p>
             <w:pPr>
               <w:spacing w:before="0" w:after="0" w:line="240" w:lineRule="auto"/>
+              <w:ind w:left="0" w:right="0" w:firstLine="0"/>
               <w:jc w:val="center"/>
             </w:pPr>
             <w:r/>
@@ -7810,6 +8028,7 @@
           <w:p>
             <w:pPr>
               <w:spacing w:before="0" w:after="0" w:line="240" w:lineRule="auto"/>
+              <w:ind w:left="0" w:right="0" w:firstLine="0"/>
               <w:jc w:val="center"/>
             </w:pPr>
             <w:r/>
@@ -7847,6 +8066,7 @@
           <w:p>
             <w:pPr>
               <w:spacing w:before="0" w:after="0" w:line="240" w:lineRule="auto"/>
+              <w:ind w:left="0" w:right="0" w:firstLine="0"/>
               <w:jc w:val="left"/>
             </w:pPr>
             <w:r/>
@@ -7882,6 +8102,7 @@
           <w:p>
             <w:pPr>
               <w:spacing w:before="0" w:after="0" w:line="240" w:lineRule="auto"/>
+              <w:ind w:left="0" w:right="0" w:firstLine="0"/>
               <w:jc w:val="left"/>
             </w:pPr>
             <w:r/>
@@ -7917,6 +8138,7 @@
           <w:p>
             <w:pPr>
               <w:spacing w:before="0" w:after="0" w:line="240" w:lineRule="auto"/>
+              <w:ind w:left="0" w:right="0" w:firstLine="0"/>
               <w:jc w:val="center"/>
             </w:pPr>
             <w:r/>
@@ -7952,6 +8174,7 @@
           <w:p>
             <w:pPr>
               <w:spacing w:before="0" w:after="0" w:line="240" w:lineRule="auto"/>
+              <w:ind w:left="0" w:right="0" w:firstLine="0"/>
               <w:jc w:val="center"/>
             </w:pPr>
             <w:r/>
@@ -7987,6 +8210,7 @@
           <w:p>
             <w:pPr>
               <w:spacing w:before="0" w:after="0" w:line="240" w:lineRule="auto"/>
+              <w:ind w:left="0" w:right="0" w:firstLine="0"/>
               <w:jc w:val="center"/>
             </w:pPr>
             <w:r/>
@@ -8022,6 +8246,7 @@
           <w:p>
             <w:pPr>
               <w:spacing w:before="0" w:after="0" w:line="240" w:lineRule="auto"/>
+              <w:ind w:left="0" w:right="0" w:firstLine="0"/>
               <w:jc w:val="center"/>
             </w:pPr>
             <w:r/>
@@ -8059,6 +8284,7 @@
           <w:p>
             <w:pPr>
               <w:spacing w:before="0" w:after="0" w:line="240" w:lineRule="auto"/>
+              <w:ind w:left="0" w:right="0" w:firstLine="0"/>
               <w:jc w:val="left"/>
             </w:pPr>
             <w:r/>
@@ -8094,6 +8320,7 @@
           <w:p>
             <w:pPr>
               <w:spacing w:before="0" w:after="0" w:line="240" w:lineRule="auto"/>
+              <w:ind w:left="0" w:right="0" w:firstLine="0"/>
               <w:jc w:val="left"/>
             </w:pPr>
             <w:r/>
@@ -8129,6 +8356,7 @@
           <w:p>
             <w:pPr>
               <w:spacing w:before="0" w:after="0" w:line="240" w:lineRule="auto"/>
+              <w:ind w:left="0" w:right="0" w:firstLine="0"/>
               <w:jc w:val="center"/>
             </w:pPr>
             <w:r/>
@@ -8164,6 +8392,7 @@
           <w:p>
             <w:pPr>
               <w:spacing w:before="0" w:after="0" w:line="240" w:lineRule="auto"/>
+              <w:ind w:left="0" w:right="0" w:firstLine="0"/>
               <w:jc w:val="center"/>
             </w:pPr>
             <w:r/>
@@ -8199,6 +8428,7 @@
           <w:p>
             <w:pPr>
               <w:spacing w:before="0" w:after="0" w:line="240" w:lineRule="auto"/>
+              <w:ind w:left="0" w:right="0" w:firstLine="0"/>
               <w:jc w:val="center"/>
             </w:pPr>
             <w:r/>
@@ -8234,6 +8464,7 @@
           <w:p>
             <w:pPr>
               <w:spacing w:before="0" w:after="0" w:line="240" w:lineRule="auto"/>
+              <w:ind w:left="0" w:right="0" w:firstLine="0"/>
               <w:jc w:val="center"/>
             </w:pPr>
             <w:r/>
@@ -8251,7 +8482,8 @@
     </w:tbl>
     <w:p>
       <w:pPr>
-        <w:spacing w:after="80"/>
+        <w:spacing w:before="0" w:after="80" w:line="240" w:lineRule="auto"/>
+        <w:ind w:left="0" w:right="0" w:firstLine="0"/>
       </w:pPr>
     </w:p>
     <w:p>
@@ -8277,6 +8509,8 @@
     <w:p>
       <w:pPr>
         <w:pStyle w:val="tablecaption"/>
+        <w:spacing w:before="80" w:after="20" w:line="240" w:lineRule="auto"/>
+        <w:ind w:left="0" w:right="0" w:firstLine="0"/>
       </w:pPr>
       <w:r>
         <w:rPr>
@@ -8298,6 +8532,7 @@
         <w:jc w:val="center"/>
         <w:tblLayout w:type="fixed"/>
         <w:tblLook w:firstColumn="1" w:firstRow="1" w:lastColumn="0" w:lastRow="0" w:noHBand="0" w:noVBand="1" w:val="04A0"/>
+        <w:tblInd w:w="0" w:type="dxa"/>
       </w:tblPr>
       <w:tblGrid>
         <w:gridCol w:w="1097"/>
@@ -8333,6 +8568,7 @@
           <w:p>
             <w:pPr>
               <w:spacing w:before="0" w:after="0" w:line="240" w:lineRule="auto"/>
+              <w:ind w:left="0" w:right="0" w:firstLine="0"/>
               <w:jc w:val="left"/>
             </w:pPr>
             <w:r/>
@@ -8368,6 +8604,7 @@
           <w:p>
             <w:pPr>
               <w:spacing w:before="0" w:after="0" w:line="240" w:lineRule="auto"/>
+              <w:ind w:left="0" w:right="0" w:firstLine="0"/>
               <w:jc w:val="left"/>
             </w:pPr>
             <w:r/>
@@ -8403,6 +8640,7 @@
           <w:p>
             <w:pPr>
               <w:spacing w:before="0" w:after="0" w:line="240" w:lineRule="auto"/>
+              <w:ind w:left="0" w:right="0" w:firstLine="0"/>
               <w:jc w:val="center"/>
             </w:pPr>
             <w:r/>
@@ -8438,6 +8676,7 @@
           <w:p>
             <w:pPr>
               <w:spacing w:before="0" w:after="0" w:line="240" w:lineRule="auto"/>
+              <w:ind w:left="0" w:right="0" w:firstLine="0"/>
               <w:jc w:val="center"/>
             </w:pPr>
             <w:r/>
@@ -8473,6 +8712,7 @@
           <w:p>
             <w:pPr>
               <w:spacing w:before="0" w:after="0" w:line="240" w:lineRule="auto"/>
+              <w:ind w:left="0" w:right="0" w:firstLine="0"/>
               <w:jc w:val="center"/>
             </w:pPr>
             <w:r/>
@@ -8508,6 +8748,7 @@
           <w:p>
             <w:pPr>
               <w:spacing w:before="0" w:after="0" w:line="240" w:lineRule="auto"/>
+              <w:ind w:left="0" w:right="0" w:firstLine="0"/>
               <w:jc w:val="center"/>
             </w:pPr>
             <w:r/>
@@ -8545,6 +8786,7 @@
           <w:p>
             <w:pPr>
               <w:spacing w:before="0" w:after="0" w:line="240" w:lineRule="auto"/>
+              <w:ind w:left="0" w:right="0" w:firstLine="0"/>
               <w:jc w:val="left"/>
             </w:pPr>
             <w:r/>
@@ -8580,6 +8822,7 @@
           <w:p>
             <w:pPr>
               <w:spacing w:before="0" w:after="0" w:line="240" w:lineRule="auto"/>
+              <w:ind w:left="0" w:right="0" w:firstLine="0"/>
               <w:jc w:val="left"/>
             </w:pPr>
             <w:r/>
@@ -8615,6 +8858,7 @@
           <w:p>
             <w:pPr>
               <w:spacing w:before="0" w:after="0" w:line="240" w:lineRule="auto"/>
+              <w:ind w:left="0" w:right="0" w:firstLine="0"/>
               <w:jc w:val="center"/>
             </w:pPr>
             <w:r/>
@@ -8650,6 +8894,7 @@
           <w:p>
             <w:pPr>
               <w:spacing w:before="0" w:after="0" w:line="240" w:lineRule="auto"/>
+              <w:ind w:left="0" w:right="0" w:firstLine="0"/>
               <w:jc w:val="center"/>
             </w:pPr>
             <w:r/>
@@ -8685,6 +8930,7 @@
           <w:p>
             <w:pPr>
               <w:spacing w:before="0" w:after="0" w:line="240" w:lineRule="auto"/>
+              <w:ind w:left="0" w:right="0" w:firstLine="0"/>
               <w:jc w:val="center"/>
             </w:pPr>
             <w:r/>
@@ -8720,6 +8966,7 @@
           <w:p>
             <w:pPr>
               <w:spacing w:before="0" w:after="0" w:line="240" w:lineRule="auto"/>
+              <w:ind w:left="0" w:right="0" w:firstLine="0"/>
               <w:jc w:val="center"/>
             </w:pPr>
             <w:r/>
@@ -8757,6 +9004,7 @@
           <w:p>
             <w:pPr>
               <w:spacing w:before="0" w:after="0" w:line="240" w:lineRule="auto"/>
+              <w:ind w:left="0" w:right="0" w:firstLine="0"/>
               <w:jc w:val="left"/>
             </w:pPr>
             <w:r/>
@@ -8792,6 +9040,7 @@
           <w:p>
             <w:pPr>
               <w:spacing w:before="0" w:after="0" w:line="240" w:lineRule="auto"/>
+              <w:ind w:left="0" w:right="0" w:firstLine="0"/>
               <w:jc w:val="left"/>
             </w:pPr>
             <w:r/>
@@ -8827,6 +9076,7 @@
           <w:p>
             <w:pPr>
               <w:spacing w:before="0" w:after="0" w:line="240" w:lineRule="auto"/>
+              <w:ind w:left="0" w:right="0" w:firstLine="0"/>
               <w:jc w:val="center"/>
             </w:pPr>
             <w:r/>
@@ -8862,6 +9112,7 @@
           <w:p>
             <w:pPr>
               <w:spacing w:before="0" w:after="0" w:line="240" w:lineRule="auto"/>
+              <w:ind w:left="0" w:right="0" w:firstLine="0"/>
               <w:jc w:val="center"/>
             </w:pPr>
             <w:r/>
@@ -8897,6 +9148,7 @@
           <w:p>
             <w:pPr>
               <w:spacing w:before="0" w:after="0" w:line="240" w:lineRule="auto"/>
+              <w:ind w:left="0" w:right="0" w:firstLine="0"/>
               <w:jc w:val="center"/>
             </w:pPr>
             <w:r/>
@@ -8932,6 +9184,7 @@
           <w:p>
             <w:pPr>
               <w:spacing w:before="0" w:after="0" w:line="240" w:lineRule="auto"/>
+              <w:ind w:left="0" w:right="0" w:firstLine="0"/>
               <w:jc w:val="center"/>
             </w:pPr>
             <w:r/>
@@ -8969,6 +9222,7 @@
           <w:p>
             <w:pPr>
               <w:spacing w:before="0" w:after="0" w:line="240" w:lineRule="auto"/>
+              <w:ind w:left="0" w:right="0" w:firstLine="0"/>
               <w:jc w:val="left"/>
             </w:pPr>
             <w:r/>
@@ -9004,6 +9258,7 @@
           <w:p>
             <w:pPr>
               <w:spacing w:before="0" w:after="0" w:line="240" w:lineRule="auto"/>
+              <w:ind w:left="0" w:right="0" w:firstLine="0"/>
               <w:jc w:val="left"/>
             </w:pPr>
             <w:r/>
@@ -9039,6 +9294,7 @@
           <w:p>
             <w:pPr>
               <w:spacing w:before="0" w:after="0" w:line="240" w:lineRule="auto"/>
+              <w:ind w:left="0" w:right="0" w:firstLine="0"/>
               <w:jc w:val="center"/>
             </w:pPr>
             <w:r/>
@@ -9074,6 +9330,7 @@
           <w:p>
             <w:pPr>
               <w:spacing w:before="0" w:after="0" w:line="240" w:lineRule="auto"/>
+              <w:ind w:left="0" w:right="0" w:firstLine="0"/>
               <w:jc w:val="center"/>
             </w:pPr>
             <w:r/>
@@ -9109,6 +9366,7 @@
           <w:p>
             <w:pPr>
               <w:spacing w:before="0" w:after="0" w:line="240" w:lineRule="auto"/>
+              <w:ind w:left="0" w:right="0" w:firstLine="0"/>
               <w:jc w:val="center"/>
             </w:pPr>
             <w:r/>
@@ -9144,6 +9402,7 @@
           <w:p>
             <w:pPr>
               <w:spacing w:before="0" w:after="0" w:line="240" w:lineRule="auto"/>
+              <w:ind w:left="0" w:right="0" w:firstLine="0"/>
               <w:jc w:val="center"/>
             </w:pPr>
             <w:r/>
@@ -9181,6 +9440,7 @@
           <w:p>
             <w:pPr>
               <w:spacing w:before="0" w:after="0" w:line="240" w:lineRule="auto"/>
+              <w:ind w:left="0" w:right="0" w:firstLine="0"/>
               <w:jc w:val="left"/>
             </w:pPr>
             <w:r/>
@@ -9216,6 +9476,7 @@
           <w:p>
             <w:pPr>
               <w:spacing w:before="0" w:after="0" w:line="240" w:lineRule="auto"/>
+              <w:ind w:left="0" w:right="0" w:firstLine="0"/>
               <w:jc w:val="left"/>
             </w:pPr>
             <w:r/>
@@ -9251,6 +9512,7 @@
           <w:p>
             <w:pPr>
               <w:spacing w:before="0" w:after="0" w:line="240" w:lineRule="auto"/>
+              <w:ind w:left="0" w:right="0" w:firstLine="0"/>
               <w:jc w:val="center"/>
             </w:pPr>
             <w:r/>
@@ -9286,6 +9548,7 @@
           <w:p>
             <w:pPr>
               <w:spacing w:before="0" w:after="0" w:line="240" w:lineRule="auto"/>
+              <w:ind w:left="0" w:right="0" w:firstLine="0"/>
               <w:jc w:val="center"/>
             </w:pPr>
             <w:r/>
@@ -9321,6 +9584,7 @@
           <w:p>
             <w:pPr>
               <w:spacing w:before="0" w:after="0" w:line="240" w:lineRule="auto"/>
+              <w:ind w:left="0" w:right="0" w:firstLine="0"/>
               <w:jc w:val="center"/>
             </w:pPr>
             <w:r/>
@@ -9356,6 +9620,7 @@
           <w:p>
             <w:pPr>
               <w:spacing w:before="0" w:after="0" w:line="240" w:lineRule="auto"/>
+              <w:ind w:left="0" w:right="0" w:firstLine="0"/>
               <w:jc w:val="center"/>
             </w:pPr>
             <w:r/>
@@ -9393,6 +9658,7 @@
           <w:p>
             <w:pPr>
               <w:spacing w:before="0" w:after="0" w:line="240" w:lineRule="auto"/>
+              <w:ind w:left="0" w:right="0" w:firstLine="0"/>
               <w:jc w:val="left"/>
             </w:pPr>
             <w:r/>
@@ -9428,6 +9694,7 @@
           <w:p>
             <w:pPr>
               <w:spacing w:before="0" w:after="0" w:line="240" w:lineRule="auto"/>
+              <w:ind w:left="0" w:right="0" w:firstLine="0"/>
               <w:jc w:val="left"/>
             </w:pPr>
             <w:r/>
@@ -9463,6 +9730,7 @@
           <w:p>
             <w:pPr>
               <w:spacing w:before="0" w:after="0" w:line="240" w:lineRule="auto"/>
+              <w:ind w:left="0" w:right="0" w:firstLine="0"/>
               <w:jc w:val="center"/>
             </w:pPr>
             <w:r/>
@@ -9498,6 +9766,7 @@
           <w:p>
             <w:pPr>
               <w:spacing w:before="0" w:after="0" w:line="240" w:lineRule="auto"/>
+              <w:ind w:left="0" w:right="0" w:firstLine="0"/>
               <w:jc w:val="center"/>
             </w:pPr>
             <w:r/>
@@ -9533,6 +9802,7 @@
           <w:p>
             <w:pPr>
               <w:spacing w:before="0" w:after="0" w:line="240" w:lineRule="auto"/>
+              <w:ind w:left="0" w:right="0" w:firstLine="0"/>
               <w:jc w:val="center"/>
             </w:pPr>
             <w:r/>
@@ -9568,6 +9838,7 @@
           <w:p>
             <w:pPr>
               <w:spacing w:before="0" w:after="0" w:line="240" w:lineRule="auto"/>
+              <w:ind w:left="0" w:right="0" w:firstLine="0"/>
               <w:jc w:val="center"/>
             </w:pPr>
             <w:r/>
@@ -9605,6 +9876,7 @@
           <w:p>
             <w:pPr>
               <w:spacing w:before="0" w:after="0" w:line="240" w:lineRule="auto"/>
+              <w:ind w:left="0" w:right="0" w:firstLine="0"/>
               <w:jc w:val="left"/>
             </w:pPr>
             <w:r/>
@@ -9640,6 +9912,7 @@
           <w:p>
             <w:pPr>
               <w:spacing w:before="0" w:after="0" w:line="240" w:lineRule="auto"/>
+              <w:ind w:left="0" w:right="0" w:firstLine="0"/>
               <w:jc w:val="left"/>
             </w:pPr>
             <w:r/>
@@ -9675,6 +9948,7 @@
           <w:p>
             <w:pPr>
               <w:spacing w:before="0" w:after="0" w:line="240" w:lineRule="auto"/>
+              <w:ind w:left="0" w:right="0" w:firstLine="0"/>
               <w:jc w:val="center"/>
             </w:pPr>
             <w:r/>
@@ -9710,6 +9984,7 @@
           <w:p>
             <w:pPr>
               <w:spacing w:before="0" w:after="0" w:line="240" w:lineRule="auto"/>
+              <w:ind w:left="0" w:right="0" w:firstLine="0"/>
               <w:jc w:val="center"/>
             </w:pPr>
             <w:r/>
@@ -9745,6 +10020,7 @@
           <w:p>
             <w:pPr>
               <w:spacing w:before="0" w:after="0" w:line="240" w:lineRule="auto"/>
+              <w:ind w:left="0" w:right="0" w:firstLine="0"/>
               <w:jc w:val="center"/>
             </w:pPr>
             <w:r/>
@@ -9780,6 +10056,7 @@
           <w:p>
             <w:pPr>
               <w:spacing w:before="0" w:after="0" w:line="240" w:lineRule="auto"/>
+              <w:ind w:left="0" w:right="0" w:firstLine="0"/>
               <w:jc w:val="center"/>
             </w:pPr>
             <w:r/>
@@ -9817,6 +10094,7 @@
           <w:p>
             <w:pPr>
               <w:spacing w:before="0" w:after="0" w:line="240" w:lineRule="auto"/>
+              <w:ind w:left="0" w:right="0" w:firstLine="0"/>
               <w:jc w:val="left"/>
             </w:pPr>
             <w:r/>
@@ -9852,6 +10130,7 @@
           <w:p>
             <w:pPr>
               <w:spacing w:before="0" w:after="0" w:line="240" w:lineRule="auto"/>
+              <w:ind w:left="0" w:right="0" w:firstLine="0"/>
               <w:jc w:val="left"/>
             </w:pPr>
             <w:r/>
@@ -9887,6 +10166,7 @@
           <w:p>
             <w:pPr>
               <w:spacing w:before="0" w:after="0" w:line="240" w:lineRule="auto"/>
+              <w:ind w:left="0" w:right="0" w:firstLine="0"/>
               <w:jc w:val="center"/>
             </w:pPr>
             <w:r/>
@@ -9922,6 +10202,7 @@
           <w:p>
             <w:pPr>
               <w:spacing w:before="0" w:after="0" w:line="240" w:lineRule="auto"/>
+              <w:ind w:left="0" w:right="0" w:firstLine="0"/>
               <w:jc w:val="center"/>
             </w:pPr>
             <w:r/>
@@ -9957,6 +10238,7 @@
           <w:p>
             <w:pPr>
               <w:spacing w:before="0" w:after="0" w:line="240" w:lineRule="auto"/>
+              <w:ind w:left="0" w:right="0" w:firstLine="0"/>
               <w:jc w:val="center"/>
             </w:pPr>
             <w:r/>
@@ -9992,6 +10274,7 @@
           <w:p>
             <w:pPr>
               <w:spacing w:before="0" w:after="0" w:line="240" w:lineRule="auto"/>
+              <w:ind w:left="0" w:right="0" w:firstLine="0"/>
               <w:jc w:val="center"/>
             </w:pPr>
             <w:r/>
@@ -10029,6 +10312,7 @@
           <w:p>
             <w:pPr>
               <w:spacing w:before="0" w:after="0" w:line="240" w:lineRule="auto"/>
+              <w:ind w:left="0" w:right="0" w:firstLine="0"/>
               <w:jc w:val="left"/>
             </w:pPr>
             <w:r/>
@@ -10064,6 +10348,7 @@
           <w:p>
             <w:pPr>
               <w:spacing w:before="0" w:after="0" w:line="240" w:lineRule="auto"/>
+              <w:ind w:left="0" w:right="0" w:firstLine="0"/>
               <w:jc w:val="left"/>
             </w:pPr>
             <w:r/>
@@ -10099,6 +10384,7 @@
           <w:p>
             <w:pPr>
               <w:spacing w:before="0" w:after="0" w:line="240" w:lineRule="auto"/>
+              <w:ind w:left="0" w:right="0" w:firstLine="0"/>
               <w:jc w:val="center"/>
             </w:pPr>
             <w:r/>
@@ -10134,6 +10420,7 @@
           <w:p>
             <w:pPr>
               <w:spacing w:before="0" w:after="0" w:line="240" w:lineRule="auto"/>
+              <w:ind w:left="0" w:right="0" w:firstLine="0"/>
               <w:jc w:val="center"/>
             </w:pPr>
             <w:r/>
@@ -10169,6 +10456,7 @@
           <w:p>
             <w:pPr>
               <w:spacing w:before="0" w:after="0" w:line="240" w:lineRule="auto"/>
+              <w:ind w:left="0" w:right="0" w:firstLine="0"/>
               <w:jc w:val="center"/>
             </w:pPr>
             <w:r/>
@@ -10204,6 +10492,7 @@
           <w:p>
             <w:pPr>
               <w:spacing w:before="0" w:after="0" w:line="240" w:lineRule="auto"/>
+              <w:ind w:left="0" w:right="0" w:firstLine="0"/>
               <w:jc w:val="center"/>
             </w:pPr>
             <w:r/>
@@ -10222,6 +10511,7 @@
     <w:p>
       <w:pPr>
         <w:spacing w:before="20" w:after="40" w:line="240" w:lineRule="auto"/>
+        <w:ind w:left="0" w:right="0" w:firstLine="0"/>
         <w:jc w:val="left"/>
       </w:pPr>
       <w:r>
@@ -10311,6 +10601,8 @@
     <w:p>
       <w:pPr>
         <w:pStyle w:val="tablecaption"/>
+        <w:spacing w:before="80" w:after="20" w:line="240" w:lineRule="auto"/>
+        <w:ind w:left="0" w:right="0" w:firstLine="0"/>
       </w:pPr>
       <w:r>
         <w:rPr>
@@ -10332,6 +10624,7 @@
         <w:jc w:val="center"/>
         <w:tblLayout w:type="fixed"/>
         <w:tblLook w:firstColumn="1" w:firstRow="1" w:lastColumn="0" w:lastRow="0" w:noHBand="0" w:noVBand="1" w:val="04A0"/>
+        <w:tblInd w:w="0" w:type="dxa"/>
       </w:tblPr>
       <w:tblGrid>
         <w:gridCol w:w="1661"/>
@@ -10370,6 +10663,7 @@
           <w:p>
             <w:pPr>
               <w:spacing w:before="0" w:after="0" w:line="240" w:lineRule="auto"/>
+              <w:ind w:left="0" w:right="0" w:firstLine="0"/>
               <w:jc w:val="left"/>
             </w:pPr>
             <w:r/>
@@ -10406,6 +10700,7 @@
           <w:p>
             <w:pPr>
               <w:spacing w:before="0" w:after="0" w:line="240" w:lineRule="auto"/>
+              <w:ind w:left="0" w:right="0" w:firstLine="0"/>
               <w:jc w:val="center"/>
             </w:pPr>
             <w:r/>
@@ -10442,6 +10737,7 @@
           <w:p>
             <w:pPr>
               <w:spacing w:before="0" w:after="0" w:line="240" w:lineRule="auto"/>
+              <w:ind w:left="0" w:right="0" w:firstLine="0"/>
               <w:jc w:val="center"/>
             </w:pPr>
             <w:r/>
@@ -10478,6 +10774,7 @@
           <w:p>
             <w:pPr>
               <w:spacing w:before="0" w:after="0" w:line="240" w:lineRule="auto"/>
+              <w:ind w:left="0" w:right="0" w:firstLine="0"/>
               <w:jc w:val="center"/>
             </w:pPr>
             <w:r/>
@@ -10514,6 +10811,7 @@
           <w:p>
             <w:pPr>
               <w:spacing w:before="0" w:after="0" w:line="240" w:lineRule="auto"/>
+              <w:ind w:left="0" w:right="0" w:firstLine="0"/>
               <w:jc w:val="center"/>
             </w:pPr>
             <w:r/>
@@ -10550,6 +10848,7 @@
           <w:p>
             <w:pPr>
               <w:spacing w:before="0" w:after="0" w:line="240" w:lineRule="auto"/>
+              <w:ind w:left="0" w:right="0" w:firstLine="0"/>
               <w:jc w:val="center"/>
             </w:pPr>
             <w:r/>
@@ -10586,6 +10885,7 @@
           <w:p>
             <w:pPr>
               <w:spacing w:before="0" w:after="0" w:line="240" w:lineRule="auto"/>
+              <w:ind w:left="0" w:right="0" w:firstLine="0"/>
               <w:jc w:val="center"/>
             </w:pPr>
             <w:r/>
@@ -10622,6 +10922,7 @@
           <w:p>
             <w:pPr>
               <w:spacing w:before="0" w:after="0" w:line="240" w:lineRule="auto"/>
+              <w:ind w:left="0" w:right="0" w:firstLine="0"/>
               <w:jc w:val="center"/>
             </w:pPr>
             <w:r/>
@@ -10660,6 +10961,7 @@
           <w:p>
             <w:pPr>
               <w:spacing w:before="0" w:after="0" w:line="240" w:lineRule="auto"/>
+              <w:ind w:left="0" w:right="0" w:firstLine="0"/>
               <w:jc w:val="left"/>
             </w:pPr>
             <w:r/>
@@ -10696,6 +10998,7 @@
           <w:p>
             <w:pPr>
               <w:spacing w:before="0" w:after="0" w:line="240" w:lineRule="auto"/>
+              <w:ind w:left="0" w:right="0" w:firstLine="0"/>
               <w:jc w:val="center"/>
             </w:pPr>
             <w:r/>
@@ -10732,6 +11035,7 @@
           <w:p>
             <w:pPr>
               <w:spacing w:before="0" w:after="0" w:line="240" w:lineRule="auto"/>
+              <w:ind w:left="0" w:right="0" w:firstLine="0"/>
               <w:jc w:val="center"/>
             </w:pPr>
             <w:r/>
@@ -10768,6 +11072,7 @@
           <w:p>
             <w:pPr>
               <w:spacing w:before="0" w:after="0" w:line="240" w:lineRule="auto"/>
+              <w:ind w:left="0" w:right="0" w:firstLine="0"/>
               <w:jc w:val="center"/>
             </w:pPr>
             <w:r/>
@@ -10804,6 +11109,7 @@
           <w:p>
             <w:pPr>
               <w:spacing w:before="0" w:after="0" w:line="240" w:lineRule="auto"/>
+              <w:ind w:left="0" w:right="0" w:firstLine="0"/>
               <w:jc w:val="center"/>
             </w:pPr>
             <w:r/>
@@ -10840,6 +11146,7 @@
           <w:p>
             <w:pPr>
               <w:spacing w:before="0" w:after="0" w:line="240" w:lineRule="auto"/>
+              <w:ind w:left="0" w:right="0" w:firstLine="0"/>
               <w:jc w:val="center"/>
             </w:pPr>
             <w:r/>
@@ -10876,6 +11183,7 @@
           <w:p>
             <w:pPr>
               <w:spacing w:before="0" w:after="0" w:line="240" w:lineRule="auto"/>
+              <w:ind w:left="0" w:right="0" w:firstLine="0"/>
               <w:jc w:val="center"/>
             </w:pPr>
             <w:r/>
@@ -10912,6 +11220,7 @@
           <w:p>
             <w:pPr>
               <w:spacing w:before="0" w:after="0" w:line="240" w:lineRule="auto"/>
+              <w:ind w:left="0" w:right="0" w:firstLine="0"/>
               <w:jc w:val="center"/>
             </w:pPr>
             <w:r/>
@@ -10950,6 +11259,7 @@
           <w:p>
             <w:pPr>
               <w:spacing w:before="0" w:after="0" w:line="240" w:lineRule="auto"/>
+              <w:ind w:left="0" w:right="0" w:firstLine="0"/>
               <w:jc w:val="left"/>
             </w:pPr>
             <w:r/>
@@ -10986,6 +11296,7 @@
           <w:p>
             <w:pPr>
               <w:spacing w:before="0" w:after="0" w:line="240" w:lineRule="auto"/>
+              <w:ind w:left="0" w:right="0" w:firstLine="0"/>
               <w:jc w:val="center"/>
             </w:pPr>
             <w:r/>
@@ -11022,6 +11333,7 @@
           <w:p>
             <w:pPr>
               <w:spacing w:before="0" w:after="0" w:line="240" w:lineRule="auto"/>
+              <w:ind w:left="0" w:right="0" w:firstLine="0"/>
               <w:jc w:val="center"/>
             </w:pPr>
             <w:r/>
@@ -11058,6 +11370,7 @@
           <w:p>
             <w:pPr>
               <w:spacing w:before="0" w:after="0" w:line="240" w:lineRule="auto"/>
+              <w:ind w:left="0" w:right="0" w:firstLine="0"/>
               <w:jc w:val="center"/>
             </w:pPr>
             <w:r/>
@@ -11094,6 +11407,7 @@
           <w:p>
             <w:pPr>
               <w:spacing w:before="0" w:after="0" w:line="240" w:lineRule="auto"/>
+              <w:ind w:left="0" w:right="0" w:firstLine="0"/>
               <w:jc w:val="center"/>
             </w:pPr>
             <w:r/>
@@ -11130,6 +11444,7 @@
           <w:p>
             <w:pPr>
               <w:spacing w:before="0" w:after="0" w:line="240" w:lineRule="auto"/>
+              <w:ind w:left="0" w:right="0" w:firstLine="0"/>
               <w:jc w:val="center"/>
             </w:pPr>
             <w:r/>
@@ -11166,6 +11481,7 @@
           <w:p>
             <w:pPr>
               <w:spacing w:before="0" w:after="0" w:line="240" w:lineRule="auto"/>
+              <w:ind w:left="0" w:right="0" w:firstLine="0"/>
               <w:jc w:val="center"/>
             </w:pPr>
             <w:r/>
@@ -11202,6 +11518,7 @@
           <w:p>
             <w:pPr>
               <w:spacing w:before="0" w:after="0" w:line="240" w:lineRule="auto"/>
+              <w:ind w:left="0" w:right="0" w:firstLine="0"/>
               <w:jc w:val="center"/>
             </w:pPr>
             <w:r/>
@@ -11240,6 +11557,7 @@
           <w:p>
             <w:pPr>
               <w:spacing w:before="0" w:after="0" w:line="240" w:lineRule="auto"/>
+              <w:ind w:left="0" w:right="0" w:firstLine="0"/>
               <w:jc w:val="left"/>
             </w:pPr>
             <w:r/>
@@ -11276,6 +11594,7 @@
           <w:p>
             <w:pPr>
               <w:spacing w:before="0" w:after="0" w:line="240" w:lineRule="auto"/>
+              <w:ind w:left="0" w:right="0" w:firstLine="0"/>
               <w:jc w:val="center"/>
             </w:pPr>
             <w:r/>
@@ -11312,6 +11631,7 @@
           <w:p>
             <w:pPr>
               <w:spacing w:before="0" w:after="0" w:line="240" w:lineRule="auto"/>
+              <w:ind w:left="0" w:right="0" w:firstLine="0"/>
               <w:jc w:val="center"/>
             </w:pPr>
             <w:r/>
@@ -11348,6 +11668,7 @@
           <w:p>
             <w:pPr>
               <w:spacing w:before="0" w:after="0" w:line="240" w:lineRule="auto"/>
+              <w:ind w:left="0" w:right="0" w:firstLine="0"/>
               <w:jc w:val="center"/>
             </w:pPr>
             <w:r/>
@@ -11384,6 +11705,7 @@
           <w:p>
             <w:pPr>
               <w:spacing w:before="0" w:after="0" w:line="240" w:lineRule="auto"/>
+              <w:ind w:left="0" w:right="0" w:firstLine="0"/>
               <w:jc w:val="center"/>
             </w:pPr>
             <w:r/>
@@ -11420,6 +11742,7 @@
           <w:p>
             <w:pPr>
               <w:spacing w:before="0" w:after="0" w:line="240" w:lineRule="auto"/>
+              <w:ind w:left="0" w:right="0" w:firstLine="0"/>
               <w:jc w:val="center"/>
             </w:pPr>
             <w:r/>
@@ -11456,6 +11779,7 @@
           <w:p>
             <w:pPr>
               <w:spacing w:before="0" w:after="0" w:line="240" w:lineRule="auto"/>
+              <w:ind w:left="0" w:right="0" w:firstLine="0"/>
               <w:jc w:val="center"/>
             </w:pPr>
             <w:r/>
@@ -11492,6 +11816,7 @@
           <w:p>
             <w:pPr>
               <w:spacing w:before="0" w:after="0" w:line="240" w:lineRule="auto"/>
+              <w:ind w:left="0" w:right="0" w:firstLine="0"/>
               <w:jc w:val="center"/>
             </w:pPr>
             <w:r/>
@@ -11510,6 +11835,7 @@
     <w:p>
       <w:pPr>
         <w:spacing w:before="20" w:after="40" w:line="240" w:lineRule="auto"/>
+        <w:ind w:left="0" w:right="0" w:firstLine="0"/>
         <w:jc w:val="left"/>
       </w:pPr>
       <w:r>
@@ -11599,6 +11925,8 @@
     <w:p>
       <w:pPr>
         <w:pStyle w:val="tablecaption"/>
+        <w:spacing w:before="80" w:after="20" w:line="240" w:lineRule="auto"/>
+        <w:ind w:left="0" w:right="0" w:firstLine="0"/>
       </w:pPr>
       <w:r>
         <w:rPr>
@@ -11620,6 +11948,7 @@
         <w:jc w:val="center"/>
         <w:tblLayout w:type="fixed"/>
         <w:tblLook w:firstColumn="1" w:firstRow="1" w:lastColumn="0" w:lastRow="0" w:noHBand="0" w:noVBand="1" w:val="04A0"/>
+        <w:tblInd w:w="0" w:type="dxa"/>
       </w:tblPr>
       <w:tblGrid>
         <w:gridCol w:w="2404"/>
@@ -11652,6 +11981,7 @@
           <w:p>
             <w:pPr>
               <w:spacing w:before="0" w:after="0" w:line="240" w:lineRule="auto"/>
+              <w:ind w:left="0" w:right="0" w:firstLine="0"/>
               <w:jc w:val="left"/>
             </w:pPr>
             <w:r/>
@@ -11687,6 +12017,7 @@
           <w:p>
             <w:pPr>
               <w:spacing w:before="0" w:after="0" w:line="240" w:lineRule="auto"/>
+              <w:ind w:left="0" w:right="0" w:firstLine="0"/>
               <w:jc w:val="center"/>
             </w:pPr>
             <w:r/>
@@ -11722,6 +12053,7 @@
           <w:p>
             <w:pPr>
               <w:spacing w:before="0" w:after="0" w:line="240" w:lineRule="auto"/>
+              <w:ind w:left="0" w:right="0" w:firstLine="0"/>
               <w:jc w:val="left"/>
             </w:pPr>
             <w:r/>
@@ -11759,6 +12091,7 @@
           <w:p>
             <w:pPr>
               <w:spacing w:before="0" w:after="0" w:line="240" w:lineRule="auto"/>
+              <w:ind w:left="0" w:right="0" w:firstLine="0"/>
               <w:jc w:val="left"/>
             </w:pPr>
             <w:r/>
@@ -11794,6 +12127,7 @@
           <w:p>
             <w:pPr>
               <w:spacing w:before="0" w:after="0" w:line="240" w:lineRule="auto"/>
+              <w:ind w:left="0" w:right="0" w:firstLine="0"/>
               <w:jc w:val="center"/>
             </w:pPr>
             <w:r/>
@@ -11829,6 +12163,7 @@
           <w:p>
             <w:pPr>
               <w:spacing w:before="0" w:after="0" w:line="240" w:lineRule="auto"/>
+              <w:ind w:left="0" w:right="0" w:firstLine="0"/>
               <w:jc w:val="left"/>
             </w:pPr>
             <w:r/>
@@ -11866,6 +12201,7 @@
           <w:p>
             <w:pPr>
               <w:spacing w:before="0" w:after="0" w:line="240" w:lineRule="auto"/>
+              <w:ind w:left="0" w:right="0" w:firstLine="0"/>
               <w:jc w:val="left"/>
             </w:pPr>
             <w:r/>
@@ -11901,6 +12237,7 @@
           <w:p>
             <w:pPr>
               <w:spacing w:before="0" w:after="0" w:line="240" w:lineRule="auto"/>
+              <w:ind w:left="0" w:right="0" w:firstLine="0"/>
               <w:jc w:val="center"/>
             </w:pPr>
             <w:r/>
@@ -11936,6 +12273,7 @@
           <w:p>
             <w:pPr>
               <w:spacing w:before="0" w:after="0" w:line="240" w:lineRule="auto"/>
+              <w:ind w:left="0" w:right="0" w:firstLine="0"/>
               <w:jc w:val="left"/>
             </w:pPr>
             <w:r/>
@@ -11973,6 +12311,7 @@
           <w:p>
             <w:pPr>
               <w:spacing w:before="0" w:after="0" w:line="240" w:lineRule="auto"/>
+              <w:ind w:left="0" w:right="0" w:firstLine="0"/>
               <w:jc w:val="left"/>
             </w:pPr>
             <w:r/>
@@ -12008,6 +12347,7 @@
           <w:p>
             <w:pPr>
               <w:spacing w:before="0" w:after="0" w:line="240" w:lineRule="auto"/>
+              <w:ind w:left="0" w:right="0" w:firstLine="0"/>
               <w:jc w:val="center"/>
             </w:pPr>
             <w:r/>
@@ -12043,6 +12383,7 @@
           <w:p>
             <w:pPr>
               <w:spacing w:before="0" w:after="0" w:line="240" w:lineRule="auto"/>
+              <w:ind w:left="0" w:right="0" w:firstLine="0"/>
               <w:jc w:val="left"/>
             </w:pPr>
             <w:r/>
@@ -12080,6 +12421,7 @@
           <w:p>
             <w:pPr>
               <w:spacing w:before="0" w:after="0" w:line="240" w:lineRule="auto"/>
+              <w:ind w:left="0" w:right="0" w:firstLine="0"/>
               <w:jc w:val="left"/>
             </w:pPr>
             <w:r/>
@@ -12115,6 +12457,7 @@
           <w:p>
             <w:pPr>
               <w:spacing w:before="0" w:after="0" w:line="240" w:lineRule="auto"/>
+              <w:ind w:left="0" w:right="0" w:firstLine="0"/>
               <w:jc w:val="center"/>
             </w:pPr>
             <w:r/>
@@ -12150,6 +12493,7 @@
           <w:p>
             <w:pPr>
               <w:spacing w:before="0" w:after="0" w:line="240" w:lineRule="auto"/>
+              <w:ind w:left="0" w:right="0" w:firstLine="0"/>
               <w:jc w:val="left"/>
             </w:pPr>
             <w:r/>
@@ -12187,6 +12531,7 @@
           <w:p>
             <w:pPr>
               <w:spacing w:before="0" w:after="0" w:line="240" w:lineRule="auto"/>
+              <w:ind w:left="0" w:right="0" w:firstLine="0"/>
               <w:jc w:val="left"/>
             </w:pPr>
             <w:r/>
@@ -12222,6 +12567,7 @@
           <w:p>
             <w:pPr>
               <w:spacing w:before="0" w:after="0" w:line="240" w:lineRule="auto"/>
+              <w:ind w:left="0" w:right="0" w:firstLine="0"/>
               <w:jc w:val="center"/>
             </w:pPr>
             <w:r/>
@@ -12257,6 +12603,7 @@
           <w:p>
             <w:pPr>
               <w:spacing w:before="0" w:after="0" w:line="240" w:lineRule="auto"/>
+              <w:ind w:left="0" w:right="0" w:firstLine="0"/>
               <w:jc w:val="left"/>
             </w:pPr>
             <w:r/>
@@ -12274,7 +12621,8 @@
     </w:tbl>
     <w:p>
       <w:pPr>
-        <w:spacing w:after="80"/>
+        <w:spacing w:before="0" w:after="80" w:line="240" w:lineRule="auto"/>
+        <w:ind w:left="0" w:right="0" w:firstLine="0"/>
       </w:pPr>
     </w:p>
     <w:p>
@@ -12294,6 +12642,8 @@
     <w:p>
       <w:pPr>
         <w:pStyle w:val="tablecaption"/>
+        <w:spacing w:before="80" w:after="20" w:line="240" w:lineRule="auto"/>
+        <w:ind w:left="0" w:right="0" w:firstLine="0"/>
       </w:pPr>
       <w:r>
         <w:rPr>
@@ -12315,6 +12665,7 @@
         <w:jc w:val="center"/>
         <w:tblLayout w:type="fixed"/>
         <w:tblLook w:firstColumn="1" w:firstRow="1" w:lastColumn="0" w:lastRow="0" w:noHBand="0" w:noVBand="1" w:val="04A0"/>
+        <w:tblInd w:w="0" w:type="dxa"/>
       </w:tblPr>
       <w:tblGrid>
         <w:gridCol w:w="1938"/>
@@ -12349,6 +12700,7 @@
           <w:p>
             <w:pPr>
               <w:spacing w:before="0" w:after="0" w:line="240" w:lineRule="auto"/>
+              <w:ind w:left="0" w:right="0" w:firstLine="0"/>
               <w:jc w:val="left"/>
             </w:pPr>
             <w:r/>
@@ -12384,6 +12736,7 @@
           <w:p>
             <w:pPr>
               <w:spacing w:before="0" w:after="0" w:line="240" w:lineRule="auto"/>
+              <w:ind w:left="0" w:right="0" w:firstLine="0"/>
               <w:jc w:val="center"/>
             </w:pPr>
             <w:r/>
@@ -12419,6 +12772,7 @@
           <w:p>
             <w:pPr>
               <w:spacing w:before="0" w:after="0" w:line="240" w:lineRule="auto"/>
+              <w:ind w:left="0" w:right="0" w:firstLine="0"/>
               <w:jc w:val="center"/>
             </w:pPr>
             <w:r/>
@@ -12454,6 +12808,7 @@
           <w:p>
             <w:pPr>
               <w:spacing w:before="0" w:after="0" w:line="240" w:lineRule="auto"/>
+              <w:ind w:left="0" w:right="0" w:firstLine="0"/>
               <w:jc w:val="center"/>
             </w:pPr>
             <w:r/>
@@ -12489,6 +12844,7 @@
           <w:p>
             <w:pPr>
               <w:spacing w:before="0" w:after="0" w:line="240" w:lineRule="auto"/>
+              <w:ind w:left="0" w:right="0" w:firstLine="0"/>
               <w:jc w:val="center"/>
             </w:pPr>
             <w:r/>
@@ -12526,6 +12882,7 @@
           <w:p>
             <w:pPr>
               <w:spacing w:before="0" w:after="0" w:line="240" w:lineRule="auto"/>
+              <w:ind w:left="0" w:right="0" w:firstLine="0"/>
               <w:jc w:val="left"/>
             </w:pPr>
             <w:r/>
@@ -12561,6 +12918,7 @@
           <w:p>
             <w:pPr>
               <w:spacing w:before="0" w:after="0" w:line="240" w:lineRule="auto"/>
+              <w:ind w:left="0" w:right="0" w:firstLine="0"/>
               <w:jc w:val="center"/>
             </w:pPr>
             <w:r/>
@@ -12596,6 +12954,7 @@
           <w:p>
             <w:pPr>
               <w:spacing w:before="0" w:after="0" w:line="240" w:lineRule="auto"/>
+              <w:ind w:left="0" w:right="0" w:firstLine="0"/>
               <w:jc w:val="center"/>
             </w:pPr>
             <w:r/>
@@ -12631,6 +12990,7 @@
           <w:p>
             <w:pPr>
               <w:spacing w:before="0" w:after="0" w:line="240" w:lineRule="auto"/>
+              <w:ind w:left="0" w:right="0" w:firstLine="0"/>
               <w:jc w:val="center"/>
             </w:pPr>
             <w:r/>
@@ -12666,6 +13026,7 @@
           <w:p>
             <w:pPr>
               <w:spacing w:before="0" w:after="0" w:line="240" w:lineRule="auto"/>
+              <w:ind w:left="0" w:right="0" w:firstLine="0"/>
               <w:jc w:val="center"/>
             </w:pPr>
             <w:r/>
@@ -12703,6 +13064,7 @@
           <w:p>
             <w:pPr>
               <w:spacing w:before="0" w:after="0" w:line="240" w:lineRule="auto"/>
+              <w:ind w:left="0" w:right="0" w:firstLine="0"/>
               <w:jc w:val="left"/>
             </w:pPr>
             <w:r/>
@@ -12738,6 +13100,7 @@
           <w:p>
             <w:pPr>
               <w:spacing w:before="0" w:after="0" w:line="240" w:lineRule="auto"/>
+              <w:ind w:left="0" w:right="0" w:firstLine="0"/>
               <w:jc w:val="center"/>
             </w:pPr>
             <w:r/>
@@ -12773,6 +13136,7 @@
           <w:p>
             <w:pPr>
               <w:spacing w:before="0" w:after="0" w:line="240" w:lineRule="auto"/>
+              <w:ind w:left="0" w:right="0" w:firstLine="0"/>
               <w:jc w:val="center"/>
             </w:pPr>
             <w:r/>
@@ -12808,6 +13172,7 @@
           <w:p>
             <w:pPr>
               <w:spacing w:before="0" w:after="0" w:line="240" w:lineRule="auto"/>
+              <w:ind w:left="0" w:right="0" w:firstLine="0"/>
               <w:jc w:val="center"/>
             </w:pPr>
             <w:r/>
@@ -12843,6 +13208,7 @@
           <w:p>
             <w:pPr>
               <w:spacing w:before="0" w:after="0" w:line="240" w:lineRule="auto"/>
+              <w:ind w:left="0" w:right="0" w:firstLine="0"/>
               <w:jc w:val="center"/>
             </w:pPr>
             <w:r/>
@@ -12880,6 +13246,7 @@
           <w:p>
             <w:pPr>
               <w:spacing w:before="0" w:after="0" w:line="240" w:lineRule="auto"/>
+              <w:ind w:left="0" w:right="0" w:firstLine="0"/>
               <w:jc w:val="left"/>
             </w:pPr>
             <w:r/>
@@ -12915,6 +13282,7 @@
           <w:p>
             <w:pPr>
               <w:spacing w:before="0" w:after="0" w:line="240" w:lineRule="auto"/>
+              <w:ind w:left="0" w:right="0" w:firstLine="0"/>
               <w:jc w:val="center"/>
             </w:pPr>
             <w:r/>
@@ -12950,6 +13318,7 @@
           <w:p>
             <w:pPr>
               <w:spacing w:before="0" w:after="0" w:line="240" w:lineRule="auto"/>
+              <w:ind w:left="0" w:right="0" w:firstLine="0"/>
               <w:jc w:val="center"/>
             </w:pPr>
             <w:r/>
@@ -12985,6 +13354,7 @@
           <w:p>
             <w:pPr>
               <w:spacing w:before="0" w:after="0" w:line="240" w:lineRule="auto"/>
+              <w:ind w:left="0" w:right="0" w:firstLine="0"/>
               <w:jc w:val="center"/>
             </w:pPr>
             <w:r/>
@@ -13020,6 +13390,7 @@
           <w:p>
             <w:pPr>
               <w:spacing w:before="0" w:after="0" w:line="240" w:lineRule="auto"/>
+              <w:ind w:left="0" w:right="0" w:firstLine="0"/>
               <w:jc w:val="center"/>
             </w:pPr>
             <w:r/>
@@ -13057,6 +13428,7 @@
           <w:p>
             <w:pPr>
               <w:spacing w:before="0" w:after="0" w:line="240" w:lineRule="auto"/>
+              <w:ind w:left="0" w:right="0" w:firstLine="0"/>
               <w:jc w:val="left"/>
             </w:pPr>
             <w:r/>
@@ -13092,6 +13464,7 @@
           <w:p>
             <w:pPr>
               <w:spacing w:before="0" w:after="0" w:line="240" w:lineRule="auto"/>
+              <w:ind w:left="0" w:right="0" w:firstLine="0"/>
               <w:jc w:val="center"/>
             </w:pPr>
             <w:r/>
@@ -13127,6 +13500,7 @@
           <w:p>
             <w:pPr>
               <w:spacing w:before="0" w:after="0" w:line="240" w:lineRule="auto"/>
+              <w:ind w:left="0" w:right="0" w:firstLine="0"/>
               <w:jc w:val="center"/>
             </w:pPr>
             <w:r/>
@@ -13162,6 +13536,7 @@
           <w:p>
             <w:pPr>
               <w:spacing w:before="0" w:after="0" w:line="240" w:lineRule="auto"/>
+              <w:ind w:left="0" w:right="0" w:firstLine="0"/>
               <w:jc w:val="center"/>
             </w:pPr>
             <w:r/>
@@ -13197,6 +13572,7 @@
           <w:p>
             <w:pPr>
               <w:spacing w:before="0" w:after="0" w:line="240" w:lineRule="auto"/>
+              <w:ind w:left="0" w:right="0" w:firstLine="0"/>
               <w:jc w:val="center"/>
             </w:pPr>
             <w:r/>
@@ -13215,6 +13591,7 @@
     <w:p>
       <w:pPr>
         <w:spacing w:before="20" w:after="40" w:line="240" w:lineRule="auto"/>
+        <w:ind w:left="0" w:right="0" w:firstLine="0"/>
         <w:jc w:val="left"/>
       </w:pPr>
       <w:r>
@@ -13244,6 +13621,8 @@
     <w:p>
       <w:pPr>
         <w:pStyle w:val="tablecaption"/>
+        <w:spacing w:before="80" w:after="20" w:line="240" w:lineRule="auto"/>
+        <w:ind w:left="0" w:right="0" w:firstLine="0"/>
       </w:pPr>
       <w:r>
         <w:rPr>
@@ -13265,6 +13644,7 @@
         <w:jc w:val="center"/>
         <w:tblLayout w:type="fixed"/>
         <w:tblLook w:firstColumn="1" w:firstRow="1" w:lastColumn="0" w:lastRow="0" w:noHBand="0" w:noVBand="1" w:val="04A0"/>
+        <w:tblInd w:w="0" w:type="dxa"/>
       </w:tblPr>
       <w:tblGrid>
         <w:gridCol w:w="2822"/>
@@ -13299,6 +13679,7 @@
           <w:p>
             <w:pPr>
               <w:spacing w:before="0" w:after="0" w:line="240" w:lineRule="auto"/>
+              <w:ind w:left="0" w:right="0" w:firstLine="0"/>
               <w:jc w:val="left"/>
             </w:pPr>
             <w:r/>
@@ -13334,6 +13715,7 @@
           <w:p>
             <w:pPr>
               <w:spacing w:before="0" w:after="0" w:line="240" w:lineRule="auto"/>
+              <w:ind w:left="0" w:right="0" w:firstLine="0"/>
               <w:jc w:val="center"/>
             </w:pPr>
             <w:r/>
@@ -13369,6 +13751,7 @@
           <w:p>
             <w:pPr>
               <w:spacing w:before="0" w:after="0" w:line="240" w:lineRule="auto"/>
+              <w:ind w:left="0" w:right="0" w:firstLine="0"/>
               <w:jc w:val="center"/>
             </w:pPr>
             <w:r/>
@@ -13404,6 +13787,7 @@
           <w:p>
             <w:pPr>
               <w:spacing w:before="0" w:after="0" w:line="240" w:lineRule="auto"/>
+              <w:ind w:left="0" w:right="0" w:firstLine="0"/>
               <w:jc w:val="center"/>
             </w:pPr>
             <w:r/>
@@ -13439,6 +13823,7 @@
           <w:p>
             <w:pPr>
               <w:spacing w:before="0" w:after="0" w:line="240" w:lineRule="auto"/>
+              <w:ind w:left="0" w:right="0" w:firstLine="0"/>
               <w:jc w:val="center"/>
             </w:pPr>
             <w:r/>
@@ -13476,6 +13861,7 @@
           <w:p>
             <w:pPr>
               <w:spacing w:before="0" w:after="0" w:line="240" w:lineRule="auto"/>
+              <w:ind w:left="0" w:right="0" w:firstLine="0"/>
               <w:jc w:val="left"/>
             </w:pPr>
             <w:r/>
@@ -13511,6 +13897,7 @@
           <w:p>
             <w:pPr>
               <w:spacing w:before="0" w:after="0" w:line="240" w:lineRule="auto"/>
+              <w:ind w:left="0" w:right="0" w:firstLine="0"/>
               <w:jc w:val="center"/>
             </w:pPr>
             <w:r/>
@@ -13546,6 +13933,7 @@
           <w:p>
             <w:pPr>
               <w:spacing w:before="0" w:after="0" w:line="240" w:lineRule="auto"/>
+              <w:ind w:left="0" w:right="0" w:firstLine="0"/>
               <w:jc w:val="center"/>
             </w:pPr>
             <w:r/>
@@ -13581,6 +13969,7 @@
           <w:p>
             <w:pPr>
               <w:spacing w:before="0" w:after="0" w:line="240" w:lineRule="auto"/>
+              <w:ind w:left="0" w:right="0" w:firstLine="0"/>
               <w:jc w:val="center"/>
             </w:pPr>
             <w:r/>
@@ -13616,6 +14005,7 @@
           <w:p>
             <w:pPr>
               <w:spacing w:before="0" w:after="0" w:line="240" w:lineRule="auto"/>
+              <w:ind w:left="0" w:right="0" w:firstLine="0"/>
               <w:jc w:val="center"/>
             </w:pPr>
             <w:r/>
@@ -13653,6 +14043,7 @@
           <w:p>
             <w:pPr>
               <w:spacing w:before="0" w:after="0" w:line="240" w:lineRule="auto"/>
+              <w:ind w:left="0" w:right="0" w:firstLine="0"/>
               <w:jc w:val="left"/>
             </w:pPr>
             <w:r/>
@@ -13688,6 +14079,7 @@
           <w:p>
             <w:pPr>
               <w:spacing w:before="0" w:after="0" w:line="240" w:lineRule="auto"/>
+              <w:ind w:left="0" w:right="0" w:firstLine="0"/>
               <w:jc w:val="center"/>
             </w:pPr>
             <w:r/>
@@ -13723,6 +14115,7 @@
           <w:p>
             <w:pPr>
               <w:spacing w:before="0" w:after="0" w:line="240" w:lineRule="auto"/>
+              <w:ind w:left="0" w:right="0" w:firstLine="0"/>
               <w:jc w:val="center"/>
             </w:pPr>
             <w:r/>
@@ -13758,6 +14151,7 @@
           <w:p>
             <w:pPr>
               <w:spacing w:before="0" w:after="0" w:line="240" w:lineRule="auto"/>
+              <w:ind w:left="0" w:right="0" w:firstLine="0"/>
               <w:jc w:val="center"/>
             </w:pPr>
             <w:r/>
@@ -13793,6 +14187,7 @@
           <w:p>
             <w:pPr>
               <w:spacing w:before="0" w:after="0" w:line="240" w:lineRule="auto"/>
+              <w:ind w:left="0" w:right="0" w:firstLine="0"/>
               <w:jc w:val="center"/>
             </w:pPr>
             <w:r/>
@@ -13830,6 +14225,7 @@
           <w:p>
             <w:pPr>
               <w:spacing w:before="0" w:after="0" w:line="240" w:lineRule="auto"/>
+              <w:ind w:left="0" w:right="0" w:firstLine="0"/>
               <w:jc w:val="left"/>
             </w:pPr>
             <w:r/>
@@ -13865,6 +14261,7 @@
           <w:p>
             <w:pPr>
               <w:spacing w:before="0" w:after="0" w:line="240" w:lineRule="auto"/>
+              <w:ind w:left="0" w:right="0" w:firstLine="0"/>
               <w:jc w:val="center"/>
             </w:pPr>
             <w:r/>
@@ -13900,6 +14297,7 @@
           <w:p>
             <w:pPr>
               <w:spacing w:before="0" w:after="0" w:line="240" w:lineRule="auto"/>
+              <w:ind w:left="0" w:right="0" w:firstLine="0"/>
               <w:jc w:val="center"/>
             </w:pPr>
             <w:r/>
@@ -13935,6 +14333,7 @@
           <w:p>
             <w:pPr>
               <w:spacing w:before="0" w:after="0" w:line="240" w:lineRule="auto"/>
+              <w:ind w:left="0" w:right="0" w:firstLine="0"/>
               <w:jc w:val="center"/>
             </w:pPr>
             <w:r/>
@@ -13970,6 +14369,7 @@
           <w:p>
             <w:pPr>
               <w:spacing w:before="0" w:after="0" w:line="240" w:lineRule="auto"/>
+              <w:ind w:left="0" w:right="0" w:firstLine="0"/>
               <w:jc w:val="center"/>
             </w:pPr>
             <w:r/>
@@ -14007,6 +14407,7 @@
           <w:p>
             <w:pPr>
               <w:spacing w:before="0" w:after="0" w:line="240" w:lineRule="auto"/>
+              <w:ind w:left="0" w:right="0" w:firstLine="0"/>
               <w:jc w:val="left"/>
             </w:pPr>
             <w:r/>
@@ -14042,6 +14443,7 @@
           <w:p>
             <w:pPr>
               <w:spacing w:before="0" w:after="0" w:line="240" w:lineRule="auto"/>
+              <w:ind w:left="0" w:right="0" w:firstLine="0"/>
               <w:jc w:val="center"/>
             </w:pPr>
             <w:r/>
@@ -14077,6 +14479,7 @@
           <w:p>
             <w:pPr>
               <w:spacing w:before="0" w:after="0" w:line="240" w:lineRule="auto"/>
+              <w:ind w:left="0" w:right="0" w:firstLine="0"/>
               <w:jc w:val="center"/>
             </w:pPr>
             <w:r/>
@@ -14112,6 +14515,7 @@
           <w:p>
             <w:pPr>
               <w:spacing w:before="0" w:after="0" w:line="240" w:lineRule="auto"/>
+              <w:ind w:left="0" w:right="0" w:firstLine="0"/>
               <w:jc w:val="center"/>
             </w:pPr>
             <w:r/>
@@ -14147,6 +14551,7 @@
           <w:p>
             <w:pPr>
               <w:spacing w:before="0" w:after="0" w:line="240" w:lineRule="auto"/>
+              <w:ind w:left="0" w:right="0" w:firstLine="0"/>
               <w:jc w:val="center"/>
             </w:pPr>
             <w:r/>
@@ -14184,6 +14589,7 @@
           <w:p>
             <w:pPr>
               <w:spacing w:before="0" w:after="0" w:line="240" w:lineRule="auto"/>
+              <w:ind w:left="0" w:right="0" w:firstLine="0"/>
               <w:jc w:val="left"/>
             </w:pPr>
             <w:r/>
@@ -14219,6 +14625,7 @@
           <w:p>
             <w:pPr>
               <w:spacing w:before="0" w:after="0" w:line="240" w:lineRule="auto"/>
+              <w:ind w:left="0" w:right="0" w:firstLine="0"/>
               <w:jc w:val="center"/>
             </w:pPr>
             <w:r/>
@@ -14254,6 +14661,7 @@
           <w:p>
             <w:pPr>
               <w:spacing w:before="0" w:after="0" w:line="240" w:lineRule="auto"/>
+              <w:ind w:left="0" w:right="0" w:firstLine="0"/>
               <w:jc w:val="center"/>
             </w:pPr>
             <w:r/>
@@ -14289,6 +14697,7 @@
           <w:p>
             <w:pPr>
               <w:spacing w:before="0" w:after="0" w:line="240" w:lineRule="auto"/>
+              <w:ind w:left="0" w:right="0" w:firstLine="0"/>
               <w:jc w:val="center"/>
             </w:pPr>
             <w:r/>
@@ -14324,6 +14733,7 @@
           <w:p>
             <w:pPr>
               <w:spacing w:before="0" w:after="0" w:line="240" w:lineRule="auto"/>
+              <w:ind w:left="0" w:right="0" w:firstLine="0"/>
               <w:jc w:val="center"/>
             </w:pPr>
             <w:r/>
@@ -14361,6 +14771,7 @@
           <w:p>
             <w:pPr>
               <w:spacing w:before="0" w:after="0" w:line="240" w:lineRule="auto"/>
+              <w:ind w:left="0" w:right="0" w:firstLine="0"/>
               <w:jc w:val="left"/>
             </w:pPr>
             <w:r/>
@@ -14396,6 +14807,7 @@
           <w:p>
             <w:pPr>
               <w:spacing w:before="0" w:after="0" w:line="240" w:lineRule="auto"/>
+              <w:ind w:left="0" w:right="0" w:firstLine="0"/>
               <w:jc w:val="center"/>
             </w:pPr>
             <w:r/>
@@ -14431,6 +14843,7 @@
           <w:p>
             <w:pPr>
               <w:spacing w:before="0" w:after="0" w:line="240" w:lineRule="auto"/>
+              <w:ind w:left="0" w:right="0" w:firstLine="0"/>
               <w:jc w:val="center"/>
             </w:pPr>
             <w:r/>
@@ -14466,6 +14879,7 @@
           <w:p>
             <w:pPr>
               <w:spacing w:before="0" w:after="0" w:line="240" w:lineRule="auto"/>
+              <w:ind w:left="0" w:right="0" w:firstLine="0"/>
               <w:jc w:val="center"/>
             </w:pPr>
             <w:r/>
@@ -14501,6 +14915,7 @@
           <w:p>
             <w:pPr>
               <w:spacing w:before="0" w:after="0" w:line="240" w:lineRule="auto"/>
+              <w:ind w:left="0" w:right="0" w:firstLine="0"/>
               <w:jc w:val="center"/>
             </w:pPr>
             <w:r/>
@@ -14519,6 +14934,7 @@
     <w:p>
       <w:pPr>
         <w:spacing w:before="20" w:after="40" w:line="240" w:lineRule="auto"/>
+        <w:ind w:left="0" w:right="0" w:firstLine="0"/>
         <w:jc w:val="left"/>
       </w:pPr>
       <w:r>
@@ -14548,6 +14964,8 @@
     <w:p>
       <w:pPr>
         <w:pStyle w:val="tablecaption"/>
+        <w:spacing w:before="80" w:after="20" w:line="240" w:lineRule="auto"/>
+        <w:ind w:left="0" w:right="0" w:firstLine="0"/>
       </w:pPr>
       <w:r>
         <w:rPr>
@@ -14569,6 +14987,7 @@
         <w:jc w:val="center"/>
         <w:tblLayout w:type="fixed"/>
         <w:tblLook w:firstColumn="1" w:firstRow="1" w:lastColumn="0" w:lastRow="0" w:noHBand="0" w:noVBand="1" w:val="04A0"/>
+        <w:tblInd w:w="0" w:type="dxa"/>
       </w:tblPr>
       <w:tblGrid>
         <w:gridCol w:w="2509"/>
@@ -14603,6 +15022,7 @@
           <w:p>
             <w:pPr>
               <w:spacing w:before="0" w:after="0" w:line="240" w:lineRule="auto"/>
+              <w:ind w:left="0" w:right="0" w:firstLine="0"/>
               <w:jc w:val="left"/>
             </w:pPr>
             <w:r/>
@@ -14638,6 +15058,7 @@
           <w:p>
             <w:pPr>
               <w:spacing w:before="0" w:after="0" w:line="240" w:lineRule="auto"/>
+              <w:ind w:left="0" w:right="0" w:firstLine="0"/>
               <w:jc w:val="center"/>
             </w:pPr>
             <w:r/>
@@ -14673,6 +15094,7 @@
           <w:p>
             <w:pPr>
               <w:spacing w:before="0" w:after="0" w:line="240" w:lineRule="auto"/>
+              <w:ind w:left="0" w:right="0" w:firstLine="0"/>
               <w:jc w:val="center"/>
             </w:pPr>
             <w:r/>
@@ -14708,6 +15130,7 @@
           <w:p>
             <w:pPr>
               <w:spacing w:before="0" w:after="0" w:line="240" w:lineRule="auto"/>
+              <w:ind w:left="0" w:right="0" w:firstLine="0"/>
               <w:jc w:val="center"/>
             </w:pPr>
             <w:r/>
@@ -14743,6 +15166,7 @@
           <w:p>
             <w:pPr>
               <w:spacing w:before="0" w:after="0" w:line="240" w:lineRule="auto"/>
+              <w:ind w:left="0" w:right="0" w:firstLine="0"/>
               <w:jc w:val="center"/>
             </w:pPr>
             <w:r/>
@@ -14780,6 +15204,7 @@
           <w:p>
             <w:pPr>
               <w:spacing w:before="0" w:after="0" w:line="240" w:lineRule="auto"/>
+              <w:ind w:left="0" w:right="0" w:firstLine="0"/>
               <w:jc w:val="left"/>
             </w:pPr>
             <w:r/>
@@ -14815,6 +15240,7 @@
           <w:p>
             <w:pPr>
               <w:spacing w:before="0" w:after="0" w:line="240" w:lineRule="auto"/>
+              <w:ind w:left="0" w:right="0" w:firstLine="0"/>
               <w:jc w:val="center"/>
             </w:pPr>
             <w:r/>
@@ -14850,6 +15276,7 @@
           <w:p>
             <w:pPr>
               <w:spacing w:before="0" w:after="0" w:line="240" w:lineRule="auto"/>
+              <w:ind w:left="0" w:right="0" w:firstLine="0"/>
               <w:jc w:val="center"/>
             </w:pPr>
             <w:r/>
@@ -14885,6 +15312,7 @@
           <w:p>
             <w:pPr>
               <w:spacing w:before="0" w:after="0" w:line="240" w:lineRule="auto"/>
+              <w:ind w:left="0" w:right="0" w:firstLine="0"/>
               <w:jc w:val="center"/>
             </w:pPr>
             <w:r/>
@@ -14920,6 +15348,7 @@
           <w:p>
             <w:pPr>
               <w:spacing w:before="0" w:after="0" w:line="240" w:lineRule="auto"/>
+              <w:ind w:left="0" w:right="0" w:firstLine="0"/>
               <w:jc w:val="center"/>
             </w:pPr>
             <w:r/>
@@ -14957,6 +15386,7 @@
           <w:p>
             <w:pPr>
               <w:spacing w:before="0" w:after="0" w:line="240" w:lineRule="auto"/>
+              <w:ind w:left="0" w:right="0" w:firstLine="0"/>
               <w:jc w:val="left"/>
             </w:pPr>
             <w:r/>
@@ -14992,6 +15422,7 @@
           <w:p>
             <w:pPr>
               <w:spacing w:before="0" w:after="0" w:line="240" w:lineRule="auto"/>
+              <w:ind w:left="0" w:right="0" w:firstLine="0"/>
               <w:jc w:val="center"/>
             </w:pPr>
             <w:r/>
@@ -15027,6 +15458,7 @@
           <w:p>
             <w:pPr>
               <w:spacing w:before="0" w:after="0" w:line="240" w:lineRule="auto"/>
+              <w:ind w:left="0" w:right="0" w:firstLine="0"/>
               <w:jc w:val="center"/>
             </w:pPr>
             <w:r/>
@@ -15062,6 +15494,7 @@
           <w:p>
             <w:pPr>
               <w:spacing w:before="0" w:after="0" w:line="240" w:lineRule="auto"/>
+              <w:ind w:left="0" w:right="0" w:firstLine="0"/>
               <w:jc w:val="center"/>
             </w:pPr>
             <w:r/>
@@ -15097,6 +15530,7 @@
           <w:p>
             <w:pPr>
               <w:spacing w:before="0" w:after="0" w:line="240" w:lineRule="auto"/>
+              <w:ind w:left="0" w:right="0" w:firstLine="0"/>
               <w:jc w:val="center"/>
             </w:pPr>
             <w:r/>
@@ -15134,6 +15568,7 @@
           <w:p>
             <w:pPr>
               <w:spacing w:before="0" w:after="0" w:line="240" w:lineRule="auto"/>
+              <w:ind w:left="0" w:right="0" w:firstLine="0"/>
               <w:jc w:val="left"/>
             </w:pPr>
             <w:r/>
@@ -15169,6 +15604,7 @@
           <w:p>
             <w:pPr>
               <w:spacing w:before="0" w:after="0" w:line="240" w:lineRule="auto"/>
+              <w:ind w:left="0" w:right="0" w:firstLine="0"/>
               <w:jc w:val="center"/>
             </w:pPr>
             <w:r/>
@@ -15204,6 +15640,7 @@
           <w:p>
             <w:pPr>
               <w:spacing w:before="0" w:after="0" w:line="240" w:lineRule="auto"/>
+              <w:ind w:left="0" w:right="0" w:firstLine="0"/>
               <w:jc w:val="center"/>
             </w:pPr>
             <w:r/>
@@ -15239,6 +15676,7 @@
           <w:p>
             <w:pPr>
               <w:spacing w:before="0" w:after="0" w:line="240" w:lineRule="auto"/>
+              <w:ind w:left="0" w:right="0" w:firstLine="0"/>
               <w:jc w:val="center"/>
             </w:pPr>
             <w:r/>
@@ -15274,6 +15712,7 @@
           <w:p>
             <w:pPr>
               <w:spacing w:before="0" w:after="0" w:line="240" w:lineRule="auto"/>
+              <w:ind w:left="0" w:right="0" w:firstLine="0"/>
               <w:jc w:val="center"/>
             </w:pPr>
             <w:r/>
@@ -15311,6 +15750,7 @@
           <w:p>
             <w:pPr>
               <w:spacing w:before="0" w:after="0" w:line="240" w:lineRule="auto"/>
+              <w:ind w:left="0" w:right="0" w:firstLine="0"/>
               <w:jc w:val="left"/>
             </w:pPr>
             <w:r/>
@@ -15346,6 +15786,7 @@
           <w:p>
             <w:pPr>
               <w:spacing w:before="0" w:after="0" w:line="240" w:lineRule="auto"/>
+              <w:ind w:left="0" w:right="0" w:firstLine="0"/>
               <w:jc w:val="center"/>
             </w:pPr>
             <w:r/>
@@ -15381,6 +15822,7 @@
           <w:p>
             <w:pPr>
               <w:spacing w:before="0" w:after="0" w:line="240" w:lineRule="auto"/>
+              <w:ind w:left="0" w:right="0" w:firstLine="0"/>
               <w:jc w:val="center"/>
             </w:pPr>
             <w:r/>
@@ -15416,6 +15858,7 @@
           <w:p>
             <w:pPr>
               <w:spacing w:before="0" w:after="0" w:line="240" w:lineRule="auto"/>
+              <w:ind w:left="0" w:right="0" w:firstLine="0"/>
               <w:jc w:val="center"/>
             </w:pPr>
             <w:r/>
@@ -15451,6 +15894,7 @@
           <w:p>
             <w:pPr>
               <w:spacing w:before="0" w:after="0" w:line="240" w:lineRule="auto"/>
+              <w:ind w:left="0" w:right="0" w:firstLine="0"/>
               <w:jc w:val="center"/>
             </w:pPr>
             <w:r/>
@@ -15469,6 +15913,7 @@
     <w:p>
       <w:pPr>
         <w:spacing w:before="20" w:after="40" w:line="240" w:lineRule="auto"/>
+        <w:ind w:left="0" w:right="0" w:firstLine="0"/>
         <w:jc w:val="left"/>
       </w:pPr>
       <w:r>
@@ -15498,6 +15943,8 @@
     <w:p>
       <w:pPr>
         <w:pStyle w:val="tablecaption"/>
+        <w:spacing w:before="80" w:after="20" w:line="240" w:lineRule="auto"/>
+        <w:ind w:left="0" w:right="0" w:firstLine="0"/>
       </w:pPr>
       <w:r>
         <w:rPr>
@@ -15519,6 +15966,7 @@
         <w:jc w:val="center"/>
         <w:tblLayout w:type="fixed"/>
         <w:tblLook w:firstColumn="1" w:firstRow="1" w:lastColumn="0" w:lastRow="0" w:noHBand="0" w:noVBand="1" w:val="04A0"/>
+        <w:tblInd w:w="0" w:type="dxa"/>
       </w:tblPr>
       <w:tblGrid>
         <w:gridCol w:w="522"/>
@@ -15554,6 +16002,7 @@
           <w:p>
             <w:pPr>
               <w:spacing w:before="0" w:after="0" w:line="240" w:lineRule="auto"/>
+              <w:ind w:left="0" w:right="0" w:firstLine="0"/>
               <w:jc w:val="center"/>
             </w:pPr>
             <w:r/>
@@ -15589,6 +16038,7 @@
           <w:p>
             <w:pPr>
               <w:spacing w:before="0" w:after="0" w:line="240" w:lineRule="auto"/>
+              <w:ind w:left="0" w:right="0" w:firstLine="0"/>
               <w:jc w:val="left"/>
             </w:pPr>
             <w:r/>
@@ -15624,6 +16074,7 @@
           <w:p>
             <w:pPr>
               <w:spacing w:before="0" w:after="0" w:line="240" w:lineRule="auto"/>
+              <w:ind w:left="0" w:right="0" w:firstLine="0"/>
               <w:jc w:val="left"/>
             </w:pPr>
             <w:r/>
@@ -15659,6 +16110,7 @@
           <w:p>
             <w:pPr>
               <w:spacing w:before="0" w:after="0" w:line="240" w:lineRule="auto"/>
+              <w:ind w:left="0" w:right="0" w:firstLine="0"/>
               <w:jc w:val="center"/>
             </w:pPr>
             <w:r/>
@@ -15694,6 +16146,7 @@
           <w:p>
             <w:pPr>
               <w:spacing w:before="0" w:after="0" w:line="240" w:lineRule="auto"/>
+              <w:ind w:left="0" w:right="0" w:firstLine="0"/>
               <w:jc w:val="center"/>
             </w:pPr>
             <w:r/>
@@ -15729,6 +16182,7 @@
           <w:p>
             <w:pPr>
               <w:spacing w:before="0" w:after="0" w:line="240" w:lineRule="auto"/>
+              <w:ind w:left="0" w:right="0" w:firstLine="0"/>
               <w:jc w:val="center"/>
             </w:pPr>
             <w:r/>
@@ -15766,6 +16220,7 @@
           <w:p>
             <w:pPr>
               <w:spacing w:before="0" w:after="0" w:line="240" w:lineRule="auto"/>
+              <w:ind w:left="0" w:right="0" w:firstLine="0"/>
               <w:jc w:val="center"/>
             </w:pPr>
             <w:r/>
@@ -15801,6 +16256,7 @@
           <w:p>
             <w:pPr>
               <w:spacing w:before="0" w:after="0" w:line="240" w:lineRule="auto"/>
+              <w:ind w:left="0" w:right="0" w:firstLine="0"/>
               <w:jc w:val="left"/>
             </w:pPr>
             <w:r/>
@@ -15836,6 +16292,7 @@
           <w:p>
             <w:pPr>
               <w:spacing w:before="0" w:after="0" w:line="240" w:lineRule="auto"/>
+              <w:ind w:left="0" w:right="0" w:firstLine="0"/>
               <w:jc w:val="left"/>
             </w:pPr>
             <w:r/>
@@ -15871,6 +16328,7 @@
           <w:p>
             <w:pPr>
               <w:spacing w:before="0" w:after="0" w:line="240" w:lineRule="auto"/>
+              <w:ind w:left="0" w:right="0" w:firstLine="0"/>
               <w:jc w:val="center"/>
             </w:pPr>
             <w:r/>
@@ -15906,6 +16364,7 @@
           <w:p>
             <w:pPr>
               <w:spacing w:before="0" w:after="0" w:line="240" w:lineRule="auto"/>
+              <w:ind w:left="0" w:right="0" w:firstLine="0"/>
               <w:jc w:val="center"/>
             </w:pPr>
             <w:r/>
@@ -15941,6 +16400,7 @@
           <w:p>
             <w:pPr>
               <w:spacing w:before="0" w:after="0" w:line="240" w:lineRule="auto"/>
+              <w:ind w:left="0" w:right="0" w:firstLine="0"/>
               <w:jc w:val="center"/>
             </w:pPr>
             <w:r/>
@@ -15978,6 +16438,7 @@
           <w:p>
             <w:pPr>
               <w:spacing w:before="0" w:after="0" w:line="240" w:lineRule="auto"/>
+              <w:ind w:left="0" w:right="0" w:firstLine="0"/>
               <w:jc w:val="center"/>
             </w:pPr>
             <w:r/>
@@ -16013,6 +16474,7 @@
           <w:p>
             <w:pPr>
               <w:spacing w:before="0" w:after="0" w:line="240" w:lineRule="auto"/>
+              <w:ind w:left="0" w:right="0" w:firstLine="0"/>
               <w:jc w:val="left"/>
             </w:pPr>
             <w:r/>
@@ -16048,6 +16510,7 @@
           <w:p>
             <w:pPr>
               <w:spacing w:before="0" w:after="0" w:line="240" w:lineRule="auto"/>
+              <w:ind w:left="0" w:right="0" w:firstLine="0"/>
               <w:jc w:val="left"/>
             </w:pPr>
             <w:r/>
@@ -16083,6 +16546,7 @@
           <w:p>
             <w:pPr>
               <w:spacing w:before="0" w:after="0" w:line="240" w:lineRule="auto"/>
+              <w:ind w:left="0" w:right="0" w:firstLine="0"/>
               <w:jc w:val="center"/>
             </w:pPr>
             <w:r/>
@@ -16118,6 +16582,7 @@
           <w:p>
             <w:pPr>
               <w:spacing w:before="0" w:after="0" w:line="240" w:lineRule="auto"/>
+              <w:ind w:left="0" w:right="0" w:firstLine="0"/>
               <w:jc w:val="center"/>
             </w:pPr>
             <w:r/>
@@ -16153,6 +16618,7 @@
           <w:p>
             <w:pPr>
               <w:spacing w:before="0" w:after="0" w:line="240" w:lineRule="auto"/>
+              <w:ind w:left="0" w:right="0" w:firstLine="0"/>
               <w:jc w:val="center"/>
             </w:pPr>
             <w:r/>
@@ -16190,6 +16656,7 @@
           <w:p>
             <w:pPr>
               <w:spacing w:before="0" w:after="0" w:line="240" w:lineRule="auto"/>
+              <w:ind w:left="0" w:right="0" w:firstLine="0"/>
               <w:jc w:val="center"/>
             </w:pPr>
             <w:r/>
@@ -16225,6 +16692,7 @@
           <w:p>
             <w:pPr>
               <w:spacing w:before="0" w:after="0" w:line="240" w:lineRule="auto"/>
+              <w:ind w:left="0" w:right="0" w:firstLine="0"/>
               <w:jc w:val="left"/>
             </w:pPr>
             <w:r/>
@@ -16260,6 +16728,7 @@
           <w:p>
             <w:pPr>
               <w:spacing w:before="0" w:after="0" w:line="240" w:lineRule="auto"/>
+              <w:ind w:left="0" w:right="0" w:firstLine="0"/>
               <w:jc w:val="left"/>
             </w:pPr>
             <w:r/>
@@ -16295,6 +16764,7 @@
           <w:p>
             <w:pPr>
               <w:spacing w:before="0" w:after="0" w:line="240" w:lineRule="auto"/>
+              <w:ind w:left="0" w:right="0" w:firstLine="0"/>
               <w:jc w:val="center"/>
             </w:pPr>
             <w:r/>
@@ -16330,6 +16800,7 @@
           <w:p>
             <w:pPr>
               <w:spacing w:before="0" w:after="0" w:line="240" w:lineRule="auto"/>
+              <w:ind w:left="0" w:right="0" w:firstLine="0"/>
               <w:jc w:val="center"/>
             </w:pPr>
             <w:r/>
@@ -16365,6 +16836,7 @@
           <w:p>
             <w:pPr>
               <w:spacing w:before="0" w:after="0" w:line="240" w:lineRule="auto"/>
+              <w:ind w:left="0" w:right="0" w:firstLine="0"/>
               <w:jc w:val="center"/>
             </w:pPr>
             <w:r/>
@@ -16383,6 +16855,7 @@
     <w:p>
       <w:pPr>
         <w:spacing w:before="20" w:after="40" w:line="240" w:lineRule="auto"/>
+        <w:ind w:left="0" w:right="0" w:firstLine="0"/>
         <w:jc w:val="left"/>
       </w:pPr>
       <w:r>
@@ -16526,6 +16999,8 @@
     <w:p>
       <w:pPr>
         <w:pStyle w:val="tablecaption"/>
+        <w:spacing w:before="80" w:after="20" w:line="240" w:lineRule="auto"/>
+        <w:ind w:left="0" w:right="0" w:firstLine="0"/>
       </w:pPr>
       <w:r>
         <w:rPr>
@@ -16547,6 +17022,7 @@
         <w:jc w:val="center"/>
         <w:tblLayout w:type="fixed"/>
         <w:tblLook w:firstColumn="1" w:firstRow="1" w:lastColumn="0" w:lastRow="0" w:noHBand="0" w:noVBand="1" w:val="04A0"/>
+        <w:tblInd w:w="0" w:type="dxa"/>
       </w:tblPr>
       <w:tblGrid>
         <w:gridCol w:w="1568"/>
@@ -16579,6 +17055,7 @@
           <w:p>
             <w:pPr>
               <w:spacing w:before="0" w:after="0" w:line="240" w:lineRule="auto"/>
+              <w:ind w:left="0" w:right="0" w:firstLine="0"/>
               <w:jc w:val="left"/>
             </w:pPr>
             <w:r/>
@@ -16614,6 +17091,7 @@
           <w:p>
             <w:pPr>
               <w:spacing w:before="0" w:after="0" w:line="240" w:lineRule="auto"/>
+              <w:ind w:left="0" w:right="0" w:firstLine="0"/>
               <w:jc w:val="left"/>
             </w:pPr>
             <w:r/>
@@ -16649,6 +17127,7 @@
           <w:p>
             <w:pPr>
               <w:spacing w:before="0" w:after="0" w:line="240" w:lineRule="auto"/>
+              <w:ind w:left="0" w:right="0" w:firstLine="0"/>
               <w:jc w:val="left"/>
             </w:pPr>
             <w:r/>
@@ -16686,6 +17165,7 @@
           <w:p>
             <w:pPr>
               <w:spacing w:before="0" w:after="0" w:line="240" w:lineRule="auto"/>
+              <w:ind w:left="0" w:right="0" w:firstLine="0"/>
               <w:jc w:val="left"/>
             </w:pPr>
             <w:r/>
@@ -16721,6 +17201,7 @@
           <w:p>
             <w:pPr>
               <w:spacing w:before="0" w:after="0" w:line="240" w:lineRule="auto"/>
+              <w:ind w:left="0" w:right="0" w:firstLine="0"/>
               <w:jc w:val="left"/>
             </w:pPr>
             <w:r/>
@@ -16756,6 +17237,7 @@
           <w:p>
             <w:pPr>
               <w:spacing w:before="0" w:after="0" w:line="240" w:lineRule="auto"/>
+              <w:ind w:left="0" w:right="0" w:firstLine="0"/>
               <w:jc w:val="left"/>
             </w:pPr>
             <w:r/>
@@ -16793,6 +17275,7 @@
           <w:p>
             <w:pPr>
               <w:spacing w:before="0" w:after="0" w:line="240" w:lineRule="auto"/>
+              <w:ind w:left="0" w:right="0" w:firstLine="0"/>
               <w:jc w:val="left"/>
             </w:pPr>
             <w:r/>
@@ -16828,6 +17311,7 @@
           <w:p>
             <w:pPr>
               <w:spacing w:before="0" w:after="0" w:line="240" w:lineRule="auto"/>
+              <w:ind w:left="0" w:right="0" w:firstLine="0"/>
               <w:jc w:val="left"/>
             </w:pPr>
             <w:r/>
@@ -16863,6 +17347,7 @@
           <w:p>
             <w:pPr>
               <w:spacing w:before="0" w:after="0" w:line="240" w:lineRule="auto"/>
+              <w:ind w:left="0" w:right="0" w:firstLine="0"/>
               <w:jc w:val="left"/>
             </w:pPr>
             <w:r/>
@@ -16900,6 +17385,7 @@
           <w:p>
             <w:pPr>
               <w:spacing w:before="0" w:after="0" w:line="240" w:lineRule="auto"/>
+              <w:ind w:left="0" w:right="0" w:firstLine="0"/>
               <w:jc w:val="left"/>
             </w:pPr>
             <w:r/>
@@ -16935,6 +17421,7 @@
           <w:p>
             <w:pPr>
               <w:spacing w:before="0" w:after="0" w:line="240" w:lineRule="auto"/>
+              <w:ind w:left="0" w:right="0" w:firstLine="0"/>
               <w:jc w:val="left"/>
             </w:pPr>
             <w:r/>
@@ -16970,6 +17457,7 @@
           <w:p>
             <w:pPr>
               <w:spacing w:before="0" w:after="0" w:line="240" w:lineRule="auto"/>
+              <w:ind w:left="0" w:right="0" w:firstLine="0"/>
               <w:jc w:val="left"/>
             </w:pPr>
             <w:r/>
@@ -17007,6 +17495,7 @@
           <w:p>
             <w:pPr>
               <w:spacing w:before="0" w:after="0" w:line="240" w:lineRule="auto"/>
+              <w:ind w:left="0" w:right="0" w:firstLine="0"/>
               <w:jc w:val="left"/>
             </w:pPr>
             <w:r/>
@@ -17042,6 +17531,7 @@
           <w:p>
             <w:pPr>
               <w:spacing w:before="0" w:after="0" w:line="240" w:lineRule="auto"/>
+              <w:ind w:left="0" w:right="0" w:firstLine="0"/>
               <w:jc w:val="left"/>
             </w:pPr>
             <w:r/>
@@ -17077,6 +17567,7 @@
           <w:p>
             <w:pPr>
               <w:spacing w:before="0" w:after="0" w:line="240" w:lineRule="auto"/>
+              <w:ind w:left="0" w:right="0" w:firstLine="0"/>
               <w:jc w:val="left"/>
             </w:pPr>
             <w:r/>
@@ -17114,6 +17605,7 @@
           <w:p>
             <w:pPr>
               <w:spacing w:before="0" w:after="0" w:line="240" w:lineRule="auto"/>
+              <w:ind w:left="0" w:right="0" w:firstLine="0"/>
               <w:jc w:val="left"/>
             </w:pPr>
             <w:r/>
@@ -17149,6 +17641,7 @@
           <w:p>
             <w:pPr>
               <w:spacing w:before="0" w:after="0" w:line="240" w:lineRule="auto"/>
+              <w:ind w:left="0" w:right="0" w:firstLine="0"/>
               <w:jc w:val="left"/>
             </w:pPr>
             <w:r/>
@@ -17184,6 +17677,7 @@
           <w:p>
             <w:pPr>
               <w:spacing w:before="0" w:after="0" w:line="240" w:lineRule="auto"/>
+              <w:ind w:left="0" w:right="0" w:firstLine="0"/>
               <w:jc w:val="left"/>
             </w:pPr>
             <w:r/>
@@ -17201,7 +17695,8 @@
     </w:tbl>
     <w:p>
       <w:pPr>
-        <w:spacing w:after="80"/>
+        <w:spacing w:before="0" w:after="80" w:line="240" w:lineRule="auto"/>
+        <w:ind w:left="0" w:right="0" w:firstLine="0"/>
       </w:pPr>
     </w:p>
     <w:p>

</xml_diff>

<commit_message>
Split correspondence and contact sections
</commit_message>
<xml_diff>
--- a/submission_fisat/VaccineNLP_FISAT_FINAL_CONTACT_UPDATED.docx
+++ b/submission_fisat/VaccineNLP_FISAT_FINAL_CONTACT_UPDATED.docx
@@ -18098,15 +18098,25 @@
       </w:r>
     </w:p>
     <w:p>
-      <w:pPr/>
+      <w:pPr>
+        <w:pStyle w:val="heading1"/>
+      </w:pPr>
       <w:r>
-        <w:t>Additional author contact: Lam Quan Tran, Digital Health Center, Ha Noi University of Public Health, Ha Noi, Viet Nam. Email: quantl3@fpt.edu.vn.</w:t>
+        <w:t>Additional Author Contact Information</w:t>
+      </w:r>
+    </w:p>
+    <w:p>
+      <w:pPr>
+        <w:pStyle w:val="p1a"/>
+      </w:pPr>
+      <w:r>
+        <w:t>Lam Quan Tran, Digital Health Center, Ha Noi University of Public Health, Ha Noi, Viet Nam. Email: quantl3@fpt.edu.vn.</w:t>
       </w:r>
     </w:p>
     <w:p>
       <w:pPr/>
       <w:r>
-        <w:t>Additional author contact: Hong Viet Tran, Institute of Artificial Intelligence, VNU University of Engineering and Technology, Vietnam National University, Hanoi, Vietnam. Email: thv79@gmail.com.</w:t>
+        <w:t>Hong Viet Tran, Institute of Artificial Intelligence, VNU University of Engineering and Technology, Vietnam National University, Hanoi, Vietnam. Email: thv79@gmail.com.</w:t>
       </w:r>
     </w:p>
     <w:sectPr>

</xml_diff>

<commit_message>
Update paper author contact emails
</commit_message>
<xml_diff>
--- a/submission_fisat/VaccineNLP_FISAT_FINAL_CONTACT_UPDATED.docx
+++ b/submission_fisat/VaccineNLP_FISAT_FINAL_CONTACT_UPDATED.docx
@@ -87,6 +87,12 @@
       </w:r>
       <w:r>
         <w:t xml:space="preserve"> Ha Noi University of Public Health, Ha Noi, Viet Nam</w:t>
+      </w:r>
+      <w:r>
+        <w:br/>
+      </w:r>
+      <w:r>
+        <w:t>Email: 2211090016@studenthuph.edu.vn</w:t>
       </w:r>
     </w:p>
     <w:p>
@@ -18094,7 +18100,7 @@
         <w:pStyle w:val="p1a"/>
       </w:pPr>
       <w:r>
-        <w:t>Correspondence concerning this paper should be addressed to the first author, Manh Hung Kim, Ha Noi University of Public Health, Ha Noi, Viet Nam. Email: 211090016@studenthuph.edu.vn.</w:t>
+        <w:t>Correspondence concerning this paper should be addressed to the first author, Manh Hung Kim, Ha Noi University of Public Health, Ha Noi, Viet Nam. Email: 2211090016@studenthuph.edu.vn.</w:t>
       </w:r>
     </w:p>
     <w:p>
@@ -18116,7 +18122,7 @@
     <w:p>
       <w:pPr/>
       <w:r>
-        <w:t>Hong Viet Tran, Institute of Artificial Intelligence, VNU University of Engineering and Technology, Vietnam National University, Hanoi, Vietnam. Email: thv79@gmail.com.</w:t>
+        <w:t>Hong Viet Tran, Institute of Artificial Intelligence, VNU University of Engineering and Technology, Vietnam National University, Hanoi, Vietnam. Email: thviet79@gmail.com.</w:t>
       </w:r>
     </w:p>
     <w:sectPr>

</xml_diff>

<commit_message>
Polish FISAT paper wording
</commit_message>
<xml_diff>
--- a/submission_fisat/VaccineNLP_FISAT_FINAL_CONTACT_UPDATED.docx
+++ b/submission_fisat/VaccineNLP_FISAT_FINAL_CONTACT_UPDATED.docx
@@ -175,7 +175,7 @@
     <w:p>
       <w:pPr/>
       <w:r>
-        <w:t>The Vietnamese setting makes this problem especially relevant for FISAT themes in artificial intelligence, digital transformation, and applied health informatics. Vaccine discussions often appear as short comments, conversational fragments, or screenshots copied across platforms. A single comment may include a personal adverse event narrative, a rhetorical question, and an implicit recommendation against vaccination. For this reason, the system is designed not as a binary censorship tool, but as an intelligent surveillance and triage layer that surfaces uncertain or high-risk texts for expert review.</w:t>
+        <w:t>The Vietnamese setting makes this problem especially relevant for intelligent-systems research in artificial intelligence, digital transformation, and applied health informatics. Vaccine discussions often appear as short comments, conversational fragments, or screenshots copied across platforms. A single comment may include a personal adverse event narrative, a rhetorical question, and an implicit recommendation against vaccination. For this reason, the system is designed not as a binary censorship tool, but as an intelligent surveillance and triage layer that surfaces uncertain or high-risk texts for expert review.</w:t>
       </w:r>
     </w:p>
     <w:p>
@@ -191,7 +191,7 @@
         <w:pStyle w:val="p1a"/>
       </w:pPr>
       <w:r>
-        <w:t>This paper contributes an applied intelligent-system study for the FISAT/Springer proceedings scope, at the intersection of natural language processing, trustworthy AI, health informatics, and social media analytics. Consistent with the original study protocol, the paper addresses two aims: (i) to build and evaluate Vietnamese NLP models for vaccine-related misinformation, stance, and sentiment classification; and (ii) to assess the usefulness and limitations of LLM support for medical text annotation and explanation. To make the research contribution explicit, the paper reports four concrete outputs: C1, an expert-validated Vietnamese Gold Test Set for vaccine-related misinformation, stance, and sentiment; C2, a controlled benchmark of XLM-RoBERTa, PhoBERT-v2, and Gemma-4 4B on the same evaluation split; C3, a confidence-calibrated explainable HITL workflow for trustworthy public-health deployment; and C4, empirical evidence that LLM-based annotation remains insufficient as a replacement for expert medical fact-checking.</w:t>
+        <w:t>This paper contributes an applied intelligent-system study at the intersection of natural language processing, trustworthy AI, health informatics, and social media analytics. Consistent with the original study protocol, the paper addresses two aims: (i) to build and evaluate Vietnamese NLP models for vaccine-related misinformation, stance, and sentiment classification; and (ii) to assess the usefulness and limitations of LLM support for medical text annotation and explanation. To make the research contribution explicit, the paper reports four concrete outputs: C1, an expert-validated Vietnamese Gold Test Set for vaccine-related misinformation, stance, and sentiment; C2, a controlled benchmark of XLM-RoBERTa, PhoBERT-v2, and Gemma-4 4B on the same evaluation split; C3, a confidence-calibrated explainable HITL workflow for trustworthy public-health deployment; and C4, empirical evidence that LLM-based annotation remains insufficient as a replacement for expert medical fact-checking.</w:t>
       </w:r>
     </w:p>
     <w:p>

</xml_diff>

<commit_message>
Align paper wording with EAI FISAT scope
</commit_message>
<xml_diff>
--- a/submission_fisat/VaccineNLP_FISAT_FINAL_CONTACT_UPDATED.docx
+++ b/submission_fisat/VaccineNLP_FISAT_FINAL_CONTACT_UPDATED.docx
@@ -169,13 +169,13 @@
     <w:p>
       <w:pPr/>
       <w:r>
-        <w:t>The study is organized around three research questions that are retained in this proceedings paper. RQ1 asks how a Vietnamese vaccine-domain corpus can be collected, cleaned, and validated with a multi-axis annotation schema. RQ2 asks how well a Dual-Student Hybrid architecture detects misinformation while also producing interpretable explanations. RQ3 asks whether sentiment, stance, and source platform are statistically associated with misinformation risk. These questions are deliberately operational: they connect model accuracy with the needs of public-health analysts who must prioritize limited review capacity during an infodemic.</w:t>
+        <w:t>For an international intelligent-systems audience, the paper frames the problem through three operational research questions. RQ1 asks how a Vietnamese vaccine-domain corpus can be collected, cleaned, and validated with a multi-axis annotation schema. RQ2 asks how well a Dual-Student Hybrid architecture detects misinformation while also producing interpretable explanations. RQ3 asks whether sentiment, stance, and source platform are statistically associated with misinformation risk. These questions connect model accuracy with the needs of public-health analysts who must prioritize limited review capacity during an infodemic.</w:t>
       </w:r>
     </w:p>
     <w:p>
       <w:pPr/>
       <w:r>
-        <w:t>The Vietnamese setting makes this problem especially relevant for intelligent-systems research in artificial intelligence, digital transformation, and applied health informatics. Vaccine discussions often appear as short comments, conversational fragments, or screenshots copied across platforms. A single comment may include a personal adverse event narrative, a rhetorical question, and an implicit recommendation against vaccination. For this reason, the system is designed not as a binary censorship tool, but as an intelligent surveillance and triage layer that surfaces uncertain or high-risk texts for expert review.</w:t>
+        <w:t>The Vietnamese setting makes this problem especially relevant for EAI FISAT 2026, the EAI FPT International Conference on Intelligent Systems and Advanced Technologies, because it combines natural language processing, AI applications in healthcare, system-level implementation, comparative performance evaluation, and experimental validation. Vaccine discussions often appear as short comments, conversational fragments, or screenshots copied across platforms. A single comment may include a personal adverse event narrative, a rhetorical question, and an implicit recommendation against vaccination. For this reason, the system is designed not as a binary censorship tool, but as an intelligent surveillance and triage layer that surfaces uncertain or high-risk texts for expert review.</w:t>
       </w:r>
     </w:p>
     <w:p>
@@ -191,7 +191,7 @@
         <w:pStyle w:val="p1a"/>
       </w:pPr>
       <w:r>
-        <w:t>This paper contributes an applied intelligent-system study at the intersection of natural language processing, trustworthy AI, health informatics, and social media analytics. Consistent with the original study protocol, the paper addresses two aims: (i) to build and evaluate Vietnamese NLP models for vaccine-related misinformation, stance, and sentiment classification; and (ii) to assess the usefulness and limitations of LLM support for medical text annotation and explanation. To make the research contribution explicit, the paper reports four concrete outputs: C1, an expert-validated Vietnamese Gold Test Set for vaccine-related misinformation, stance, and sentiment; C2, a controlled benchmark of XLM-RoBERTa, PhoBERT-v2, and Gemma-4 4B on the same evaluation split; C3, a confidence-calibrated explainable HITL workflow for trustworthy public-health deployment; and C4, empirical evidence that LLM-based annotation remains insufficient as a replacement for expert medical fact-checking.</w:t>
+        <w:t>This paper contributes an applied intelligent-system study at the intersection of natural language processing, trustworthy AI, health informatics, and social media analytics. The evaluation protocol addresses two aims: (i) to build and evaluate Vietnamese NLP models for vaccine-related misinformation, stance, and sentiment classification; and (ii) to assess the usefulness and limitations of LLM support for medical text annotation and explanation. To make the research contribution explicit, the paper reports four concrete outputs: C1, an expert-validated Vietnamese Gold Test Set for vaccine-related misinformation, stance, and sentiment; C2, a controlled benchmark of XLM-RoBERTa, PhoBERT-v2, and Gemma-4 4B on the same evaluation split; C3, a confidence-calibrated explainable HITL workflow for trustworthy public-health deployment; and C4, empirical evidence that LLM-based annotation remains insufficient as a replacement for expert medical fact-checking.</w:t>
       </w:r>
     </w:p>
     <w:p>
@@ -16886,7 +16886,7 @@
         <w:pStyle w:val="p1a"/>
       </w:pPr>
       <w:r>
-        <w:t>Together, the association tests support the project's misinformation-propagation triangle: negative affect, opposing or hesitant stance, and high-risk social platforms tend to reinforce one another. The finding does not imply that every negative comment is misinformation, nor that all Facebook or YouTube content is harmful. Instead, it gives analysts a statistically grounded triage signal for deciding which public posts should be reviewed first.</w:t>
+        <w:t>Together, the association tests support the proposed misinformation-propagation triangle: negative affect, opposing or hesitant stance, and high-risk social platforms tend to reinforce one another. The finding does not imply that every negative comment is misinformation, nor that all Facebook or YouTube content is harmful. Instead, it gives analysts a statistically grounded triage signal for deciding which public posts should be reviewed first.</w:t>
       </w:r>
     </w:p>
     <w:p>

</xml_diff>

<commit_message>
Fix DOCX LibreOffice rendering layout
</commit_message>
<xml_diff>
--- a/submission_fisat/VaccineNLP_FISAT_FINAL_CONTACT_UPDATED.docx
+++ b/submission_fisat/VaccineNLP_FISAT_FINAL_CONTACT_UPDATED.docx
@@ -18099,6 +18099,8 @@
     <w:p>
       <w:pPr>
         <w:pStyle w:val="p1a"/>
+        <w:ind w:firstLine="0"/>
+        <w:jc w:val="left"/>
       </w:pPr>
       <w:r>
         <w:t>Correspondence concerning this paper should be addressed to the first author, Manh Hung Kim, Ha Noi University of Public Health, Ha Noi, Viet Nam. Email: 2211090016@studenthuph.edu.vn.</w:t>
@@ -18115,13 +18117,18 @@
     <w:p>
       <w:pPr>
         <w:pStyle w:val="p1a"/>
+        <w:ind w:firstLine="0"/>
+        <w:jc w:val="left"/>
       </w:pPr>
       <w:r>
         <w:t>Lam Quan Tran, Digital Health Center, Ha Noi University of Public Health, Ha Noi, Viet Nam. Email: quantl3@fpt.edu.vn.</w:t>
       </w:r>
     </w:p>
     <w:p>
-      <w:pPr/>
+      <w:pPr>
+        <w:ind w:firstLine="0"/>
+        <w:jc w:val="left"/>
+      </w:pPr>
       <w:r>
         <w:t>Hong Viet Tran, Institute of Artificial Intelligence, VNU University of Engineering and Technology, Vietnam National University, Hanoi, Vietnam. Email: thviet79@gmail.com.</w:t>
       </w:r>
@@ -18232,6 +18239,9 @@
         <w:sz w:val="16"/>
       </w:rPr>
       <w:fldChar w:fldCharType="end"/>
+    </w:r>
+    <w:r>
+      <w:t xml:space="preserve"> </w:t>
     </w:r>
     <w:r>
       <w:tab/>

</xml_diff>